<commit_message>
Almost done with part 2 of lab-2
</commit_message>
<xml_diff>
--- a/sem-4/v2/lab-2/lab-2.docx
+++ b/sem-4/v2/lab-2/lab-2.docx
@@ -502,12 +502,12 @@
       <w:pPr>
         <w:pStyle w:val="Heading1"/>
         <w:rPr>
-          <w:rFonts w:ascii="Times New Roman" w:hAnsi="Times New Roman" w:cs="Times New Roman"/>
+          <w:rFonts w:cs="Times New Roman"/>
         </w:rPr>
       </w:pPr>
       <w:r>
         <w:rPr>
-          <w:rFonts w:ascii="Times New Roman" w:hAnsi="Times New Roman" w:cs="Times New Roman"/>
+          <w:rFonts w:cs="Times New Roman"/>
         </w:rPr>
         <w:lastRenderedPageBreak/>
         <w:t>Задание 1</w:t>
@@ -816,7 +816,6 @@
                 <w:rFonts w:ascii="Times New Roman" w:hAnsi="Times New Roman" w:cs="Times New Roman"/>
               </w:rPr>
             </w:pPr>
-            <w:proofErr w:type="spellStart"/>
             <w:proofErr w:type="gramStart"/>
             <w:r>
               <w:rPr>
@@ -833,7 +832,6 @@
               </w:rPr>
               <w:t>m,or</w:t>
             </w:r>
-            <w:proofErr w:type="spellEnd"/>
             <w:proofErr w:type="gramEnd"/>
             <w:r>
               <w:rPr>
@@ -1104,7 +1102,6 @@
               </w:rPr>
               <w:t>=</w:t>
             </w:r>
-            <w:proofErr w:type="spellStart"/>
             <w:proofErr w:type="gramStart"/>
             <w:r>
               <w:rPr>
@@ -1121,7 +1118,6 @@
               </w:rPr>
               <w:t>m,or</w:t>
             </w:r>
-            <w:proofErr w:type="spellEnd"/>
             <w:proofErr w:type="gramEnd"/>
             <w:r>
               <w:rPr>
@@ -2050,6 +2046,7 @@
       </w:r>
       <w:r>
         <w:rPr>
+          <w:rFonts w:ascii="Times New Roman" w:hAnsi="Times New Roman" w:cs="Times New Roman"/>
           <w:noProof/>
         </w:rPr>
         <w:drawing>
@@ -2156,7 +2153,7 @@
         </w:trPr>
         <w:tc>
           <w:tcPr>
-            <w:tcW w:w="2262" w:type="dxa"/>
+            <w:tcW w:w="2229" w:type="dxa"/>
             <w:vMerge w:val="restart"/>
           </w:tcPr>
           <w:p>
@@ -2175,7 +2172,7 @@
         </w:tc>
         <w:tc>
           <w:tcPr>
-            <w:tcW w:w="2976" w:type="dxa"/>
+            <w:tcW w:w="1995" w:type="dxa"/>
             <w:vMerge w:val="restart"/>
           </w:tcPr>
           <w:p>
@@ -2194,7 +2191,7 @@
         </w:tc>
         <w:tc>
           <w:tcPr>
-            <w:tcW w:w="5943" w:type="dxa"/>
+            <w:tcW w:w="6957" w:type="dxa"/>
             <w:gridSpan w:val="11"/>
           </w:tcPr>
           <w:p>
@@ -2218,7 +2215,7 @@
         </w:trPr>
         <w:tc>
           <w:tcPr>
-            <w:tcW w:w="2262" w:type="dxa"/>
+            <w:tcW w:w="2229" w:type="dxa"/>
             <w:vMerge/>
           </w:tcPr>
           <w:p>
@@ -2231,7 +2228,7 @@
         </w:tc>
         <w:tc>
           <w:tcPr>
-            <w:tcW w:w="2976" w:type="dxa"/>
+            <w:tcW w:w="1995" w:type="dxa"/>
             <w:vMerge/>
           </w:tcPr>
           <w:p>
@@ -2244,7 +2241,7 @@
         </w:tc>
         <w:tc>
           <w:tcPr>
-            <w:tcW w:w="1249" w:type="dxa"/>
+            <w:tcW w:w="1532" w:type="dxa"/>
             <w:gridSpan w:val="2"/>
           </w:tcPr>
           <w:p>
@@ -2285,7 +2282,7 @@
         </w:tc>
         <w:tc>
           <w:tcPr>
-            <w:tcW w:w="1167" w:type="dxa"/>
+            <w:tcW w:w="1532" w:type="dxa"/>
             <w:gridSpan w:val="2"/>
           </w:tcPr>
           <w:p>
@@ -2304,7 +2301,7 @@
         </w:tc>
         <w:tc>
           <w:tcPr>
-            <w:tcW w:w="1167" w:type="dxa"/>
+            <w:tcW w:w="1362" w:type="dxa"/>
             <w:gridSpan w:val="2"/>
           </w:tcPr>
           <w:p>
@@ -2323,7 +2320,7 @@
         </w:tc>
         <w:tc>
           <w:tcPr>
-            <w:tcW w:w="1178" w:type="dxa"/>
+            <w:tcW w:w="1250" w:type="dxa"/>
             <w:gridSpan w:val="2"/>
           </w:tcPr>
           <w:p>
@@ -2342,7 +2339,7 @@
         </w:tc>
         <w:tc>
           <w:tcPr>
-            <w:tcW w:w="1182" w:type="dxa"/>
+            <w:tcW w:w="1281" w:type="dxa"/>
             <w:gridSpan w:val="3"/>
           </w:tcPr>
           <w:p>
@@ -2363,12 +2360,12 @@
       <w:tr>
         <w:trPr>
           <w:gridAfter w:val="1"/>
-          <w:wAfter w:w="15" w:type="dxa"/>
+          <w:wAfter w:w="9" w:type="dxa"/>
           <w:trHeight w:val="584"/>
         </w:trPr>
         <w:tc>
           <w:tcPr>
-            <w:tcW w:w="2262" w:type="dxa"/>
+            <w:tcW w:w="2229" w:type="dxa"/>
             <w:vMerge/>
           </w:tcPr>
           <w:p>
@@ -2381,7 +2378,7 @@
         </w:tc>
         <w:tc>
           <w:tcPr>
-            <w:tcW w:w="2976" w:type="dxa"/>
+            <w:tcW w:w="1995" w:type="dxa"/>
             <w:vMerge/>
           </w:tcPr>
           <w:p>
@@ -2394,6 +2391,51 @@
         </w:tc>
         <w:tc>
           <w:tcPr>
+            <w:tcW w:w="821" w:type="dxa"/>
+          </w:tcPr>
+          <w:p>
+            <w:pPr>
+              <w:rPr>
+                <w:rFonts w:ascii="Times New Roman" w:hAnsi="Times New Roman" w:cs="Times New Roman"/>
+              </w:rPr>
+            </w:pPr>
+            <w:r>
+              <w:rPr>
+                <w:rFonts w:ascii="Times New Roman" w:hAnsi="Times New Roman" w:cs="Times New Roman"/>
+                <w:lang w:val="en-US"/>
+              </w:rPr>
+              <w:t>U</w:t>
+            </w:r>
+            <w:r>
+              <w:rPr>
+                <w:rFonts w:ascii="Times New Roman" w:hAnsi="Times New Roman" w:cs="Times New Roman"/>
+                <w:vertAlign w:val="subscript"/>
+              </w:rPr>
+              <w:t>ср</w:t>
+            </w:r>
+            <w:r>
+              <w:rPr>
+                <w:rFonts w:ascii="Times New Roman" w:hAnsi="Times New Roman" w:cs="Times New Roman"/>
+              </w:rPr>
+              <w:t>,</w:t>
+            </w:r>
+            <w:r>
+              <w:rPr>
+                <w:rFonts w:ascii="Times New Roman" w:hAnsi="Times New Roman" w:cs="Times New Roman"/>
+                <w:vertAlign w:val="subscript"/>
+              </w:rPr>
+              <w:t xml:space="preserve"> </w:t>
+            </w:r>
+            <w:r>
+              <w:rPr>
+                <w:rFonts w:ascii="Times New Roman" w:hAnsi="Times New Roman" w:cs="Times New Roman"/>
+              </w:rPr>
+              <w:t>В</w:t>
+            </w:r>
+          </w:p>
+        </w:tc>
+        <w:tc>
+          <w:tcPr>
             <w:tcW w:w="711" w:type="dxa"/>
           </w:tcPr>
           <w:p>
@@ -2407,6 +2449,38 @@
                 <w:rFonts w:ascii="Times New Roman" w:hAnsi="Times New Roman" w:cs="Times New Roman"/>
                 <w:lang w:val="en-US"/>
               </w:rPr>
+              <w:t>I</w:t>
+            </w:r>
+            <w:r>
+              <w:rPr>
+                <w:rFonts w:ascii="Times New Roman" w:hAnsi="Times New Roman" w:cs="Times New Roman"/>
+                <w:vertAlign w:val="subscript"/>
+              </w:rPr>
+              <w:t>ср</w:t>
+            </w:r>
+            <w:r>
+              <w:rPr>
+                <w:rFonts w:ascii="Times New Roman" w:hAnsi="Times New Roman" w:cs="Times New Roman"/>
+              </w:rPr>
+              <w:t>, мА</w:t>
+            </w:r>
+          </w:p>
+        </w:tc>
+        <w:tc>
+          <w:tcPr>
+            <w:tcW w:w="821" w:type="dxa"/>
+          </w:tcPr>
+          <w:p>
+            <w:pPr>
+              <w:rPr>
+                <w:rFonts w:ascii="Times New Roman" w:hAnsi="Times New Roman" w:cs="Times New Roman"/>
+              </w:rPr>
+            </w:pPr>
+            <w:r>
+              <w:rPr>
+                <w:rFonts w:ascii="Times New Roman" w:hAnsi="Times New Roman" w:cs="Times New Roman"/>
+                <w:lang w:val="en-US"/>
+              </w:rPr>
               <w:t>U</w:t>
             </w:r>
             <w:r>
@@ -2439,7 +2513,7 @@
         </w:tc>
         <w:tc>
           <w:tcPr>
-            <w:tcW w:w="538" w:type="dxa"/>
+            <w:tcW w:w="711" w:type="dxa"/>
           </w:tcPr>
           <w:p>
             <w:pPr>
@@ -2471,7 +2545,7 @@
         </w:tc>
         <w:tc>
           <w:tcPr>
-            <w:tcW w:w="584" w:type="dxa"/>
+            <w:tcW w:w="821" w:type="dxa"/>
           </w:tcPr>
           <w:p>
             <w:pPr>
@@ -2516,7 +2590,7 @@
         </w:tc>
         <w:tc>
           <w:tcPr>
-            <w:tcW w:w="583" w:type="dxa"/>
+            <w:tcW w:w="541" w:type="dxa"/>
           </w:tcPr>
           <w:p>
             <w:pPr>
@@ -2548,7 +2622,7 @@
         </w:tc>
         <w:tc>
           <w:tcPr>
-            <w:tcW w:w="582" w:type="dxa"/>
+            <w:tcW w:w="711" w:type="dxa"/>
           </w:tcPr>
           <w:p>
             <w:pPr>
@@ -2593,7 +2667,7 @@
         </w:tc>
         <w:tc>
           <w:tcPr>
-            <w:tcW w:w="585" w:type="dxa"/>
+            <w:tcW w:w="539" w:type="dxa"/>
           </w:tcPr>
           <w:p>
             <w:pPr>
@@ -2625,7 +2699,7 @@
         </w:tc>
         <w:tc>
           <w:tcPr>
-            <w:tcW w:w="597" w:type="dxa"/>
+            <w:tcW w:w="711" w:type="dxa"/>
           </w:tcPr>
           <w:p>
             <w:pPr>
@@ -2670,84 +2744,7 @@
         </w:tc>
         <w:tc>
           <w:tcPr>
-            <w:tcW w:w="581" w:type="dxa"/>
-          </w:tcPr>
-          <w:p>
-            <w:pPr>
-              <w:rPr>
-                <w:rFonts w:ascii="Times New Roman" w:hAnsi="Times New Roman" w:cs="Times New Roman"/>
-              </w:rPr>
-            </w:pPr>
-            <w:r>
-              <w:rPr>
-                <w:rFonts w:ascii="Times New Roman" w:hAnsi="Times New Roman" w:cs="Times New Roman"/>
-                <w:lang w:val="en-US"/>
-              </w:rPr>
-              <w:t>I</w:t>
-            </w:r>
-            <w:r>
-              <w:rPr>
-                <w:rFonts w:ascii="Times New Roman" w:hAnsi="Times New Roman" w:cs="Times New Roman"/>
-                <w:vertAlign w:val="subscript"/>
-              </w:rPr>
-              <w:t>ср</w:t>
-            </w:r>
-            <w:r>
-              <w:rPr>
-                <w:rFonts w:ascii="Times New Roman" w:hAnsi="Times New Roman" w:cs="Times New Roman"/>
-              </w:rPr>
-              <w:t>, мА</w:t>
-            </w:r>
-          </w:p>
-        </w:tc>
-        <w:tc>
-          <w:tcPr>
-            <w:tcW w:w="581" w:type="dxa"/>
-          </w:tcPr>
-          <w:p>
-            <w:pPr>
-              <w:rPr>
-                <w:rFonts w:ascii="Times New Roman" w:hAnsi="Times New Roman" w:cs="Times New Roman"/>
-              </w:rPr>
-            </w:pPr>
-            <w:r>
-              <w:rPr>
-                <w:rFonts w:ascii="Times New Roman" w:hAnsi="Times New Roman" w:cs="Times New Roman"/>
-                <w:lang w:val="en-US"/>
-              </w:rPr>
-              <w:t>U</w:t>
-            </w:r>
-            <w:r>
-              <w:rPr>
-                <w:rFonts w:ascii="Times New Roman" w:hAnsi="Times New Roman" w:cs="Times New Roman"/>
-                <w:vertAlign w:val="subscript"/>
-              </w:rPr>
-              <w:t>ср</w:t>
-            </w:r>
-            <w:r>
-              <w:rPr>
-                <w:rFonts w:ascii="Times New Roman" w:hAnsi="Times New Roman" w:cs="Times New Roman"/>
-              </w:rPr>
-              <w:t>,</w:t>
-            </w:r>
-            <w:r>
-              <w:rPr>
-                <w:rFonts w:ascii="Times New Roman" w:hAnsi="Times New Roman" w:cs="Times New Roman"/>
-                <w:vertAlign w:val="subscript"/>
-              </w:rPr>
-              <w:t xml:space="preserve"> </w:t>
-            </w:r>
-            <w:r>
-              <w:rPr>
-                <w:rFonts w:ascii="Times New Roman" w:hAnsi="Times New Roman" w:cs="Times New Roman"/>
-              </w:rPr>
-              <w:t>В</w:t>
-            </w:r>
-          </w:p>
-        </w:tc>
-        <w:tc>
-          <w:tcPr>
-            <w:tcW w:w="586" w:type="dxa"/>
+            <w:tcW w:w="561" w:type="dxa"/>
           </w:tcPr>
           <w:p>
             <w:pPr>
@@ -2781,12 +2778,12 @@
       <w:tr>
         <w:trPr>
           <w:gridAfter w:val="1"/>
-          <w:wAfter w:w="15" w:type="dxa"/>
+          <w:wAfter w:w="9" w:type="dxa"/>
           <w:trHeight w:val="741"/>
         </w:trPr>
         <w:tc>
           <w:tcPr>
-            <w:tcW w:w="2262" w:type="dxa"/>
+            <w:tcW w:w="2229" w:type="dxa"/>
           </w:tcPr>
           <w:p>
             <w:pPr>
@@ -2804,7 +2801,7 @@
         </w:tc>
         <w:tc>
           <w:tcPr>
-            <w:tcW w:w="2976" w:type="dxa"/>
+            <w:tcW w:w="1995" w:type="dxa"/>
           </w:tcPr>
           <w:p>
             <w:pPr>
@@ -2881,6 +2878,24 @@
         </w:tc>
         <w:tc>
           <w:tcPr>
+            <w:tcW w:w="821" w:type="dxa"/>
+          </w:tcPr>
+          <w:p>
+            <w:pPr>
+              <w:rPr>
+                <w:rFonts w:ascii="Times New Roman" w:hAnsi="Times New Roman" w:cs="Times New Roman"/>
+              </w:rPr>
+            </w:pPr>
+            <w:r>
+              <w:rPr>
+                <w:rFonts w:ascii="Times New Roman" w:hAnsi="Times New Roman" w:cs="Times New Roman"/>
+              </w:rPr>
+              <w:t>3.878</w:t>
+            </w:r>
+          </w:p>
+        </w:tc>
+        <w:tc>
+          <w:tcPr>
             <w:tcW w:w="711" w:type="dxa"/>
           </w:tcPr>
           <w:p>
@@ -2893,31 +2908,13 @@
               <w:rPr>
                 <w:rFonts w:ascii="Times New Roman" w:hAnsi="Times New Roman" w:cs="Times New Roman"/>
               </w:rPr>
-              <w:t>3.878</w:t>
-            </w:r>
-          </w:p>
-        </w:tc>
-        <w:tc>
-          <w:tcPr>
-            <w:tcW w:w="538" w:type="dxa"/>
-          </w:tcPr>
-          <w:p>
-            <w:pPr>
-              <w:rPr>
-                <w:rFonts w:ascii="Times New Roman" w:hAnsi="Times New Roman" w:cs="Times New Roman"/>
-              </w:rPr>
-            </w:pPr>
-            <w:r>
-              <w:rPr>
-                <w:rFonts w:ascii="Times New Roman" w:hAnsi="Times New Roman" w:cs="Times New Roman"/>
-              </w:rPr>
               <w:t>1.939</w:t>
             </w:r>
           </w:p>
         </w:tc>
         <w:tc>
           <w:tcPr>
-            <w:tcW w:w="584" w:type="dxa"/>
+            <w:tcW w:w="821" w:type="dxa"/>
           </w:tcPr>
           <w:p>
             <w:pPr>
@@ -2937,7 +2934,7 @@
         </w:tc>
         <w:tc>
           <w:tcPr>
-            <w:tcW w:w="583" w:type="dxa"/>
+            <w:tcW w:w="711" w:type="dxa"/>
           </w:tcPr>
           <w:p>
             <w:pPr>
@@ -2957,7 +2954,7 @@
         </w:tc>
         <w:tc>
           <w:tcPr>
-            <w:tcW w:w="582" w:type="dxa"/>
+            <w:tcW w:w="821" w:type="dxa"/>
           </w:tcPr>
           <w:p>
             <w:pPr>
@@ -2977,7 +2974,7 @@
         </w:tc>
         <w:tc>
           <w:tcPr>
-            <w:tcW w:w="585" w:type="dxa"/>
+            <w:tcW w:w="541" w:type="dxa"/>
           </w:tcPr>
           <w:p>
             <w:pPr>
@@ -2997,7 +2994,7 @@
         </w:tc>
         <w:tc>
           <w:tcPr>
-            <w:tcW w:w="597" w:type="dxa"/>
+            <w:tcW w:w="711" w:type="dxa"/>
           </w:tcPr>
           <w:p>
             <w:pPr>
@@ -3017,7 +3014,7 @@
         </w:tc>
         <w:tc>
           <w:tcPr>
-            <w:tcW w:w="581" w:type="dxa"/>
+            <w:tcW w:w="539" w:type="dxa"/>
           </w:tcPr>
           <w:p>
             <w:pPr>
@@ -3037,7 +3034,7 @@
         </w:tc>
         <w:tc>
           <w:tcPr>
-            <w:tcW w:w="581" w:type="dxa"/>
+            <w:tcW w:w="711" w:type="dxa"/>
           </w:tcPr>
           <w:p>
             <w:pPr>
@@ -3057,7 +3054,7 @@
         </w:tc>
         <w:tc>
           <w:tcPr>
-            <w:tcW w:w="586" w:type="dxa"/>
+            <w:tcW w:w="561" w:type="dxa"/>
           </w:tcPr>
           <w:p>
             <w:pPr>
@@ -3079,12 +3076,12 @@
       <w:tr>
         <w:trPr>
           <w:gridAfter w:val="1"/>
-          <w:wAfter w:w="15" w:type="dxa"/>
+          <w:wAfter w:w="9" w:type="dxa"/>
           <w:trHeight w:val="794"/>
         </w:trPr>
         <w:tc>
           <w:tcPr>
-            <w:tcW w:w="2262" w:type="dxa"/>
+            <w:tcW w:w="2229" w:type="dxa"/>
           </w:tcPr>
           <w:p>
             <w:pPr>
@@ -3115,7 +3112,7 @@
         </w:tc>
         <w:tc>
           <w:tcPr>
-            <w:tcW w:w="2976" w:type="dxa"/>
+            <w:tcW w:w="1995" w:type="dxa"/>
           </w:tcPr>
           <w:p>
             <w:pPr>
@@ -3192,6 +3189,24 @@
         </w:tc>
         <w:tc>
           <w:tcPr>
+            <w:tcW w:w="821" w:type="dxa"/>
+          </w:tcPr>
+          <w:p>
+            <w:pPr>
+              <w:rPr>
+                <w:rFonts w:ascii="Times New Roman" w:hAnsi="Times New Roman" w:cs="Times New Roman"/>
+              </w:rPr>
+            </w:pPr>
+            <w:r>
+              <w:rPr>
+                <w:rFonts w:ascii="Times New Roman" w:hAnsi="Times New Roman" w:cs="Times New Roman"/>
+              </w:rPr>
+              <w:t>12.006</w:t>
+            </w:r>
+          </w:p>
+        </w:tc>
+        <w:tc>
+          <w:tcPr>
             <w:tcW w:w="711" w:type="dxa"/>
           </w:tcPr>
           <w:p>
@@ -3204,31 +3219,13 @@
               <w:rPr>
                 <w:rFonts w:ascii="Times New Roman" w:hAnsi="Times New Roman" w:cs="Times New Roman"/>
               </w:rPr>
-              <w:t>12.006</w:t>
-            </w:r>
-          </w:p>
-        </w:tc>
-        <w:tc>
-          <w:tcPr>
-            <w:tcW w:w="538" w:type="dxa"/>
-          </w:tcPr>
-          <w:p>
-            <w:pPr>
-              <w:rPr>
-                <w:rFonts w:ascii="Times New Roman" w:hAnsi="Times New Roman" w:cs="Times New Roman"/>
-              </w:rPr>
-            </w:pPr>
-            <w:r>
-              <w:rPr>
-                <w:rFonts w:ascii="Times New Roman" w:hAnsi="Times New Roman" w:cs="Times New Roman"/>
-              </w:rPr>
               <w:t>6.002</w:t>
             </w:r>
           </w:p>
         </w:tc>
         <w:tc>
           <w:tcPr>
-            <w:tcW w:w="584" w:type="dxa"/>
+            <w:tcW w:w="821" w:type="dxa"/>
           </w:tcPr>
           <w:p>
             <w:pPr>
@@ -3248,7 +3245,7 @@
         </w:tc>
         <w:tc>
           <w:tcPr>
-            <w:tcW w:w="583" w:type="dxa"/>
+            <w:tcW w:w="711" w:type="dxa"/>
           </w:tcPr>
           <w:p>
             <w:pPr>
@@ -3268,7 +3265,7 @@
         </w:tc>
         <w:tc>
           <w:tcPr>
-            <w:tcW w:w="582" w:type="dxa"/>
+            <w:tcW w:w="821" w:type="dxa"/>
           </w:tcPr>
           <w:p>
             <w:pPr>
@@ -3288,7 +3285,7 @@
         </w:tc>
         <w:tc>
           <w:tcPr>
-            <w:tcW w:w="585" w:type="dxa"/>
+            <w:tcW w:w="541" w:type="dxa"/>
           </w:tcPr>
           <w:p>
             <w:pPr>
@@ -3308,7 +3305,7 @@
         </w:tc>
         <w:tc>
           <w:tcPr>
-            <w:tcW w:w="597" w:type="dxa"/>
+            <w:tcW w:w="711" w:type="dxa"/>
           </w:tcPr>
           <w:p>
             <w:pPr>
@@ -3328,7 +3325,7 @@
         </w:tc>
         <w:tc>
           <w:tcPr>
-            <w:tcW w:w="581" w:type="dxa"/>
+            <w:tcW w:w="539" w:type="dxa"/>
           </w:tcPr>
           <w:p>
             <w:pPr>
@@ -3348,7 +3345,7 @@
         </w:tc>
         <w:tc>
           <w:tcPr>
-            <w:tcW w:w="581" w:type="dxa"/>
+            <w:tcW w:w="711" w:type="dxa"/>
           </w:tcPr>
           <w:p>
             <w:pPr>
@@ -3368,7 +3365,7 @@
         </w:tc>
         <w:tc>
           <w:tcPr>
-            <w:tcW w:w="586" w:type="dxa"/>
+            <w:tcW w:w="561" w:type="dxa"/>
           </w:tcPr>
           <w:p>
             <w:pPr>
@@ -3383,6 +3380,3109 @@
                 <w:lang w:val="en-US"/>
               </w:rPr>
               <w:t>122</w:t>
+            </w:r>
+          </w:p>
+        </w:tc>
+      </w:tr>
+    </w:tbl>
+    <w:p>
+      <w:pPr>
+        <w:rPr>
+          <w:rFonts w:ascii="Times New Roman" w:hAnsi="Times New Roman" w:cs="Times New Roman"/>
+          <w:lang w:val="en-US"/>
+        </w:rPr>
+      </w:pPr>
+      <w:r>
+        <w:rPr>
+          <w:rFonts w:ascii="Times New Roman" w:hAnsi="Times New Roman" w:cs="Times New Roman"/>
+          <w:noProof/>
+        </w:rPr>
+        <w:lastRenderedPageBreak/>
+        <w:drawing>
+          <wp:inline distT="0" distB="0" distL="0" distR="0" wp14:anchorId="31EB80C7" wp14:editId="32B82EAE">
+            <wp:extent cx="2720576" cy="5075360"/>
+            <wp:effectExtent l="0" t="0" r="3810" b="0"/>
+            <wp:docPr id="896740065" name="Picture 1"/>
+            <wp:cNvGraphicFramePr>
+              <a:graphicFrameLocks xmlns:a="http://schemas.openxmlformats.org/drawingml/2006/main" noChangeAspect="1"/>
+            </wp:cNvGraphicFramePr>
+            <a:graphic xmlns:a="http://schemas.openxmlformats.org/drawingml/2006/main">
+              <a:graphicData uri="http://schemas.openxmlformats.org/drawingml/2006/picture">
+                <pic:pic xmlns:pic="http://schemas.openxmlformats.org/drawingml/2006/picture">
+                  <pic:nvPicPr>
+                    <pic:cNvPr id="896740065" name=""/>
+                    <pic:cNvPicPr/>
+                  </pic:nvPicPr>
+                  <pic:blipFill>
+                    <a:blip r:embed="rId13"/>
+                    <a:stretch>
+                      <a:fillRect/>
+                    </a:stretch>
+                  </pic:blipFill>
+                  <pic:spPr>
+                    <a:xfrm>
+                      <a:off x="0" y="0"/>
+                      <a:ext cx="2720576" cy="5075360"/>
+                    </a:xfrm>
+                    <a:prstGeom prst="rect">
+                      <a:avLst/>
+                    </a:prstGeom>
+                  </pic:spPr>
+                </pic:pic>
+              </a:graphicData>
+            </a:graphic>
+          </wp:inline>
+        </w:drawing>
+      </w:r>
+      <w:r>
+        <w:rPr>
+          <w:rFonts w:ascii="Times New Roman" w:hAnsi="Times New Roman" w:cs="Times New Roman"/>
+          <w:noProof/>
+        </w:rPr>
+        <w:drawing>
+          <wp:inline distT="0" distB="0" distL="0" distR="0" wp14:anchorId="26C63A5E" wp14:editId="07A7AC7A">
+            <wp:extent cx="3040912" cy="5199363"/>
+            <wp:effectExtent l="0" t="0" r="7620" b="1905"/>
+            <wp:docPr id="597522705" name="Picture 1"/>
+            <wp:cNvGraphicFramePr>
+              <a:graphicFrameLocks xmlns:a="http://schemas.openxmlformats.org/drawingml/2006/main" noChangeAspect="1"/>
+            </wp:cNvGraphicFramePr>
+            <a:graphic xmlns:a="http://schemas.openxmlformats.org/drawingml/2006/main">
+              <a:graphicData uri="http://schemas.openxmlformats.org/drawingml/2006/picture">
+                <pic:pic xmlns:pic="http://schemas.openxmlformats.org/drawingml/2006/picture">
+                  <pic:nvPicPr>
+                    <pic:cNvPr id="597522705" name=""/>
+                    <pic:cNvPicPr/>
+                  </pic:nvPicPr>
+                  <pic:blipFill>
+                    <a:blip r:embed="rId14"/>
+                    <a:stretch>
+                      <a:fillRect/>
+                    </a:stretch>
+                  </pic:blipFill>
+                  <pic:spPr>
+                    <a:xfrm>
+                      <a:off x="0" y="0"/>
+                      <a:ext cx="3056346" cy="5225752"/>
+                    </a:xfrm>
+                    <a:prstGeom prst="rect">
+                      <a:avLst/>
+                    </a:prstGeom>
+                  </pic:spPr>
+                </pic:pic>
+              </a:graphicData>
+            </a:graphic>
+          </wp:inline>
+        </w:drawing>
+      </w:r>
+    </w:p>
+    <w:p>
+      <w:pPr>
+        <w:pStyle w:val="Heading1"/>
+        <w:rPr>
+          <w:rFonts w:cs="Times New Roman"/>
+        </w:rPr>
+      </w:pPr>
+      <w:r>
+        <w:rPr>
+          <w:rFonts w:cs="Times New Roman"/>
+        </w:rPr>
+        <w:t>Задание 2</w:t>
+      </w:r>
+    </w:p>
+    <w:tbl>
+      <w:tblPr>
+        <w:tblStyle w:val="TableGrid"/>
+        <w:tblW w:w="0" w:type="auto"/>
+        <w:tblLook w:val="04A0" w:firstRow="1" w:lastRow="0" w:firstColumn="1" w:lastColumn="0" w:noHBand="0" w:noVBand="1"/>
+      </w:tblPr>
+      <w:tblGrid>
+        <w:gridCol w:w="2240"/>
+        <w:gridCol w:w="1850"/>
+        <w:gridCol w:w="897"/>
+        <w:gridCol w:w="936"/>
+        <w:gridCol w:w="901"/>
+        <w:gridCol w:w="1018"/>
+        <w:gridCol w:w="1517"/>
+        <w:gridCol w:w="1517"/>
+      </w:tblGrid>
+      <w:tr>
+        <w:tc>
+          <w:tcPr>
+            <w:tcW w:w="2240" w:type="dxa"/>
+            <w:vMerge w:val="restart"/>
+          </w:tcPr>
+          <w:p>
+            <w:pPr>
+              <w:rPr>
+                <w:rFonts w:ascii="Times New Roman" w:hAnsi="Times New Roman" w:cs="Times New Roman"/>
+              </w:rPr>
+            </w:pPr>
+            <w:r>
+              <w:rPr>
+                <w:rFonts w:ascii="Times New Roman" w:hAnsi="Times New Roman" w:cs="Times New Roman"/>
+              </w:rPr>
+              <w:t>Тип выпрямителя</w:t>
+            </w:r>
+          </w:p>
+        </w:tc>
+        <w:tc>
+          <w:tcPr>
+            <w:tcW w:w="1850" w:type="dxa"/>
+            <w:vMerge w:val="restart"/>
+          </w:tcPr>
+          <w:p>
+            <w:pPr>
+              <w:rPr>
+                <w:rFonts w:ascii="Times New Roman" w:hAnsi="Times New Roman" w:cs="Times New Roman"/>
+              </w:rPr>
+            </w:pPr>
+            <w:r>
+              <w:rPr>
+                <w:rFonts w:ascii="Times New Roman" w:hAnsi="Times New Roman" w:cs="Times New Roman"/>
+              </w:rPr>
+              <w:t>Установлено</w:t>
+            </w:r>
+          </w:p>
+        </w:tc>
+        <w:tc>
+          <w:tcPr>
+            <w:tcW w:w="3752" w:type="dxa"/>
+            <w:gridSpan w:val="4"/>
+          </w:tcPr>
+          <w:p>
+            <w:pPr>
+              <w:jc w:val="center"/>
+              <w:rPr>
+                <w:rFonts w:ascii="Times New Roman" w:hAnsi="Times New Roman" w:cs="Times New Roman"/>
+              </w:rPr>
+            </w:pPr>
+            <w:r>
+              <w:rPr>
+                <w:rFonts w:ascii="Times New Roman" w:hAnsi="Times New Roman" w:cs="Times New Roman"/>
+              </w:rPr>
+              <w:t>Измерено</w:t>
+            </w:r>
+          </w:p>
+        </w:tc>
+        <w:tc>
+          <w:tcPr>
+            <w:tcW w:w="3034" w:type="dxa"/>
+            <w:gridSpan w:val="2"/>
+          </w:tcPr>
+          <w:p>
+            <w:pPr>
+              <w:jc w:val="center"/>
+              <w:rPr>
+                <w:rFonts w:ascii="Times New Roman" w:hAnsi="Times New Roman" w:cs="Times New Roman"/>
+              </w:rPr>
+            </w:pPr>
+            <w:r>
+              <w:rPr>
+                <w:rFonts w:ascii="Times New Roman" w:hAnsi="Times New Roman" w:cs="Times New Roman"/>
+              </w:rPr>
+              <w:t>Посчитано</w:t>
+            </w:r>
+          </w:p>
+        </w:tc>
+      </w:tr>
+      <w:tr>
+        <w:tc>
+          <w:tcPr>
+            <w:tcW w:w="2240" w:type="dxa"/>
+            <w:vMerge/>
+          </w:tcPr>
+          <w:p>
+            <w:pPr>
+              <w:rPr>
+                <w:rFonts w:ascii="Times New Roman" w:hAnsi="Times New Roman" w:cs="Times New Roman"/>
+              </w:rPr>
+            </w:pPr>
+          </w:p>
+        </w:tc>
+        <w:tc>
+          <w:tcPr>
+            <w:tcW w:w="1850" w:type="dxa"/>
+            <w:vMerge/>
+          </w:tcPr>
+          <w:p>
+            <w:pPr>
+              <w:rPr>
+                <w:rFonts w:ascii="Times New Roman" w:hAnsi="Times New Roman" w:cs="Times New Roman"/>
+              </w:rPr>
+            </w:pPr>
+          </w:p>
+        </w:tc>
+        <w:tc>
+          <w:tcPr>
+            <w:tcW w:w="897" w:type="dxa"/>
+          </w:tcPr>
+          <w:p>
+            <w:pPr>
+              <w:rPr>
+                <w:rFonts w:ascii="Times New Roman" w:hAnsi="Times New Roman" w:cs="Times New Roman"/>
+              </w:rPr>
+            </w:pPr>
+            <w:r>
+              <w:rPr>
+                <w:rFonts w:ascii="Times New Roman" w:hAnsi="Times New Roman" w:cs="Times New Roman"/>
+                <w:lang w:val="en-US"/>
+              </w:rPr>
+              <w:t>U</w:t>
+            </w:r>
+            <w:r>
+              <w:rPr>
+                <w:rFonts w:ascii="Times New Roman" w:hAnsi="Times New Roman" w:cs="Times New Roman"/>
+                <w:vertAlign w:val="subscript"/>
+                <w:lang w:val="en-US"/>
+              </w:rPr>
+              <w:t>2m</w:t>
+            </w:r>
+            <w:r>
+              <w:rPr>
+                <w:rFonts w:ascii="Times New Roman" w:hAnsi="Times New Roman" w:cs="Times New Roman"/>
+                <w:lang w:val="en-US"/>
+              </w:rPr>
+              <w:t xml:space="preserve">, </w:t>
+            </w:r>
+            <w:r>
+              <w:rPr>
+                <w:rFonts w:ascii="Times New Roman" w:hAnsi="Times New Roman" w:cs="Times New Roman"/>
+              </w:rPr>
+              <w:t>В</w:t>
+            </w:r>
+          </w:p>
+        </w:tc>
+        <w:tc>
+          <w:tcPr>
+            <w:tcW w:w="936" w:type="dxa"/>
+          </w:tcPr>
+          <w:p>
+            <w:pPr>
+              <w:rPr>
+                <w:rFonts w:ascii="Times New Roman" w:hAnsi="Times New Roman" w:cs="Times New Roman"/>
+              </w:rPr>
+            </w:pPr>
+            <w:r>
+              <w:rPr>
+                <w:rFonts w:ascii="Times New Roman" w:hAnsi="Times New Roman" w:cs="Times New Roman"/>
+                <w:lang w:val="en-US"/>
+              </w:rPr>
+              <w:t>U</w:t>
+            </w:r>
+            <w:r>
+              <w:rPr>
+                <w:rFonts w:ascii="Times New Roman" w:hAnsi="Times New Roman" w:cs="Times New Roman"/>
+                <w:vertAlign w:val="subscript"/>
+              </w:rPr>
+              <w:t>ср</w:t>
+            </w:r>
+            <w:r>
+              <w:rPr>
+                <w:rFonts w:ascii="Times New Roman" w:hAnsi="Times New Roman" w:cs="Times New Roman"/>
+              </w:rPr>
+              <w:t>,</w:t>
+            </w:r>
+            <w:r>
+              <w:rPr>
+                <w:rFonts w:ascii="Times New Roman" w:hAnsi="Times New Roman" w:cs="Times New Roman"/>
+                <w:vertAlign w:val="subscript"/>
+              </w:rPr>
+              <w:t xml:space="preserve"> </w:t>
+            </w:r>
+            <w:r>
+              <w:rPr>
+                <w:rFonts w:ascii="Times New Roman" w:hAnsi="Times New Roman" w:cs="Times New Roman"/>
+              </w:rPr>
+              <w:t>В</w:t>
+            </w:r>
+          </w:p>
+        </w:tc>
+        <w:tc>
+          <w:tcPr>
+            <w:tcW w:w="901" w:type="dxa"/>
+          </w:tcPr>
+          <w:p>
+            <w:pPr>
+              <w:rPr>
+                <w:rFonts w:ascii="Times New Roman" w:hAnsi="Times New Roman" w:cs="Times New Roman"/>
+              </w:rPr>
+            </w:pPr>
+            <w:r>
+              <w:rPr>
+                <w:rFonts w:ascii="Times New Roman" w:hAnsi="Times New Roman" w:cs="Times New Roman"/>
+                <w:lang w:val="en-US"/>
+              </w:rPr>
+              <w:t>I</w:t>
+            </w:r>
+            <w:r>
+              <w:rPr>
+                <w:rFonts w:ascii="Times New Roman" w:hAnsi="Times New Roman" w:cs="Times New Roman"/>
+                <w:vertAlign w:val="subscript"/>
+              </w:rPr>
+              <w:t>ср</w:t>
+            </w:r>
+            <w:r>
+              <w:rPr>
+                <w:rFonts w:ascii="Times New Roman" w:hAnsi="Times New Roman" w:cs="Times New Roman"/>
+              </w:rPr>
+              <w:t>, мА</w:t>
+            </w:r>
+          </w:p>
+        </w:tc>
+        <w:tc>
+          <w:tcPr>
+            <w:tcW w:w="1018" w:type="dxa"/>
+          </w:tcPr>
+          <w:p>
+            <w:pPr>
+              <w:rPr>
+                <w:rFonts w:ascii="Times New Roman" w:hAnsi="Times New Roman" w:cs="Times New Roman"/>
+              </w:rPr>
+            </w:pPr>
+            <w:r>
+              <w:rPr>
+                <w:rFonts w:ascii="Times New Roman" w:hAnsi="Times New Roman" w:cs="Times New Roman"/>
+                <w:lang w:val="en-US"/>
+              </w:rPr>
+              <w:t>U</w:t>
+            </w:r>
+            <w:r>
+              <w:rPr>
+                <w:rFonts w:ascii="Times New Roman" w:hAnsi="Times New Roman" w:cs="Times New Roman"/>
+                <w:vertAlign w:val="subscript"/>
+                <w:lang w:val="en-US"/>
+              </w:rPr>
+              <w:t>m,or</w:t>
+            </w:r>
+            <w:r>
+              <w:rPr>
+                <w:rFonts w:ascii="Times New Roman" w:hAnsi="Times New Roman" w:cs="Times New Roman"/>
+                <w:lang w:val="en-US"/>
+              </w:rPr>
+              <w:t xml:space="preserve">, </w:t>
+            </w:r>
+            <w:r>
+              <w:rPr>
+                <w:rFonts w:ascii="Times New Roman" w:hAnsi="Times New Roman" w:cs="Times New Roman"/>
+              </w:rPr>
+              <w:t>В</w:t>
+            </w:r>
+          </w:p>
+        </w:tc>
+        <w:tc>
+          <w:tcPr>
+            <w:tcW w:w="1517" w:type="dxa"/>
+          </w:tcPr>
+          <w:p>
+            <w:pPr>
+              <w:rPr>
+                <w:rFonts w:ascii="Times New Roman" w:hAnsi="Times New Roman" w:cs="Times New Roman"/>
+              </w:rPr>
+            </w:pPr>
+            <w:r>
+              <w:rPr>
+                <w:rFonts w:ascii="Times New Roman" w:hAnsi="Times New Roman" w:cs="Times New Roman"/>
+              </w:rPr>
+              <w:t>Коэффициент пульсации</w:t>
+            </w:r>
+          </w:p>
+        </w:tc>
+        <w:tc>
+          <w:tcPr>
+            <w:tcW w:w="1517" w:type="dxa"/>
+          </w:tcPr>
+          <w:p>
+            <w:pPr>
+              <w:rPr>
+                <w:rFonts w:ascii="Times New Roman" w:hAnsi="Times New Roman" w:cs="Times New Roman"/>
+              </w:rPr>
+            </w:pPr>
+            <w:r>
+              <w:rPr>
+                <w:rFonts w:ascii="Times New Roman" w:hAnsi="Times New Roman" w:cs="Times New Roman"/>
+              </w:rPr>
+              <w:t>Коэффициент сглаживания</w:t>
+            </w:r>
+          </w:p>
+        </w:tc>
+      </w:tr>
+      <w:tr>
+        <w:tc>
+          <w:tcPr>
+            <w:tcW w:w="2240" w:type="dxa"/>
+          </w:tcPr>
+          <w:p>
+            <w:pPr>
+              <w:rPr>
+                <w:rFonts w:ascii="Times New Roman" w:hAnsi="Times New Roman" w:cs="Times New Roman"/>
+              </w:rPr>
+            </w:pPr>
+            <w:r>
+              <w:rPr>
+                <w:rFonts w:ascii="Times New Roman" w:hAnsi="Times New Roman" w:cs="Times New Roman"/>
+              </w:rPr>
+              <w:t>Двух</w:t>
+            </w:r>
+            <w:r>
+              <w:rPr>
+                <w:rFonts w:ascii="Times New Roman" w:hAnsi="Times New Roman" w:cs="Times New Roman"/>
+              </w:rPr>
+              <w:t>полупериодный – без фильтра</w:t>
+            </w:r>
+          </w:p>
+        </w:tc>
+        <w:tc>
+          <w:tcPr>
+            <w:tcW w:w="1850" w:type="dxa"/>
+          </w:tcPr>
+          <w:p>
+            <w:pPr>
+              <w:rPr>
+                <w:rFonts w:ascii="Times New Roman" w:hAnsi="Times New Roman" w:cs="Times New Roman"/>
+              </w:rPr>
+            </w:pPr>
+            <w:r>
+              <w:rPr>
+                <w:rFonts w:ascii="Times New Roman" w:hAnsi="Times New Roman" w:cs="Times New Roman"/>
+              </w:rPr>
+              <w:t>Ключ</w:t>
+            </w:r>
+            <w:r>
+              <w:rPr>
+                <w:rFonts w:ascii="Times New Roman" w:hAnsi="Times New Roman" w:cs="Times New Roman"/>
+              </w:rPr>
+              <w:t xml:space="preserve">и </w:t>
+            </w:r>
+            <w:r>
+              <w:rPr>
+                <w:rFonts w:ascii="Times New Roman" w:hAnsi="Times New Roman" w:cs="Times New Roman"/>
+                <w:b/>
+                <w:bCs/>
+                <w:lang w:val="en-US"/>
+              </w:rPr>
+              <w:t>Q</w:t>
+            </w:r>
+            <w:r>
+              <w:rPr>
+                <w:rFonts w:ascii="Times New Roman" w:hAnsi="Times New Roman" w:cs="Times New Roman"/>
+              </w:rPr>
+              <w:t xml:space="preserve"> и</w:t>
+            </w:r>
+            <w:r>
+              <w:rPr>
+                <w:rFonts w:ascii="Times New Roman" w:hAnsi="Times New Roman" w:cs="Times New Roman"/>
+              </w:rPr>
+              <w:t xml:space="preserve"> </w:t>
+            </w:r>
+            <w:r>
+              <w:rPr>
+                <w:rFonts w:ascii="Times New Roman" w:hAnsi="Times New Roman" w:cs="Times New Roman"/>
+                <w:b/>
+                <w:bCs/>
+                <w:lang w:val="en-US"/>
+              </w:rPr>
+              <w:t>W</w:t>
+            </w:r>
+            <w:r>
+              <w:rPr>
+                <w:rFonts w:ascii="Times New Roman" w:hAnsi="Times New Roman" w:cs="Times New Roman"/>
+              </w:rPr>
+              <w:t xml:space="preserve"> замкнут</w:t>
+            </w:r>
+            <w:r>
+              <w:rPr>
+                <w:rFonts w:ascii="Times New Roman" w:hAnsi="Times New Roman" w:cs="Times New Roman"/>
+              </w:rPr>
+              <w:t>ы</w:t>
+            </w:r>
+            <w:r>
+              <w:rPr>
+                <w:rFonts w:ascii="Times New Roman" w:hAnsi="Times New Roman" w:cs="Times New Roman"/>
+              </w:rPr>
+              <w:t>; ключи</w:t>
+            </w:r>
+            <w:r>
+              <w:rPr>
+                <w:rFonts w:ascii="Times New Roman" w:hAnsi="Times New Roman" w:cs="Times New Roman"/>
+              </w:rPr>
+              <w:t xml:space="preserve"> </w:t>
+            </w:r>
+            <w:r>
+              <w:rPr>
+                <w:rFonts w:ascii="Times New Roman" w:hAnsi="Times New Roman" w:cs="Times New Roman"/>
+                <w:b/>
+                <w:bCs/>
+                <w:lang w:val="en-US"/>
+              </w:rPr>
+              <w:t>A</w:t>
+            </w:r>
+            <w:r>
+              <w:rPr>
+                <w:rFonts w:ascii="Times New Roman" w:hAnsi="Times New Roman" w:cs="Times New Roman"/>
+              </w:rPr>
+              <w:t xml:space="preserve"> и </w:t>
+            </w:r>
+            <w:r>
+              <w:rPr>
+                <w:rFonts w:ascii="Times New Roman" w:hAnsi="Times New Roman" w:cs="Times New Roman"/>
+                <w:b/>
+                <w:bCs/>
+              </w:rPr>
+              <w:t xml:space="preserve">B </w:t>
+            </w:r>
+            <w:r>
+              <w:rPr>
+                <w:rFonts w:ascii="Times New Roman" w:hAnsi="Times New Roman" w:cs="Times New Roman"/>
+              </w:rPr>
+              <w:t>разомкнуты</w:t>
+            </w:r>
+          </w:p>
+        </w:tc>
+        <w:tc>
+          <w:tcPr>
+            <w:tcW w:w="897" w:type="dxa"/>
+          </w:tcPr>
+          <w:p>
+            <w:pPr>
+              <w:rPr>
+                <w:rFonts w:ascii="Times New Roman" w:hAnsi="Times New Roman" w:cs="Times New Roman"/>
+                <w:lang w:val="en-US"/>
+              </w:rPr>
+            </w:pPr>
+            <w:r>
+              <w:rPr>
+                <w:rFonts w:ascii="Times New Roman" w:hAnsi="Times New Roman" w:cs="Times New Roman"/>
+                <w:lang w:val="en-US"/>
+              </w:rPr>
+              <w:t>12.45</w:t>
+            </w:r>
+          </w:p>
+        </w:tc>
+        <w:tc>
+          <w:tcPr>
+            <w:tcW w:w="936" w:type="dxa"/>
+          </w:tcPr>
+          <w:p>
+            <w:pPr>
+              <w:rPr>
+                <w:rFonts w:ascii="Times New Roman" w:hAnsi="Times New Roman" w:cs="Times New Roman"/>
+              </w:rPr>
+            </w:pPr>
+            <w:r>
+              <w:rPr>
+                <w:rFonts w:ascii="Times New Roman" w:hAnsi="Times New Roman" w:cs="Times New Roman"/>
+              </w:rPr>
+              <w:t>7.551</w:t>
+            </w:r>
+          </w:p>
+        </w:tc>
+        <w:tc>
+          <w:tcPr>
+            <w:tcW w:w="901" w:type="dxa"/>
+          </w:tcPr>
+          <w:p>
+            <w:pPr>
+              <w:rPr>
+                <w:rFonts w:ascii="Times New Roman" w:hAnsi="Times New Roman" w:cs="Times New Roman"/>
+              </w:rPr>
+            </w:pPr>
+            <w:r>
+              <w:rPr>
+                <w:rFonts w:ascii="Times New Roman" w:hAnsi="Times New Roman" w:cs="Times New Roman"/>
+              </w:rPr>
+              <w:t>23</w:t>
+            </w:r>
+          </w:p>
+        </w:tc>
+        <w:tc>
+          <w:tcPr>
+            <w:tcW w:w="1018" w:type="dxa"/>
+          </w:tcPr>
+          <w:p>
+            <w:pPr>
+              <w:rPr>
+                <w:rFonts w:ascii="Times New Roman" w:hAnsi="Times New Roman" w:cs="Times New Roman"/>
+                <w:lang w:val="en-US"/>
+              </w:rPr>
+            </w:pPr>
+            <w:r>
+              <w:rPr>
+                <w:rFonts w:ascii="Times New Roman" w:hAnsi="Times New Roman" w:cs="Times New Roman"/>
+              </w:rPr>
+              <w:t>5.</w:t>
+            </w:r>
+            <w:r>
+              <w:rPr>
+                <w:rFonts w:ascii="Times New Roman" w:hAnsi="Times New Roman" w:cs="Times New Roman"/>
+                <w:lang w:val="en-US"/>
+              </w:rPr>
+              <w:t>495</w:t>
+            </w:r>
+          </w:p>
+        </w:tc>
+        <w:tc>
+          <w:tcPr>
+            <w:tcW w:w="1517" w:type="dxa"/>
+          </w:tcPr>
+          <w:p>
+            <w:pPr>
+              <w:rPr>
+                <w:rFonts w:ascii="Times New Roman" w:hAnsi="Times New Roman" w:cs="Times New Roman"/>
+                <w:lang w:val="en-US"/>
+              </w:rPr>
+            </w:pPr>
+            <w:r>
+              <w:rPr>
+                <w:rFonts w:ascii="Times New Roman" w:hAnsi="Times New Roman" w:cs="Times New Roman"/>
+                <w:lang w:val="en-US"/>
+              </w:rPr>
+              <w:t>q</w:t>
+            </w:r>
+            <w:r>
+              <w:rPr>
+                <w:rFonts w:ascii="Times New Roman" w:hAnsi="Times New Roman" w:cs="Times New Roman"/>
+                <w:vertAlign w:val="subscript"/>
+                <w:lang w:val="en-US"/>
+              </w:rPr>
+              <w:t xml:space="preserve">n </w:t>
+            </w:r>
+            <w:r>
+              <w:rPr>
+                <w:rFonts w:ascii="Times New Roman" w:hAnsi="Times New Roman" w:cs="Times New Roman"/>
+                <w:lang w:val="en-US"/>
+              </w:rPr>
+              <w:t>=U</w:t>
+            </w:r>
+            <w:r>
+              <w:rPr>
+                <w:rFonts w:ascii="Times New Roman" w:hAnsi="Times New Roman" w:cs="Times New Roman"/>
+                <w:vertAlign w:val="subscript"/>
+                <w:lang w:val="en-US"/>
+              </w:rPr>
+              <w:t>m,or</w:t>
+            </w:r>
+            <w:r>
+              <w:rPr>
+                <w:rFonts w:ascii="Times New Roman" w:hAnsi="Times New Roman" w:cs="Times New Roman"/>
+                <w:lang w:val="en-US"/>
+              </w:rPr>
+              <w:t>/U</w:t>
+            </w:r>
+            <w:r>
+              <w:rPr>
+                <w:rFonts w:ascii="Times New Roman" w:hAnsi="Times New Roman" w:cs="Times New Roman"/>
+                <w:vertAlign w:val="subscript"/>
+              </w:rPr>
+              <w:t>ср</w:t>
+            </w:r>
+            <w:r>
+              <w:rPr>
+                <w:rFonts w:ascii="Times New Roman" w:hAnsi="Times New Roman" w:cs="Times New Roman"/>
+                <w:lang w:val="en-US"/>
+              </w:rPr>
+              <w:t xml:space="preserve">= </w:t>
+            </w:r>
+            <w:r>
+              <w:rPr>
+                <w:rFonts w:ascii="Times New Roman" w:hAnsi="Times New Roman" w:cs="Times New Roman"/>
+                <w:lang w:val="en-US"/>
+              </w:rPr>
+              <w:t>0.728</w:t>
+            </w:r>
+          </w:p>
+        </w:tc>
+        <w:tc>
+          <w:tcPr>
+            <w:tcW w:w="1517" w:type="dxa"/>
+          </w:tcPr>
+          <w:p>
+            <w:pPr>
+              <w:rPr>
+                <w:rFonts w:ascii="Times New Roman" w:hAnsi="Times New Roman" w:cs="Times New Roman"/>
+              </w:rPr>
+            </w:pPr>
+            <w:r>
+              <w:rPr>
+                <w:rFonts w:ascii="Times New Roman" w:hAnsi="Times New Roman" w:cs="Times New Roman"/>
+              </w:rPr>
+              <w:t>Нет</w:t>
+            </w:r>
+          </w:p>
+        </w:tc>
+      </w:tr>
+      <w:tr>
+        <w:tc>
+          <w:tcPr>
+            <w:tcW w:w="2240" w:type="dxa"/>
+          </w:tcPr>
+          <w:p>
+            <w:pPr>
+              <w:rPr>
+                <w:rFonts w:ascii="Times New Roman" w:hAnsi="Times New Roman" w:cs="Times New Roman"/>
+              </w:rPr>
+            </w:pPr>
+            <w:r>
+              <w:rPr>
+                <w:rFonts w:ascii="Times New Roman" w:hAnsi="Times New Roman" w:cs="Times New Roman"/>
+              </w:rPr>
+              <w:t xml:space="preserve">– с </w:t>
+            </w:r>
+            <w:r>
+              <w:rPr>
+                <w:rFonts w:ascii="Times New Roman" w:hAnsi="Times New Roman" w:cs="Times New Roman"/>
+                <w:lang w:val="en-US"/>
+              </w:rPr>
+              <w:t>C-</w:t>
+            </w:r>
+            <w:r>
+              <w:rPr>
+                <w:rFonts w:ascii="Times New Roman" w:hAnsi="Times New Roman" w:cs="Times New Roman"/>
+              </w:rPr>
+              <w:t>фильтром</w:t>
+            </w:r>
+          </w:p>
+        </w:tc>
+        <w:tc>
+          <w:tcPr>
+            <w:tcW w:w="1850" w:type="dxa"/>
+          </w:tcPr>
+          <w:p>
+            <w:pPr>
+              <w:rPr>
+                <w:rFonts w:ascii="Times New Roman" w:hAnsi="Times New Roman" w:cs="Times New Roman"/>
+              </w:rPr>
+            </w:pPr>
+            <w:r>
+              <w:rPr>
+                <w:rFonts w:ascii="Times New Roman" w:hAnsi="Times New Roman" w:cs="Times New Roman"/>
+              </w:rPr>
+              <w:t>Ключи</w:t>
+            </w:r>
+            <w:r>
+              <w:rPr>
+                <w:rFonts w:ascii="Times New Roman" w:hAnsi="Times New Roman" w:cs="Times New Roman"/>
+              </w:rPr>
+              <w:t xml:space="preserve"> </w:t>
+            </w:r>
+            <w:r>
+              <w:rPr>
+                <w:rFonts w:ascii="Times New Roman" w:hAnsi="Times New Roman" w:cs="Times New Roman"/>
+                <w:b/>
+                <w:bCs/>
+                <w:lang w:val="en-US"/>
+              </w:rPr>
+              <w:t>Q</w:t>
+            </w:r>
+            <w:r>
+              <w:rPr>
+                <w:rFonts w:ascii="Times New Roman" w:hAnsi="Times New Roman" w:cs="Times New Roman"/>
+              </w:rPr>
+              <w:t>,</w:t>
+            </w:r>
+            <w:r>
+              <w:rPr>
+                <w:rFonts w:ascii="Times New Roman" w:hAnsi="Times New Roman" w:cs="Times New Roman"/>
+              </w:rPr>
+              <w:t xml:space="preserve"> </w:t>
+            </w:r>
+            <w:r>
+              <w:rPr>
+                <w:rFonts w:ascii="Times New Roman" w:hAnsi="Times New Roman" w:cs="Times New Roman"/>
+                <w:b/>
+                <w:bCs/>
+              </w:rPr>
+              <w:t>W</w:t>
+            </w:r>
+            <w:r>
+              <w:rPr>
+                <w:rFonts w:ascii="Times New Roman" w:hAnsi="Times New Roman" w:cs="Times New Roman"/>
+              </w:rPr>
+              <w:t xml:space="preserve"> и </w:t>
+            </w:r>
+            <w:r>
+              <w:rPr>
+                <w:rFonts w:ascii="Times New Roman" w:hAnsi="Times New Roman" w:cs="Times New Roman"/>
+                <w:b/>
+                <w:bCs/>
+                <w:lang w:val="en-US"/>
+              </w:rPr>
+              <w:t>A</w:t>
+            </w:r>
+            <w:r>
+              <w:rPr>
+                <w:rFonts w:ascii="Times New Roman" w:hAnsi="Times New Roman" w:cs="Times New Roman"/>
+              </w:rPr>
+              <w:t xml:space="preserve"> замкнуты; ключ </w:t>
+            </w:r>
+            <w:r>
+              <w:rPr>
+                <w:rFonts w:ascii="Times New Roman" w:hAnsi="Times New Roman" w:cs="Times New Roman"/>
+                <w:b/>
+                <w:bCs/>
+                <w:lang w:val="en-US"/>
+              </w:rPr>
+              <w:t>B</w:t>
+            </w:r>
+            <w:r>
+              <w:rPr>
+                <w:rFonts w:ascii="Times New Roman" w:hAnsi="Times New Roman" w:cs="Times New Roman"/>
+              </w:rPr>
+              <w:t xml:space="preserve"> разомкнут</w:t>
+            </w:r>
+          </w:p>
+        </w:tc>
+        <w:tc>
+          <w:tcPr>
+            <w:tcW w:w="897" w:type="dxa"/>
+          </w:tcPr>
+          <w:p>
+            <w:pPr>
+              <w:rPr>
+                <w:rFonts w:ascii="Times New Roman" w:hAnsi="Times New Roman" w:cs="Times New Roman"/>
+                <w:lang w:val="en-US"/>
+              </w:rPr>
+            </w:pPr>
+            <w:r>
+              <w:rPr>
+                <w:rFonts w:ascii="Times New Roman" w:hAnsi="Times New Roman" w:cs="Times New Roman"/>
+                <w:lang w:val="en-US"/>
+              </w:rPr>
+              <w:t>11.</w:t>
+            </w:r>
+            <w:r>
+              <w:rPr>
+                <w:rFonts w:ascii="Times New Roman" w:hAnsi="Times New Roman" w:cs="Times New Roman"/>
+                <w:lang w:val="en-US"/>
+              </w:rPr>
+              <w:t>777</w:t>
+            </w:r>
+          </w:p>
+        </w:tc>
+        <w:tc>
+          <w:tcPr>
+            <w:tcW w:w="936" w:type="dxa"/>
+          </w:tcPr>
+          <w:p>
+            <w:pPr>
+              <w:rPr>
+                <w:rFonts w:ascii="Times New Roman" w:hAnsi="Times New Roman" w:cs="Times New Roman"/>
+                <w:lang w:val="en-US"/>
+              </w:rPr>
+            </w:pPr>
+            <w:r>
+              <w:rPr>
+                <w:rFonts w:ascii="Times New Roman" w:hAnsi="Times New Roman" w:cs="Times New Roman"/>
+                <w:lang w:val="en-US"/>
+              </w:rPr>
+              <w:t>1</w:t>
+            </w:r>
+            <w:r>
+              <w:rPr>
+                <w:rFonts w:ascii="Times New Roman" w:hAnsi="Times New Roman" w:cs="Times New Roman"/>
+                <w:lang w:val="en-US"/>
+              </w:rPr>
+              <w:t>1.164</w:t>
+            </w:r>
+          </w:p>
+        </w:tc>
+        <w:tc>
+          <w:tcPr>
+            <w:tcW w:w="901" w:type="dxa"/>
+          </w:tcPr>
+          <w:p>
+            <w:pPr>
+              <w:rPr>
+                <w:rFonts w:ascii="Times New Roman" w:hAnsi="Times New Roman" w:cs="Times New Roman"/>
+                <w:lang w:val="en-US"/>
+              </w:rPr>
+            </w:pPr>
+            <w:r>
+              <w:rPr>
+                <w:rFonts w:ascii="Times New Roman" w:hAnsi="Times New Roman" w:cs="Times New Roman"/>
+                <w:lang w:val="en-US"/>
+              </w:rPr>
+              <w:t>35</w:t>
+            </w:r>
+          </w:p>
+        </w:tc>
+        <w:tc>
+          <w:tcPr>
+            <w:tcW w:w="1018" w:type="dxa"/>
+          </w:tcPr>
+          <w:p>
+            <w:pPr>
+              <w:rPr>
+                <w:rFonts w:ascii="Times New Roman" w:hAnsi="Times New Roman" w:cs="Times New Roman"/>
+                <w:lang w:val="en-US"/>
+              </w:rPr>
+            </w:pPr>
+            <w:r>
+              <w:rPr>
+                <w:rFonts w:ascii="Times New Roman" w:hAnsi="Times New Roman" w:cs="Times New Roman"/>
+                <w:lang w:val="en-US"/>
+              </w:rPr>
+              <w:t>0.</w:t>
+            </w:r>
+            <w:r>
+              <w:rPr>
+                <w:rFonts w:ascii="Times New Roman" w:hAnsi="Times New Roman" w:cs="Times New Roman"/>
+                <w:lang w:val="en-US"/>
+              </w:rPr>
+              <w:t>485</w:t>
+            </w:r>
+          </w:p>
+        </w:tc>
+        <w:tc>
+          <w:tcPr>
+            <w:tcW w:w="1517" w:type="dxa"/>
+          </w:tcPr>
+          <w:p>
+            <w:pPr>
+              <w:rPr>
+                <w:rFonts w:ascii="Times New Roman" w:hAnsi="Times New Roman" w:cs="Times New Roman"/>
+                <w:lang w:val="en-US"/>
+              </w:rPr>
+            </w:pPr>
+            <w:r>
+              <w:rPr>
+                <w:rFonts w:ascii="Times New Roman" w:hAnsi="Times New Roman" w:cs="Times New Roman"/>
+                <w:lang w:val="en-US"/>
+              </w:rPr>
+              <w:t>q</w:t>
+            </w:r>
+            <w:r>
+              <w:rPr>
+                <w:rFonts w:ascii="Times New Roman" w:hAnsi="Times New Roman" w:cs="Times New Roman"/>
+                <w:vertAlign w:val="subscript"/>
+                <w:lang w:val="en-US"/>
+              </w:rPr>
+              <w:t>n1</w:t>
+            </w:r>
+            <w:r>
+              <w:rPr>
+                <w:rFonts w:ascii="Times New Roman" w:hAnsi="Times New Roman" w:cs="Times New Roman"/>
+                <w:lang w:val="en-US"/>
+              </w:rPr>
+              <w:t xml:space="preserve"> = 0.0</w:t>
+            </w:r>
+            <w:r>
+              <w:rPr>
+                <w:rFonts w:ascii="Times New Roman" w:hAnsi="Times New Roman" w:cs="Times New Roman"/>
+                <w:lang w:val="en-US"/>
+              </w:rPr>
+              <w:t>43</w:t>
+            </w:r>
+          </w:p>
+        </w:tc>
+        <w:tc>
+          <w:tcPr>
+            <w:tcW w:w="1517" w:type="dxa"/>
+          </w:tcPr>
+          <w:p>
+            <w:pPr>
+              <w:rPr>
+                <w:rFonts w:ascii="Times New Roman" w:hAnsi="Times New Roman" w:cs="Times New Roman"/>
+                <w:lang w:val="en-US"/>
+              </w:rPr>
+            </w:pPr>
+            <w:r>
+              <w:rPr>
+                <w:rFonts w:ascii="Times New Roman" w:hAnsi="Times New Roman" w:cs="Times New Roman"/>
+                <w:lang w:val="en-US"/>
+              </w:rPr>
+              <w:t>k</w:t>
+            </w:r>
+            <w:r>
+              <w:rPr>
+                <w:rFonts w:ascii="Times New Roman" w:hAnsi="Times New Roman" w:cs="Times New Roman"/>
+                <w:vertAlign w:val="subscript"/>
+              </w:rPr>
+              <w:t xml:space="preserve">с1 </w:t>
+            </w:r>
+            <w:r>
+              <w:rPr>
+                <w:rFonts w:ascii="Times New Roman" w:hAnsi="Times New Roman" w:cs="Times New Roman"/>
+              </w:rPr>
+              <w:t xml:space="preserve">= </w:t>
+            </w:r>
+            <w:r>
+              <w:rPr>
+                <w:rFonts w:ascii="Times New Roman" w:hAnsi="Times New Roman" w:cs="Times New Roman"/>
+                <w:lang w:val="en-US"/>
+              </w:rPr>
+              <w:t>q</w:t>
+            </w:r>
+            <w:r>
+              <w:rPr>
+                <w:rFonts w:ascii="Times New Roman" w:hAnsi="Times New Roman" w:cs="Times New Roman"/>
+                <w:vertAlign w:val="subscript"/>
+                <w:lang w:val="en-US"/>
+              </w:rPr>
+              <w:t xml:space="preserve">n </w:t>
+            </w:r>
+            <w:r>
+              <w:rPr>
+                <w:rFonts w:ascii="Times New Roman" w:hAnsi="Times New Roman" w:cs="Times New Roman"/>
+                <w:lang w:val="en-US"/>
+              </w:rPr>
+              <w:t>/ q</w:t>
+            </w:r>
+            <w:r>
+              <w:rPr>
+                <w:rFonts w:ascii="Times New Roman" w:hAnsi="Times New Roman" w:cs="Times New Roman"/>
+                <w:vertAlign w:val="subscript"/>
+                <w:lang w:val="en-US"/>
+              </w:rPr>
+              <w:t>n1</w:t>
+            </w:r>
+            <w:r>
+              <w:rPr>
+                <w:rFonts w:ascii="Times New Roman" w:hAnsi="Times New Roman" w:cs="Times New Roman"/>
+                <w:lang w:val="en-US"/>
+              </w:rPr>
+              <w:t xml:space="preserve"> = </w:t>
+            </w:r>
+            <w:r>
+              <w:rPr>
+                <w:rFonts w:ascii="Times New Roman" w:hAnsi="Times New Roman" w:cs="Times New Roman"/>
+                <w:lang w:val="en-US"/>
+              </w:rPr>
+              <w:t>16.93</w:t>
+            </w:r>
+          </w:p>
+        </w:tc>
+      </w:tr>
+      <w:tr>
+        <w:tc>
+          <w:tcPr>
+            <w:tcW w:w="2240" w:type="dxa"/>
+          </w:tcPr>
+          <w:p>
+            <w:pPr>
+              <w:rPr>
+                <w:rFonts w:ascii="Times New Roman" w:hAnsi="Times New Roman" w:cs="Times New Roman"/>
+              </w:rPr>
+            </w:pPr>
+            <w:r>
+              <w:rPr>
+                <w:rFonts w:ascii="Times New Roman" w:hAnsi="Times New Roman" w:cs="Times New Roman"/>
+              </w:rPr>
+              <w:t xml:space="preserve">– с </w:t>
+            </w:r>
+            <w:r>
+              <w:rPr>
+                <w:rFonts w:ascii="Times New Roman" w:hAnsi="Times New Roman" w:cs="Times New Roman"/>
+                <w:lang w:val="en-US"/>
+              </w:rPr>
+              <w:t>CLC-</w:t>
+            </w:r>
+            <w:r>
+              <w:rPr>
+                <w:rFonts w:ascii="Times New Roman" w:hAnsi="Times New Roman" w:cs="Times New Roman"/>
+              </w:rPr>
+              <w:t>фильтром</w:t>
+            </w:r>
+          </w:p>
+        </w:tc>
+        <w:tc>
+          <w:tcPr>
+            <w:tcW w:w="1850" w:type="dxa"/>
+          </w:tcPr>
+          <w:p>
+            <w:pPr>
+              <w:rPr>
+                <w:rFonts w:ascii="Times New Roman" w:hAnsi="Times New Roman" w:cs="Times New Roman"/>
+              </w:rPr>
+            </w:pPr>
+            <w:r>
+              <w:rPr>
+                <w:rFonts w:ascii="Times New Roman" w:hAnsi="Times New Roman" w:cs="Times New Roman"/>
+              </w:rPr>
+              <w:t>Ключ</w:t>
+            </w:r>
+            <w:r>
+              <w:rPr>
+                <w:rFonts w:ascii="Times New Roman" w:hAnsi="Times New Roman" w:cs="Times New Roman"/>
+              </w:rPr>
+              <w:t xml:space="preserve"> </w:t>
+            </w:r>
+            <w:r>
+              <w:rPr>
+                <w:rFonts w:ascii="Times New Roman" w:hAnsi="Times New Roman" w:cs="Times New Roman"/>
+                <w:b/>
+                <w:bCs/>
+              </w:rPr>
+              <w:t>W</w:t>
+            </w:r>
+            <w:r>
+              <w:rPr>
+                <w:rFonts w:ascii="Times New Roman" w:hAnsi="Times New Roman" w:cs="Times New Roman"/>
+              </w:rPr>
+              <w:t xml:space="preserve"> разомкнут; ключи </w:t>
+            </w:r>
+            <w:r>
+              <w:rPr>
+                <w:rFonts w:ascii="Times New Roman" w:hAnsi="Times New Roman" w:cs="Times New Roman"/>
+                <w:b/>
+                <w:bCs/>
+                <w:lang w:val="en-US"/>
+              </w:rPr>
+              <w:t>Q</w:t>
+            </w:r>
+            <w:r>
+              <w:rPr>
+                <w:rFonts w:ascii="Times New Roman" w:hAnsi="Times New Roman" w:cs="Times New Roman"/>
+              </w:rPr>
+              <w:t xml:space="preserve">, </w:t>
+            </w:r>
+            <w:r>
+              <w:rPr>
+                <w:rFonts w:ascii="Times New Roman" w:hAnsi="Times New Roman" w:cs="Times New Roman"/>
+                <w:b/>
+                <w:bCs/>
+                <w:lang w:val="en-US"/>
+              </w:rPr>
+              <w:t>A</w:t>
+            </w:r>
+            <w:r>
+              <w:rPr>
+                <w:rFonts w:ascii="Times New Roman" w:hAnsi="Times New Roman" w:cs="Times New Roman"/>
+              </w:rPr>
+              <w:t xml:space="preserve"> и </w:t>
+            </w:r>
+            <w:r>
+              <w:rPr>
+                <w:rFonts w:ascii="Times New Roman" w:hAnsi="Times New Roman" w:cs="Times New Roman"/>
+                <w:b/>
+                <w:bCs/>
+                <w:lang w:val="en-US"/>
+              </w:rPr>
+              <w:t>B</w:t>
+            </w:r>
+            <w:r>
+              <w:rPr>
+                <w:rFonts w:ascii="Times New Roman" w:hAnsi="Times New Roman" w:cs="Times New Roman"/>
+              </w:rPr>
+              <w:t xml:space="preserve"> замкнуты</w:t>
+            </w:r>
+          </w:p>
+        </w:tc>
+        <w:tc>
+          <w:tcPr>
+            <w:tcW w:w="897" w:type="dxa"/>
+          </w:tcPr>
+          <w:p>
+            <w:pPr>
+              <w:rPr>
+                <w:rFonts w:ascii="Times New Roman" w:hAnsi="Times New Roman" w:cs="Times New Roman"/>
+                <w:lang w:val="en-US"/>
+              </w:rPr>
+            </w:pPr>
+            <w:r>
+              <w:rPr>
+                <w:rFonts w:ascii="Times New Roman" w:hAnsi="Times New Roman" w:cs="Times New Roman"/>
+                <w:lang w:val="en-US"/>
+              </w:rPr>
+              <w:t>10.</w:t>
+            </w:r>
+            <w:r>
+              <w:rPr>
+                <w:rFonts w:ascii="Times New Roman" w:hAnsi="Times New Roman" w:cs="Times New Roman"/>
+                <w:lang w:val="en-US"/>
+              </w:rPr>
+              <w:t>186</w:t>
+            </w:r>
+          </w:p>
+        </w:tc>
+        <w:tc>
+          <w:tcPr>
+            <w:tcW w:w="936" w:type="dxa"/>
+          </w:tcPr>
+          <w:p>
+            <w:pPr>
+              <w:rPr>
+                <w:rFonts w:ascii="Times New Roman" w:hAnsi="Times New Roman" w:cs="Times New Roman"/>
+                <w:lang w:val="en-US"/>
+              </w:rPr>
+            </w:pPr>
+            <w:r>
+              <w:rPr>
+                <w:rFonts w:ascii="Times New Roman" w:hAnsi="Times New Roman" w:cs="Times New Roman"/>
+                <w:lang w:val="en-US"/>
+              </w:rPr>
+              <w:t>1</w:t>
+            </w:r>
+            <w:r>
+              <w:rPr>
+                <w:rFonts w:ascii="Times New Roman" w:hAnsi="Times New Roman" w:cs="Times New Roman"/>
+                <w:lang w:val="en-US"/>
+              </w:rPr>
+              <w:t>1.173</w:t>
+            </w:r>
+          </w:p>
+        </w:tc>
+        <w:tc>
+          <w:tcPr>
+            <w:tcW w:w="901" w:type="dxa"/>
+          </w:tcPr>
+          <w:p>
+            <w:pPr>
+              <w:rPr>
+                <w:rFonts w:ascii="Times New Roman" w:hAnsi="Times New Roman" w:cs="Times New Roman"/>
+                <w:lang w:val="en-US"/>
+              </w:rPr>
+            </w:pPr>
+            <w:r>
+              <w:rPr>
+                <w:rFonts w:ascii="Times New Roman" w:hAnsi="Times New Roman" w:cs="Times New Roman"/>
+              </w:rPr>
+              <w:t>3</w:t>
+            </w:r>
+            <w:r>
+              <w:rPr>
+                <w:rFonts w:ascii="Times New Roman" w:hAnsi="Times New Roman" w:cs="Times New Roman"/>
+                <w:lang w:val="en-US"/>
+              </w:rPr>
+              <w:t>5</w:t>
+            </w:r>
+          </w:p>
+        </w:tc>
+        <w:tc>
+          <w:tcPr>
+            <w:tcW w:w="1018" w:type="dxa"/>
+          </w:tcPr>
+          <w:p>
+            <w:pPr>
+              <w:rPr>
+                <w:rFonts w:ascii="Times New Roman" w:hAnsi="Times New Roman" w:cs="Times New Roman"/>
+                <w:lang w:val="en-US"/>
+              </w:rPr>
+            </w:pPr>
+            <w:r>
+              <w:rPr>
+                <w:rFonts w:ascii="Times New Roman" w:hAnsi="Times New Roman" w:cs="Times New Roman"/>
+                <w:lang w:val="en-US"/>
+              </w:rPr>
+              <w:t>0.114</w:t>
+            </w:r>
+          </w:p>
+        </w:tc>
+        <w:tc>
+          <w:tcPr>
+            <w:tcW w:w="1517" w:type="dxa"/>
+          </w:tcPr>
+          <w:p>
+            <w:pPr>
+              <w:rPr>
+                <w:rFonts w:ascii="Times New Roman" w:hAnsi="Times New Roman" w:cs="Times New Roman"/>
+              </w:rPr>
+            </w:pPr>
+            <w:r>
+              <w:rPr>
+                <w:rFonts w:ascii="Times New Roman" w:hAnsi="Times New Roman" w:cs="Times New Roman"/>
+                <w:lang w:val="en-US"/>
+              </w:rPr>
+              <w:t>q</w:t>
+            </w:r>
+            <w:r>
+              <w:rPr>
+                <w:rFonts w:ascii="Times New Roman" w:hAnsi="Times New Roman" w:cs="Times New Roman"/>
+                <w:vertAlign w:val="subscript"/>
+                <w:lang w:val="en-US"/>
+              </w:rPr>
+              <w:t>n2</w:t>
+            </w:r>
+            <w:r>
+              <w:rPr>
+                <w:rFonts w:ascii="Times New Roman" w:hAnsi="Times New Roman" w:cs="Times New Roman"/>
+                <w:lang w:val="en-US"/>
+              </w:rPr>
+              <w:t xml:space="preserve"> = 0.</w:t>
+            </w:r>
+            <w:r>
+              <w:rPr>
+                <w:rFonts w:ascii="Times New Roman" w:hAnsi="Times New Roman" w:cs="Times New Roman"/>
+                <w:lang w:val="en-US"/>
+              </w:rPr>
+              <w:t>010</w:t>
+            </w:r>
+          </w:p>
+        </w:tc>
+        <w:tc>
+          <w:tcPr>
+            <w:tcW w:w="1517" w:type="dxa"/>
+          </w:tcPr>
+          <w:p>
+            <w:pPr>
+              <w:rPr>
+                <w:rFonts w:ascii="Times New Roman" w:hAnsi="Times New Roman" w:cs="Times New Roman"/>
+                <w:lang w:val="en-US"/>
+              </w:rPr>
+            </w:pPr>
+            <w:r>
+              <w:rPr>
+                <w:rFonts w:ascii="Times New Roman" w:hAnsi="Times New Roman" w:cs="Times New Roman"/>
+                <w:lang w:val="en-US"/>
+              </w:rPr>
+              <w:t>k</w:t>
+            </w:r>
+            <w:r>
+              <w:rPr>
+                <w:rFonts w:ascii="Times New Roman" w:hAnsi="Times New Roman" w:cs="Times New Roman"/>
+                <w:vertAlign w:val="subscript"/>
+              </w:rPr>
+              <w:t xml:space="preserve">с1 </w:t>
+            </w:r>
+            <w:r>
+              <w:rPr>
+                <w:rFonts w:ascii="Times New Roman" w:hAnsi="Times New Roman" w:cs="Times New Roman"/>
+              </w:rPr>
+              <w:t>=</w:t>
+            </w:r>
+            <w:r>
+              <w:rPr>
+                <w:rFonts w:ascii="Times New Roman" w:hAnsi="Times New Roman" w:cs="Times New Roman"/>
+                <w:lang w:val="en-US"/>
+              </w:rPr>
+              <w:t xml:space="preserve"> q</w:t>
+            </w:r>
+            <w:r>
+              <w:rPr>
+                <w:rFonts w:ascii="Times New Roman" w:hAnsi="Times New Roman" w:cs="Times New Roman"/>
+                <w:vertAlign w:val="subscript"/>
+                <w:lang w:val="en-US"/>
+              </w:rPr>
+              <w:t xml:space="preserve">n1 </w:t>
+            </w:r>
+            <w:r>
+              <w:rPr>
+                <w:rFonts w:ascii="Times New Roman" w:hAnsi="Times New Roman" w:cs="Times New Roman"/>
+                <w:lang w:val="en-US"/>
+              </w:rPr>
+              <w:t>/ q</w:t>
+            </w:r>
+            <w:r>
+              <w:rPr>
+                <w:rFonts w:ascii="Times New Roman" w:hAnsi="Times New Roman" w:cs="Times New Roman"/>
+                <w:vertAlign w:val="subscript"/>
+                <w:lang w:val="en-US"/>
+              </w:rPr>
+              <w:t>n2</w:t>
+            </w:r>
+            <w:r>
+              <w:rPr>
+                <w:rFonts w:ascii="Times New Roman" w:hAnsi="Times New Roman" w:cs="Times New Roman"/>
+                <w:lang w:val="en-US"/>
+              </w:rPr>
+              <w:t xml:space="preserve"> = </w:t>
+            </w:r>
+            <w:r>
+              <w:rPr>
+                <w:rFonts w:ascii="Times New Roman" w:hAnsi="Times New Roman" w:cs="Times New Roman"/>
+                <w:lang w:val="en-US"/>
+              </w:rPr>
+              <w:t>4.3</w:t>
+            </w:r>
+          </w:p>
+        </w:tc>
+      </w:tr>
+    </w:tbl>
+    <w:p>
+      <w:pPr>
+        <w:rPr>
+          <w:rFonts w:ascii="Times New Roman" w:hAnsi="Times New Roman" w:cs="Times New Roman"/>
+          <w:lang w:val="en-US"/>
+        </w:rPr>
+      </w:pPr>
+      <w:r>
+        <w:rPr>
+          <w:rFonts w:ascii="Times New Roman" w:hAnsi="Times New Roman" w:cs="Times New Roman"/>
+        </w:rPr>
+        <w:lastRenderedPageBreak/>
+        <w:t>Двух</w:t>
+      </w:r>
+      <w:r>
+        <w:rPr>
+          <w:rFonts w:ascii="Times New Roman" w:hAnsi="Times New Roman" w:cs="Times New Roman"/>
+        </w:rPr>
+        <w:t>полупериодный – без фильтра</w:t>
+      </w:r>
+      <w:r>
+        <w:rPr>
+          <w:rFonts w:ascii="Times New Roman" w:hAnsi="Times New Roman" w:cs="Times New Roman"/>
+        </w:rPr>
+        <w:t>:</w:t>
+      </w:r>
+      <w:r>
+        <w:rPr>
+          <w:rFonts w:ascii="Times New Roman" w:hAnsi="Times New Roman" w:cs="Times New Roman"/>
+          <w:lang w:val="en-US"/>
+        </w:rPr>
+        <w:drawing>
+          <wp:inline distT="0" distB="0" distL="0" distR="0" wp14:anchorId="6E6B2324" wp14:editId="1836540D">
+            <wp:extent cx="6293041" cy="4750130"/>
+            <wp:effectExtent l="0" t="0" r="0" b="0"/>
+            <wp:docPr id="535101899" name="Picture 1"/>
+            <wp:cNvGraphicFramePr>
+              <a:graphicFrameLocks xmlns:a="http://schemas.openxmlformats.org/drawingml/2006/main" noChangeAspect="1"/>
+            </wp:cNvGraphicFramePr>
+            <a:graphic xmlns:a="http://schemas.openxmlformats.org/drawingml/2006/main">
+              <a:graphicData uri="http://schemas.openxmlformats.org/drawingml/2006/picture">
+                <pic:pic xmlns:pic="http://schemas.openxmlformats.org/drawingml/2006/picture">
+                  <pic:nvPicPr>
+                    <pic:cNvPr id="535101899" name=""/>
+                    <pic:cNvPicPr/>
+                  </pic:nvPicPr>
+                  <pic:blipFill>
+                    <a:blip r:embed="rId15"/>
+                    <a:stretch>
+                      <a:fillRect/>
+                    </a:stretch>
+                  </pic:blipFill>
+                  <pic:spPr>
+                    <a:xfrm>
+                      <a:off x="0" y="0"/>
+                      <a:ext cx="6300876" cy="4756044"/>
+                    </a:xfrm>
+                    <a:prstGeom prst="rect">
+                      <a:avLst/>
+                    </a:prstGeom>
+                  </pic:spPr>
+                </pic:pic>
+              </a:graphicData>
+            </a:graphic>
+          </wp:inline>
+        </w:drawing>
+      </w:r>
+      <w:r>
+        <w:rPr>
+          <w:rFonts w:ascii="Times New Roman" w:hAnsi="Times New Roman" w:cs="Times New Roman"/>
+          <w:lang w:val="en-US"/>
+        </w:rPr>
+        <w:drawing>
+          <wp:inline distT="0" distB="0" distL="0" distR="0" wp14:anchorId="02D8D0E2" wp14:editId="52D2131E">
+            <wp:extent cx="5725324" cy="2610214"/>
+            <wp:effectExtent l="0" t="0" r="8890" b="0"/>
+            <wp:docPr id="1820656944" name="Picture 1"/>
+            <wp:cNvGraphicFramePr>
+              <a:graphicFrameLocks xmlns:a="http://schemas.openxmlformats.org/drawingml/2006/main" noChangeAspect="1"/>
+            </wp:cNvGraphicFramePr>
+            <a:graphic xmlns:a="http://schemas.openxmlformats.org/drawingml/2006/main">
+              <a:graphicData uri="http://schemas.openxmlformats.org/drawingml/2006/picture">
+                <pic:pic xmlns:pic="http://schemas.openxmlformats.org/drawingml/2006/picture">
+                  <pic:nvPicPr>
+                    <pic:cNvPr id="1820656944" name=""/>
+                    <pic:cNvPicPr/>
+                  </pic:nvPicPr>
+                  <pic:blipFill>
+                    <a:blip r:embed="rId16"/>
+                    <a:stretch>
+                      <a:fillRect/>
+                    </a:stretch>
+                  </pic:blipFill>
+                  <pic:spPr>
+                    <a:xfrm>
+                      <a:off x="0" y="0"/>
+                      <a:ext cx="5725324" cy="2610214"/>
+                    </a:xfrm>
+                    <a:prstGeom prst="rect">
+                      <a:avLst/>
+                    </a:prstGeom>
+                  </pic:spPr>
+                </pic:pic>
+              </a:graphicData>
+            </a:graphic>
+          </wp:inline>
+        </w:drawing>
+      </w:r>
+    </w:p>
+    <w:p>
+      <w:pPr>
+        <w:rPr>
+          <w:rFonts w:ascii="Times New Roman" w:hAnsi="Times New Roman" w:cs="Times New Roman"/>
+        </w:rPr>
+      </w:pPr>
+      <w:r>
+        <w:rPr>
+          <w:rFonts w:ascii="Times New Roman" w:hAnsi="Times New Roman" w:cs="Times New Roman"/>
+        </w:rPr>
+        <w:lastRenderedPageBreak/>
+        <w:t>Двух</w:t>
+      </w:r>
+      <w:r>
+        <w:rPr>
+          <w:rFonts w:ascii="Times New Roman" w:hAnsi="Times New Roman" w:cs="Times New Roman"/>
+        </w:rPr>
+        <w:t>полупериодный</w:t>
+      </w:r>
+      <w:r>
+        <w:rPr>
+          <w:rFonts w:ascii="Times New Roman" w:hAnsi="Times New Roman" w:cs="Times New Roman"/>
+        </w:rPr>
+        <w:t xml:space="preserve"> </w:t>
+      </w:r>
+      <w:r>
+        <w:rPr>
+          <w:rFonts w:ascii="Times New Roman" w:hAnsi="Times New Roman" w:cs="Times New Roman"/>
+        </w:rPr>
+        <w:t xml:space="preserve">– с </w:t>
+      </w:r>
+      <w:r>
+        <w:rPr>
+          <w:rFonts w:ascii="Times New Roman" w:hAnsi="Times New Roman" w:cs="Times New Roman"/>
+          <w:lang w:val="en-US"/>
+        </w:rPr>
+        <w:t>C</w:t>
+      </w:r>
+      <w:r>
+        <w:rPr>
+          <w:rFonts w:ascii="Times New Roman" w:hAnsi="Times New Roman" w:cs="Times New Roman"/>
+        </w:rPr>
+        <w:t>-</w:t>
+      </w:r>
+      <w:r>
+        <w:rPr>
+          <w:rFonts w:ascii="Times New Roman" w:hAnsi="Times New Roman" w:cs="Times New Roman"/>
+        </w:rPr>
+        <w:t>фильтром</w:t>
+      </w:r>
+      <w:r>
+        <w:rPr>
+          <w:rFonts w:ascii="Times New Roman" w:hAnsi="Times New Roman" w:cs="Times New Roman"/>
+        </w:rPr>
+        <w:t>:</w:t>
+      </w:r>
+      <w:r>
+        <w:rPr>
+          <w:rFonts w:ascii="Times New Roman" w:hAnsi="Times New Roman" w:cs="Times New Roman"/>
+        </w:rPr>
+        <w:drawing>
+          <wp:inline distT="0" distB="0" distL="0" distR="0" wp14:anchorId="6D8C61AA" wp14:editId="2231F7AF">
+            <wp:extent cx="6353298" cy="4791528"/>
+            <wp:effectExtent l="0" t="0" r="0" b="9525"/>
+            <wp:docPr id="695059165" name="Picture 1"/>
+            <wp:cNvGraphicFramePr>
+              <a:graphicFrameLocks xmlns:a="http://schemas.openxmlformats.org/drawingml/2006/main" noChangeAspect="1"/>
+            </wp:cNvGraphicFramePr>
+            <a:graphic xmlns:a="http://schemas.openxmlformats.org/drawingml/2006/main">
+              <a:graphicData uri="http://schemas.openxmlformats.org/drawingml/2006/picture">
+                <pic:pic xmlns:pic="http://schemas.openxmlformats.org/drawingml/2006/picture">
+                  <pic:nvPicPr>
+                    <pic:cNvPr id="695059165" name=""/>
+                    <pic:cNvPicPr/>
+                  </pic:nvPicPr>
+                  <pic:blipFill>
+                    <a:blip r:embed="rId17"/>
+                    <a:stretch>
+                      <a:fillRect/>
+                    </a:stretch>
+                  </pic:blipFill>
+                  <pic:spPr>
+                    <a:xfrm>
+                      <a:off x="0" y="0"/>
+                      <a:ext cx="6358523" cy="4795468"/>
+                    </a:xfrm>
+                    <a:prstGeom prst="rect">
+                      <a:avLst/>
+                    </a:prstGeom>
+                  </pic:spPr>
+                </pic:pic>
+              </a:graphicData>
+            </a:graphic>
+          </wp:inline>
+        </w:drawing>
+      </w:r>
+      <w:r>
+        <w:rPr>
+          <w:noProof/>
+        </w:rPr>
+        <w:t xml:space="preserve"> </w:t>
+      </w:r>
+      <w:r>
+        <w:rPr>
+          <w:rFonts w:ascii="Times New Roman" w:hAnsi="Times New Roman" w:cs="Times New Roman"/>
+        </w:rPr>
+        <w:drawing>
+          <wp:inline distT="0" distB="0" distL="0" distR="0" wp14:anchorId="565452CA" wp14:editId="7BF8F2CF">
+            <wp:extent cx="5763429" cy="2629267"/>
+            <wp:effectExtent l="0" t="0" r="8890" b="0"/>
+            <wp:docPr id="1177380266" name="Picture 1"/>
+            <wp:cNvGraphicFramePr>
+              <a:graphicFrameLocks xmlns:a="http://schemas.openxmlformats.org/drawingml/2006/main" noChangeAspect="1"/>
+            </wp:cNvGraphicFramePr>
+            <a:graphic xmlns:a="http://schemas.openxmlformats.org/drawingml/2006/main">
+              <a:graphicData uri="http://schemas.openxmlformats.org/drawingml/2006/picture">
+                <pic:pic xmlns:pic="http://schemas.openxmlformats.org/drawingml/2006/picture">
+                  <pic:nvPicPr>
+                    <pic:cNvPr id="1177380266" name=""/>
+                    <pic:cNvPicPr/>
+                  </pic:nvPicPr>
+                  <pic:blipFill>
+                    <a:blip r:embed="rId18"/>
+                    <a:stretch>
+                      <a:fillRect/>
+                    </a:stretch>
+                  </pic:blipFill>
+                  <pic:spPr>
+                    <a:xfrm>
+                      <a:off x="0" y="0"/>
+                      <a:ext cx="5763429" cy="2629267"/>
+                    </a:xfrm>
+                    <a:prstGeom prst="rect">
+                      <a:avLst/>
+                    </a:prstGeom>
+                  </pic:spPr>
+                </pic:pic>
+              </a:graphicData>
+            </a:graphic>
+          </wp:inline>
+        </w:drawing>
+      </w:r>
+    </w:p>
+    <w:p>
+      <w:pPr>
+        <w:rPr>
+          <w:noProof/>
+          <w:lang w:val="en-US"/>
+        </w:rPr>
+      </w:pPr>
+      <w:r>
+        <w:rPr>
+          <w:rFonts w:ascii="Times New Roman" w:hAnsi="Times New Roman" w:cs="Times New Roman"/>
+        </w:rPr>
+        <w:lastRenderedPageBreak/>
+        <w:t>Двух</w:t>
+      </w:r>
+      <w:r>
+        <w:rPr>
+          <w:rFonts w:ascii="Times New Roman" w:hAnsi="Times New Roman" w:cs="Times New Roman"/>
+        </w:rPr>
+        <w:t xml:space="preserve">полупериодный – с </w:t>
+      </w:r>
+      <w:r>
+        <w:rPr>
+          <w:rFonts w:ascii="Times New Roman" w:hAnsi="Times New Roman" w:cs="Times New Roman"/>
+          <w:lang w:val="en-US"/>
+        </w:rPr>
+        <w:t>CLC</w:t>
+      </w:r>
+      <w:r>
+        <w:rPr>
+          <w:rFonts w:ascii="Times New Roman" w:hAnsi="Times New Roman" w:cs="Times New Roman"/>
+        </w:rPr>
+        <w:t>-</w:t>
+      </w:r>
+      <w:r>
+        <w:rPr>
+          <w:rFonts w:ascii="Times New Roman" w:hAnsi="Times New Roman" w:cs="Times New Roman"/>
+        </w:rPr>
+        <w:t>фильтром</w:t>
+      </w:r>
+      <w:r>
+        <w:rPr>
+          <w:rFonts w:ascii="Times New Roman" w:hAnsi="Times New Roman" w:cs="Times New Roman"/>
+        </w:rPr>
+        <w:t>:</w:t>
+      </w:r>
+      <w:r>
+        <w:rPr>
+          <w:noProof/>
+        </w:rPr>
+        <w:t xml:space="preserve"> </w:t>
+      </w:r>
+      <w:r>
+        <w:rPr>
+          <w:rFonts w:ascii="Times New Roman" w:hAnsi="Times New Roman" w:cs="Times New Roman"/>
+        </w:rPr>
+        <w:drawing>
+          <wp:inline distT="0" distB="0" distL="0" distR="0" wp14:anchorId="55651D6D" wp14:editId="576A683F">
+            <wp:extent cx="6355972" cy="4797631"/>
+            <wp:effectExtent l="0" t="0" r="6985" b="3175"/>
+            <wp:docPr id="718733851" name="Picture 1"/>
+            <wp:cNvGraphicFramePr>
+              <a:graphicFrameLocks xmlns:a="http://schemas.openxmlformats.org/drawingml/2006/main" noChangeAspect="1"/>
+            </wp:cNvGraphicFramePr>
+            <a:graphic xmlns:a="http://schemas.openxmlformats.org/drawingml/2006/main">
+              <a:graphicData uri="http://schemas.openxmlformats.org/drawingml/2006/picture">
+                <pic:pic xmlns:pic="http://schemas.openxmlformats.org/drawingml/2006/picture">
+                  <pic:nvPicPr>
+                    <pic:cNvPr id="718733851" name=""/>
+                    <pic:cNvPicPr/>
+                  </pic:nvPicPr>
+                  <pic:blipFill>
+                    <a:blip r:embed="rId19"/>
+                    <a:stretch>
+                      <a:fillRect/>
+                    </a:stretch>
+                  </pic:blipFill>
+                  <pic:spPr>
+                    <a:xfrm>
+                      <a:off x="0" y="0"/>
+                      <a:ext cx="6361293" cy="4801647"/>
+                    </a:xfrm>
+                    <a:prstGeom prst="rect">
+                      <a:avLst/>
+                    </a:prstGeom>
+                  </pic:spPr>
+                </pic:pic>
+              </a:graphicData>
+            </a:graphic>
+          </wp:inline>
+        </w:drawing>
+      </w:r>
+      <w:r>
+        <w:rPr>
+          <w:noProof/>
+        </w:rPr>
+        <w:drawing>
+          <wp:inline distT="0" distB="0" distL="0" distR="0" wp14:anchorId="6B9CC4E8" wp14:editId="783AFAE1">
+            <wp:extent cx="5734850" cy="2648320"/>
+            <wp:effectExtent l="0" t="0" r="0" b="0"/>
+            <wp:docPr id="449759303" name="Picture 1"/>
+            <wp:cNvGraphicFramePr>
+              <a:graphicFrameLocks xmlns:a="http://schemas.openxmlformats.org/drawingml/2006/main" noChangeAspect="1"/>
+            </wp:cNvGraphicFramePr>
+            <a:graphic xmlns:a="http://schemas.openxmlformats.org/drawingml/2006/main">
+              <a:graphicData uri="http://schemas.openxmlformats.org/drawingml/2006/picture">
+                <pic:pic xmlns:pic="http://schemas.openxmlformats.org/drawingml/2006/picture">
+                  <pic:nvPicPr>
+                    <pic:cNvPr id="449759303" name=""/>
+                    <pic:cNvPicPr/>
+                  </pic:nvPicPr>
+                  <pic:blipFill>
+                    <a:blip r:embed="rId20"/>
+                    <a:stretch>
+                      <a:fillRect/>
+                    </a:stretch>
+                  </pic:blipFill>
+                  <pic:spPr>
+                    <a:xfrm>
+                      <a:off x="0" y="0"/>
+                      <a:ext cx="5734850" cy="2648320"/>
+                    </a:xfrm>
+                    <a:prstGeom prst="rect">
+                      <a:avLst/>
+                    </a:prstGeom>
+                  </pic:spPr>
+                </pic:pic>
+              </a:graphicData>
+            </a:graphic>
+          </wp:inline>
+        </w:drawing>
+      </w:r>
+    </w:p>
+    <w:tbl>
+      <w:tblPr>
+        <w:tblStyle w:val="TableGrid"/>
+        <w:tblW w:w="11181" w:type="dxa"/>
+        <w:tblLook w:val="04A0" w:firstRow="1" w:lastRow="0" w:firstColumn="1" w:lastColumn="0" w:noHBand="0" w:noVBand="1"/>
+      </w:tblPr>
+      <w:tblGrid>
+        <w:gridCol w:w="2229"/>
+        <w:gridCol w:w="1995"/>
+        <w:gridCol w:w="821"/>
+        <w:gridCol w:w="711"/>
+        <w:gridCol w:w="821"/>
+        <w:gridCol w:w="711"/>
+        <w:gridCol w:w="821"/>
+        <w:gridCol w:w="541"/>
+        <w:gridCol w:w="711"/>
+        <w:gridCol w:w="539"/>
+        <w:gridCol w:w="711"/>
+        <w:gridCol w:w="561"/>
+        <w:gridCol w:w="9"/>
+      </w:tblGrid>
+      <w:tr>
+        <w:trPr>
+          <w:trHeight w:val="376"/>
+        </w:trPr>
+        <w:tc>
+          <w:tcPr>
+            <w:tcW w:w="2229" w:type="dxa"/>
+            <w:vMerge w:val="restart"/>
+          </w:tcPr>
+          <w:p>
+            <w:pPr>
+              <w:rPr>
+                <w:rFonts w:ascii="Times New Roman" w:hAnsi="Times New Roman" w:cs="Times New Roman"/>
+              </w:rPr>
+            </w:pPr>
+            <w:r>
+              <w:rPr>
+                <w:rFonts w:ascii="Times New Roman" w:hAnsi="Times New Roman" w:cs="Times New Roman"/>
+              </w:rPr>
+              <w:t>Тип выпрямителя</w:t>
+            </w:r>
+          </w:p>
+        </w:tc>
+        <w:tc>
+          <w:tcPr>
+            <w:tcW w:w="1995" w:type="dxa"/>
+            <w:vMerge w:val="restart"/>
+          </w:tcPr>
+          <w:p>
+            <w:pPr>
+              <w:rPr>
+                <w:rFonts w:ascii="Times New Roman" w:hAnsi="Times New Roman" w:cs="Times New Roman"/>
+              </w:rPr>
+            </w:pPr>
+            <w:r>
+              <w:rPr>
+                <w:rFonts w:ascii="Times New Roman" w:hAnsi="Times New Roman" w:cs="Times New Roman"/>
+              </w:rPr>
+              <w:t>Установлено</w:t>
+            </w:r>
+          </w:p>
+        </w:tc>
+        <w:tc>
+          <w:tcPr>
+            <w:tcW w:w="6957" w:type="dxa"/>
+            <w:gridSpan w:val="11"/>
+          </w:tcPr>
+          <w:p>
+            <w:pPr>
+              <w:rPr>
+                <w:rFonts w:ascii="Times New Roman" w:hAnsi="Times New Roman" w:cs="Times New Roman"/>
+              </w:rPr>
+            </w:pPr>
+            <w:r>
+              <w:rPr>
+                <w:rFonts w:ascii="Times New Roman" w:hAnsi="Times New Roman" w:cs="Times New Roman"/>
+              </w:rPr>
+              <w:t>Измерено</w:t>
+            </w:r>
+          </w:p>
+        </w:tc>
+      </w:tr>
+      <w:tr>
+        <w:trPr>
+          <w:trHeight w:val="253"/>
+        </w:trPr>
+        <w:tc>
+          <w:tcPr>
+            <w:tcW w:w="2229" w:type="dxa"/>
+            <w:vMerge/>
+          </w:tcPr>
+          <w:p>
+            <w:pPr>
+              <w:rPr>
+                <w:rFonts w:ascii="Times New Roman" w:hAnsi="Times New Roman" w:cs="Times New Roman"/>
+              </w:rPr>
+            </w:pPr>
+          </w:p>
+        </w:tc>
+        <w:tc>
+          <w:tcPr>
+            <w:tcW w:w="1995" w:type="dxa"/>
+            <w:vMerge/>
+          </w:tcPr>
+          <w:p>
+            <w:pPr>
+              <w:rPr>
+                <w:rFonts w:ascii="Times New Roman" w:hAnsi="Times New Roman" w:cs="Times New Roman"/>
+              </w:rPr>
+            </w:pPr>
+          </w:p>
+        </w:tc>
+        <w:tc>
+          <w:tcPr>
+            <w:tcW w:w="1532" w:type="dxa"/>
+            <w:gridSpan w:val="2"/>
+          </w:tcPr>
+          <w:p>
+            <w:pPr>
+              <w:rPr>
+                <w:rFonts w:ascii="Times New Roman" w:hAnsi="Times New Roman" w:cs="Times New Roman"/>
+              </w:rPr>
+            </w:pPr>
+            <w:r>
+              <w:rPr>
+                <w:rFonts w:ascii="Times New Roman" w:hAnsi="Times New Roman" w:cs="Times New Roman"/>
+                <w:lang w:val="en-US"/>
+              </w:rPr>
+              <w:t>R</w:t>
+            </w:r>
+            <w:r>
+              <w:rPr>
+                <w:rFonts w:ascii="Times New Roman" w:hAnsi="Times New Roman" w:cs="Times New Roman"/>
+                <w:vertAlign w:val="subscript"/>
+                <w:lang w:val="en-US"/>
+              </w:rPr>
+              <w:t>2</w:t>
+            </w:r>
+            <w:r>
+              <w:rPr>
+                <w:rFonts w:ascii="Times New Roman" w:hAnsi="Times New Roman" w:cs="Times New Roman"/>
+                <w:lang w:val="en-US"/>
+              </w:rPr>
+              <w:t xml:space="preserve"> = 2 </w:t>
+            </w:r>
+            <w:r>
+              <w:rPr>
+                <w:rFonts w:ascii="Times New Roman" w:hAnsi="Times New Roman" w:cs="Times New Roman"/>
+              </w:rPr>
+              <w:t>кОм</w:t>
+            </w:r>
+          </w:p>
+        </w:tc>
+        <w:tc>
+          <w:tcPr>
+            <w:tcW w:w="1532" w:type="dxa"/>
+            <w:gridSpan w:val="2"/>
+          </w:tcPr>
+          <w:p>
+            <w:pPr>
+              <w:rPr>
+                <w:rFonts w:ascii="Times New Roman" w:hAnsi="Times New Roman" w:cs="Times New Roman"/>
+              </w:rPr>
+            </w:pPr>
+            <w:r>
+              <w:rPr>
+                <w:rFonts w:ascii="Times New Roman" w:hAnsi="Times New Roman" w:cs="Times New Roman"/>
+              </w:rPr>
+              <w:t>600 Ом</w:t>
+            </w:r>
+          </w:p>
+        </w:tc>
+        <w:tc>
+          <w:tcPr>
+            <w:tcW w:w="1362" w:type="dxa"/>
+            <w:gridSpan w:val="2"/>
+          </w:tcPr>
+          <w:p>
+            <w:pPr>
+              <w:rPr>
+                <w:rFonts w:ascii="Times New Roman" w:hAnsi="Times New Roman" w:cs="Times New Roman"/>
+              </w:rPr>
+            </w:pPr>
+            <w:r>
+              <w:rPr>
+                <w:rFonts w:ascii="Times New Roman" w:hAnsi="Times New Roman" w:cs="Times New Roman"/>
+              </w:rPr>
+              <w:t>320 Ом</w:t>
+            </w:r>
+          </w:p>
+        </w:tc>
+        <w:tc>
+          <w:tcPr>
+            <w:tcW w:w="1250" w:type="dxa"/>
+            <w:gridSpan w:val="2"/>
+          </w:tcPr>
+          <w:p>
+            <w:pPr>
+              <w:rPr>
+                <w:rFonts w:ascii="Times New Roman" w:hAnsi="Times New Roman" w:cs="Times New Roman"/>
+              </w:rPr>
+            </w:pPr>
+            <w:r>
+              <w:rPr>
+                <w:rFonts w:ascii="Times New Roman" w:hAnsi="Times New Roman" w:cs="Times New Roman"/>
+              </w:rPr>
+              <w:t>100 Ом</w:t>
+            </w:r>
+          </w:p>
+        </w:tc>
+        <w:tc>
+          <w:tcPr>
+            <w:tcW w:w="1281" w:type="dxa"/>
+            <w:gridSpan w:val="3"/>
+          </w:tcPr>
+          <w:p>
+            <w:pPr>
+              <w:rPr>
+                <w:rFonts w:ascii="Times New Roman" w:hAnsi="Times New Roman" w:cs="Times New Roman"/>
+              </w:rPr>
+            </w:pPr>
+            <w:r>
+              <w:rPr>
+                <w:rFonts w:ascii="Times New Roman" w:hAnsi="Times New Roman" w:cs="Times New Roman"/>
+              </w:rPr>
+              <w:t>50 Ом</w:t>
+            </w:r>
+          </w:p>
+        </w:tc>
+      </w:tr>
+      <w:tr>
+        <w:trPr>
+          <w:gridAfter w:val="1"/>
+          <w:wAfter w:w="9" w:type="dxa"/>
+          <w:trHeight w:val="584"/>
+        </w:trPr>
+        <w:tc>
+          <w:tcPr>
+            <w:tcW w:w="2229" w:type="dxa"/>
+            <w:vMerge/>
+          </w:tcPr>
+          <w:p>
+            <w:pPr>
+              <w:rPr>
+                <w:rFonts w:ascii="Times New Roman" w:hAnsi="Times New Roman" w:cs="Times New Roman"/>
+              </w:rPr>
+            </w:pPr>
+          </w:p>
+        </w:tc>
+        <w:tc>
+          <w:tcPr>
+            <w:tcW w:w="1995" w:type="dxa"/>
+            <w:vMerge/>
+          </w:tcPr>
+          <w:p>
+            <w:pPr>
+              <w:rPr>
+                <w:rFonts w:ascii="Times New Roman" w:hAnsi="Times New Roman" w:cs="Times New Roman"/>
+              </w:rPr>
+            </w:pPr>
+          </w:p>
+        </w:tc>
+        <w:tc>
+          <w:tcPr>
+            <w:tcW w:w="821" w:type="dxa"/>
+          </w:tcPr>
+          <w:p>
+            <w:pPr>
+              <w:rPr>
+                <w:rFonts w:ascii="Times New Roman" w:hAnsi="Times New Roman" w:cs="Times New Roman"/>
+              </w:rPr>
+            </w:pPr>
+            <w:r>
+              <w:rPr>
+                <w:rFonts w:ascii="Times New Roman" w:hAnsi="Times New Roman" w:cs="Times New Roman"/>
+                <w:lang w:val="en-US"/>
+              </w:rPr>
+              <w:t>U</w:t>
+            </w:r>
+            <w:r>
+              <w:rPr>
+                <w:rFonts w:ascii="Times New Roman" w:hAnsi="Times New Roman" w:cs="Times New Roman"/>
+                <w:vertAlign w:val="subscript"/>
+              </w:rPr>
+              <w:t>ср</w:t>
+            </w:r>
+            <w:r>
+              <w:rPr>
+                <w:rFonts w:ascii="Times New Roman" w:hAnsi="Times New Roman" w:cs="Times New Roman"/>
+              </w:rPr>
+              <w:t>,</w:t>
+            </w:r>
+            <w:r>
+              <w:rPr>
+                <w:rFonts w:ascii="Times New Roman" w:hAnsi="Times New Roman" w:cs="Times New Roman"/>
+                <w:vertAlign w:val="subscript"/>
+              </w:rPr>
+              <w:t xml:space="preserve"> </w:t>
+            </w:r>
+            <w:r>
+              <w:rPr>
+                <w:rFonts w:ascii="Times New Roman" w:hAnsi="Times New Roman" w:cs="Times New Roman"/>
+              </w:rPr>
+              <w:t>В</w:t>
+            </w:r>
+          </w:p>
+        </w:tc>
+        <w:tc>
+          <w:tcPr>
+            <w:tcW w:w="711" w:type="dxa"/>
+          </w:tcPr>
+          <w:p>
+            <w:pPr>
+              <w:rPr>
+                <w:rFonts w:ascii="Times New Roman" w:hAnsi="Times New Roman" w:cs="Times New Roman"/>
+              </w:rPr>
+            </w:pPr>
+            <w:r>
+              <w:rPr>
+                <w:rFonts w:ascii="Times New Roman" w:hAnsi="Times New Roman" w:cs="Times New Roman"/>
+                <w:lang w:val="en-US"/>
+              </w:rPr>
+              <w:t>I</w:t>
+            </w:r>
+            <w:r>
+              <w:rPr>
+                <w:rFonts w:ascii="Times New Roman" w:hAnsi="Times New Roman" w:cs="Times New Roman"/>
+                <w:vertAlign w:val="subscript"/>
+              </w:rPr>
+              <w:t>ср</w:t>
+            </w:r>
+            <w:r>
+              <w:rPr>
+                <w:rFonts w:ascii="Times New Roman" w:hAnsi="Times New Roman" w:cs="Times New Roman"/>
+              </w:rPr>
+              <w:t>, мА</w:t>
+            </w:r>
+          </w:p>
+        </w:tc>
+        <w:tc>
+          <w:tcPr>
+            <w:tcW w:w="821" w:type="dxa"/>
+          </w:tcPr>
+          <w:p>
+            <w:pPr>
+              <w:rPr>
+                <w:rFonts w:ascii="Times New Roman" w:hAnsi="Times New Roman" w:cs="Times New Roman"/>
+              </w:rPr>
+            </w:pPr>
+            <w:r>
+              <w:rPr>
+                <w:rFonts w:ascii="Times New Roman" w:hAnsi="Times New Roman" w:cs="Times New Roman"/>
+                <w:lang w:val="en-US"/>
+              </w:rPr>
+              <w:t>U</w:t>
+            </w:r>
+            <w:r>
+              <w:rPr>
+                <w:rFonts w:ascii="Times New Roman" w:hAnsi="Times New Roman" w:cs="Times New Roman"/>
+                <w:vertAlign w:val="subscript"/>
+              </w:rPr>
+              <w:t>ср</w:t>
+            </w:r>
+            <w:r>
+              <w:rPr>
+                <w:rFonts w:ascii="Times New Roman" w:hAnsi="Times New Roman" w:cs="Times New Roman"/>
+              </w:rPr>
+              <w:t>,</w:t>
+            </w:r>
+            <w:r>
+              <w:rPr>
+                <w:rFonts w:ascii="Times New Roman" w:hAnsi="Times New Roman" w:cs="Times New Roman"/>
+                <w:vertAlign w:val="subscript"/>
+              </w:rPr>
+              <w:t xml:space="preserve"> </w:t>
+            </w:r>
+            <w:r>
+              <w:rPr>
+                <w:rFonts w:ascii="Times New Roman" w:hAnsi="Times New Roman" w:cs="Times New Roman"/>
+              </w:rPr>
+              <w:t>В</w:t>
+            </w:r>
+          </w:p>
+        </w:tc>
+        <w:tc>
+          <w:tcPr>
+            <w:tcW w:w="711" w:type="dxa"/>
+          </w:tcPr>
+          <w:p>
+            <w:pPr>
+              <w:rPr>
+                <w:rFonts w:ascii="Times New Roman" w:hAnsi="Times New Roman" w:cs="Times New Roman"/>
+              </w:rPr>
+            </w:pPr>
+            <w:r>
+              <w:rPr>
+                <w:rFonts w:ascii="Times New Roman" w:hAnsi="Times New Roman" w:cs="Times New Roman"/>
+                <w:lang w:val="en-US"/>
+              </w:rPr>
+              <w:t>I</w:t>
+            </w:r>
+            <w:r>
+              <w:rPr>
+                <w:rFonts w:ascii="Times New Roman" w:hAnsi="Times New Roman" w:cs="Times New Roman"/>
+                <w:vertAlign w:val="subscript"/>
+              </w:rPr>
+              <w:t>ср</w:t>
+            </w:r>
+            <w:r>
+              <w:rPr>
+                <w:rFonts w:ascii="Times New Roman" w:hAnsi="Times New Roman" w:cs="Times New Roman"/>
+              </w:rPr>
+              <w:t>, мА</w:t>
+            </w:r>
+          </w:p>
+        </w:tc>
+        <w:tc>
+          <w:tcPr>
+            <w:tcW w:w="821" w:type="dxa"/>
+          </w:tcPr>
+          <w:p>
+            <w:pPr>
+              <w:rPr>
+                <w:rFonts w:ascii="Times New Roman" w:hAnsi="Times New Roman" w:cs="Times New Roman"/>
+              </w:rPr>
+            </w:pPr>
+            <w:r>
+              <w:rPr>
+                <w:rFonts w:ascii="Times New Roman" w:hAnsi="Times New Roman" w:cs="Times New Roman"/>
+                <w:lang w:val="en-US"/>
+              </w:rPr>
+              <w:t>U</w:t>
+            </w:r>
+            <w:r>
+              <w:rPr>
+                <w:rFonts w:ascii="Times New Roman" w:hAnsi="Times New Roman" w:cs="Times New Roman"/>
+                <w:vertAlign w:val="subscript"/>
+              </w:rPr>
+              <w:t>ср</w:t>
+            </w:r>
+            <w:r>
+              <w:rPr>
+                <w:rFonts w:ascii="Times New Roman" w:hAnsi="Times New Roman" w:cs="Times New Roman"/>
+              </w:rPr>
+              <w:t>,</w:t>
+            </w:r>
+            <w:r>
+              <w:rPr>
+                <w:rFonts w:ascii="Times New Roman" w:hAnsi="Times New Roman" w:cs="Times New Roman"/>
+                <w:vertAlign w:val="subscript"/>
+              </w:rPr>
+              <w:t xml:space="preserve"> </w:t>
+            </w:r>
+            <w:r>
+              <w:rPr>
+                <w:rFonts w:ascii="Times New Roman" w:hAnsi="Times New Roman" w:cs="Times New Roman"/>
+              </w:rPr>
+              <w:t>В</w:t>
+            </w:r>
+          </w:p>
+        </w:tc>
+        <w:tc>
+          <w:tcPr>
+            <w:tcW w:w="541" w:type="dxa"/>
+          </w:tcPr>
+          <w:p>
+            <w:pPr>
+              <w:rPr>
+                <w:rFonts w:ascii="Times New Roman" w:hAnsi="Times New Roman" w:cs="Times New Roman"/>
+              </w:rPr>
+            </w:pPr>
+            <w:r>
+              <w:rPr>
+                <w:rFonts w:ascii="Times New Roman" w:hAnsi="Times New Roman" w:cs="Times New Roman"/>
+                <w:lang w:val="en-US"/>
+              </w:rPr>
+              <w:t>I</w:t>
+            </w:r>
+            <w:r>
+              <w:rPr>
+                <w:rFonts w:ascii="Times New Roman" w:hAnsi="Times New Roman" w:cs="Times New Roman"/>
+                <w:vertAlign w:val="subscript"/>
+              </w:rPr>
+              <w:t>ср</w:t>
+            </w:r>
+            <w:r>
+              <w:rPr>
+                <w:rFonts w:ascii="Times New Roman" w:hAnsi="Times New Roman" w:cs="Times New Roman"/>
+              </w:rPr>
+              <w:t>, мА</w:t>
+            </w:r>
+          </w:p>
+        </w:tc>
+        <w:tc>
+          <w:tcPr>
+            <w:tcW w:w="711" w:type="dxa"/>
+          </w:tcPr>
+          <w:p>
+            <w:pPr>
+              <w:rPr>
+                <w:rFonts w:ascii="Times New Roman" w:hAnsi="Times New Roman" w:cs="Times New Roman"/>
+              </w:rPr>
+            </w:pPr>
+            <w:r>
+              <w:rPr>
+                <w:rFonts w:ascii="Times New Roman" w:hAnsi="Times New Roman" w:cs="Times New Roman"/>
+                <w:lang w:val="en-US"/>
+              </w:rPr>
+              <w:t>U</w:t>
+            </w:r>
+            <w:r>
+              <w:rPr>
+                <w:rFonts w:ascii="Times New Roman" w:hAnsi="Times New Roman" w:cs="Times New Roman"/>
+                <w:vertAlign w:val="subscript"/>
+              </w:rPr>
+              <w:t>ср</w:t>
+            </w:r>
+            <w:r>
+              <w:rPr>
+                <w:rFonts w:ascii="Times New Roman" w:hAnsi="Times New Roman" w:cs="Times New Roman"/>
+              </w:rPr>
+              <w:t>,</w:t>
+            </w:r>
+            <w:r>
+              <w:rPr>
+                <w:rFonts w:ascii="Times New Roman" w:hAnsi="Times New Roman" w:cs="Times New Roman"/>
+                <w:vertAlign w:val="subscript"/>
+              </w:rPr>
+              <w:t xml:space="preserve"> </w:t>
+            </w:r>
+            <w:r>
+              <w:rPr>
+                <w:rFonts w:ascii="Times New Roman" w:hAnsi="Times New Roman" w:cs="Times New Roman"/>
+              </w:rPr>
+              <w:t>В</w:t>
+            </w:r>
+          </w:p>
+        </w:tc>
+        <w:tc>
+          <w:tcPr>
+            <w:tcW w:w="539" w:type="dxa"/>
+          </w:tcPr>
+          <w:p>
+            <w:pPr>
+              <w:rPr>
+                <w:rFonts w:ascii="Times New Roman" w:hAnsi="Times New Roman" w:cs="Times New Roman"/>
+              </w:rPr>
+            </w:pPr>
+            <w:r>
+              <w:rPr>
+                <w:rFonts w:ascii="Times New Roman" w:hAnsi="Times New Roman" w:cs="Times New Roman"/>
+                <w:lang w:val="en-US"/>
+              </w:rPr>
+              <w:t>I</w:t>
+            </w:r>
+            <w:r>
+              <w:rPr>
+                <w:rFonts w:ascii="Times New Roman" w:hAnsi="Times New Roman" w:cs="Times New Roman"/>
+                <w:vertAlign w:val="subscript"/>
+              </w:rPr>
+              <w:t>ср</w:t>
+            </w:r>
+            <w:r>
+              <w:rPr>
+                <w:rFonts w:ascii="Times New Roman" w:hAnsi="Times New Roman" w:cs="Times New Roman"/>
+              </w:rPr>
+              <w:t>, мА</w:t>
+            </w:r>
+          </w:p>
+        </w:tc>
+        <w:tc>
+          <w:tcPr>
+            <w:tcW w:w="711" w:type="dxa"/>
+          </w:tcPr>
+          <w:p>
+            <w:pPr>
+              <w:rPr>
+                <w:rFonts w:ascii="Times New Roman" w:hAnsi="Times New Roman" w:cs="Times New Roman"/>
+              </w:rPr>
+            </w:pPr>
+            <w:r>
+              <w:rPr>
+                <w:rFonts w:ascii="Times New Roman" w:hAnsi="Times New Roman" w:cs="Times New Roman"/>
+                <w:lang w:val="en-US"/>
+              </w:rPr>
+              <w:t>U</w:t>
+            </w:r>
+            <w:r>
+              <w:rPr>
+                <w:rFonts w:ascii="Times New Roman" w:hAnsi="Times New Roman" w:cs="Times New Roman"/>
+                <w:vertAlign w:val="subscript"/>
+              </w:rPr>
+              <w:t>ср</w:t>
+            </w:r>
+            <w:r>
+              <w:rPr>
+                <w:rFonts w:ascii="Times New Roman" w:hAnsi="Times New Roman" w:cs="Times New Roman"/>
+              </w:rPr>
+              <w:t>,</w:t>
+            </w:r>
+            <w:r>
+              <w:rPr>
+                <w:rFonts w:ascii="Times New Roman" w:hAnsi="Times New Roman" w:cs="Times New Roman"/>
+                <w:vertAlign w:val="subscript"/>
+              </w:rPr>
+              <w:t xml:space="preserve"> </w:t>
+            </w:r>
+            <w:r>
+              <w:rPr>
+                <w:rFonts w:ascii="Times New Roman" w:hAnsi="Times New Roman" w:cs="Times New Roman"/>
+              </w:rPr>
+              <w:t>В</w:t>
+            </w:r>
+          </w:p>
+        </w:tc>
+        <w:tc>
+          <w:tcPr>
+            <w:tcW w:w="561" w:type="dxa"/>
+          </w:tcPr>
+          <w:p>
+            <w:pPr>
+              <w:rPr>
+                <w:rFonts w:ascii="Times New Roman" w:hAnsi="Times New Roman" w:cs="Times New Roman"/>
+              </w:rPr>
+            </w:pPr>
+            <w:r>
+              <w:rPr>
+                <w:rFonts w:ascii="Times New Roman" w:hAnsi="Times New Roman" w:cs="Times New Roman"/>
+                <w:lang w:val="en-US"/>
+              </w:rPr>
+              <w:t>I</w:t>
+            </w:r>
+            <w:r>
+              <w:rPr>
+                <w:rFonts w:ascii="Times New Roman" w:hAnsi="Times New Roman" w:cs="Times New Roman"/>
+                <w:vertAlign w:val="subscript"/>
+              </w:rPr>
+              <w:t>ср</w:t>
+            </w:r>
+            <w:r>
+              <w:rPr>
+                <w:rFonts w:ascii="Times New Roman" w:hAnsi="Times New Roman" w:cs="Times New Roman"/>
+              </w:rPr>
+              <w:t>, мА</w:t>
+            </w:r>
+          </w:p>
+        </w:tc>
+      </w:tr>
+      <w:tr>
+        <w:trPr>
+          <w:gridAfter w:val="1"/>
+          <w:wAfter w:w="9" w:type="dxa"/>
+          <w:trHeight w:val="741"/>
+        </w:trPr>
+        <w:tc>
+          <w:tcPr>
+            <w:tcW w:w="2229" w:type="dxa"/>
+          </w:tcPr>
+          <w:p>
+            <w:pPr>
+              <w:rPr>
+                <w:rFonts w:ascii="Times New Roman" w:hAnsi="Times New Roman" w:cs="Times New Roman"/>
+              </w:rPr>
+            </w:pPr>
+            <w:r>
+              <w:rPr>
+                <w:rFonts w:ascii="Times New Roman" w:hAnsi="Times New Roman" w:cs="Times New Roman"/>
+              </w:rPr>
+              <w:t>Двух</w:t>
+            </w:r>
+            <w:r>
+              <w:rPr>
+                <w:rFonts w:ascii="Times New Roman" w:hAnsi="Times New Roman" w:cs="Times New Roman"/>
+              </w:rPr>
+              <w:t>полупериодный – без фильтра</w:t>
+            </w:r>
+          </w:p>
+        </w:tc>
+        <w:tc>
+          <w:tcPr>
+            <w:tcW w:w="1995" w:type="dxa"/>
+          </w:tcPr>
+          <w:p>
+            <w:pPr>
+              <w:rPr>
+                <w:rFonts w:ascii="Times New Roman" w:hAnsi="Times New Roman" w:cs="Times New Roman"/>
+              </w:rPr>
+            </w:pPr>
+            <w:r>
+              <w:rPr>
+                <w:rFonts w:ascii="Times New Roman" w:hAnsi="Times New Roman" w:cs="Times New Roman"/>
+              </w:rPr>
+              <w:t>Ключ</w:t>
+            </w:r>
+            <w:r>
+              <w:rPr>
+                <w:rFonts w:ascii="Times New Roman" w:hAnsi="Times New Roman" w:cs="Times New Roman"/>
+              </w:rPr>
+              <w:t xml:space="preserve">и </w:t>
+            </w:r>
+            <w:r>
+              <w:rPr>
+                <w:rFonts w:ascii="Times New Roman" w:hAnsi="Times New Roman" w:cs="Times New Roman"/>
+                <w:b/>
+                <w:bCs/>
+                <w:lang w:val="en-US"/>
+              </w:rPr>
+              <w:t>Q</w:t>
+            </w:r>
+            <w:r>
+              <w:rPr>
+                <w:rFonts w:ascii="Times New Roman" w:hAnsi="Times New Roman" w:cs="Times New Roman"/>
+              </w:rPr>
+              <w:t xml:space="preserve"> и</w:t>
+            </w:r>
+            <w:r>
+              <w:rPr>
+                <w:rFonts w:ascii="Times New Roman" w:hAnsi="Times New Roman" w:cs="Times New Roman"/>
+              </w:rPr>
+              <w:t xml:space="preserve"> </w:t>
+            </w:r>
+            <w:r>
+              <w:rPr>
+                <w:rFonts w:ascii="Times New Roman" w:hAnsi="Times New Roman" w:cs="Times New Roman"/>
+                <w:b/>
+                <w:bCs/>
+                <w:lang w:val="en-US"/>
+              </w:rPr>
+              <w:t>W</w:t>
+            </w:r>
+            <w:r>
+              <w:rPr>
+                <w:rFonts w:ascii="Times New Roman" w:hAnsi="Times New Roman" w:cs="Times New Roman"/>
+              </w:rPr>
+              <w:t xml:space="preserve"> замкнут</w:t>
+            </w:r>
+            <w:r>
+              <w:rPr>
+                <w:rFonts w:ascii="Times New Roman" w:hAnsi="Times New Roman" w:cs="Times New Roman"/>
+              </w:rPr>
+              <w:t>ы</w:t>
+            </w:r>
+            <w:r>
+              <w:rPr>
+                <w:rFonts w:ascii="Times New Roman" w:hAnsi="Times New Roman" w:cs="Times New Roman"/>
+              </w:rPr>
+              <w:t>; ключи</w:t>
+            </w:r>
+            <w:r>
+              <w:rPr>
+                <w:rFonts w:ascii="Times New Roman" w:hAnsi="Times New Roman" w:cs="Times New Roman"/>
+              </w:rPr>
+              <w:t xml:space="preserve"> </w:t>
+            </w:r>
+            <w:r>
+              <w:rPr>
+                <w:rFonts w:ascii="Times New Roman" w:hAnsi="Times New Roman" w:cs="Times New Roman"/>
+                <w:b/>
+                <w:bCs/>
+                <w:lang w:val="en-US"/>
+              </w:rPr>
+              <w:t>A</w:t>
+            </w:r>
+            <w:r>
+              <w:rPr>
+                <w:rFonts w:ascii="Times New Roman" w:hAnsi="Times New Roman" w:cs="Times New Roman"/>
+              </w:rPr>
+              <w:t xml:space="preserve"> и </w:t>
+            </w:r>
+            <w:r>
+              <w:rPr>
+                <w:rFonts w:ascii="Times New Roman" w:hAnsi="Times New Roman" w:cs="Times New Roman"/>
+                <w:b/>
+                <w:bCs/>
+              </w:rPr>
+              <w:t xml:space="preserve">B </w:t>
+            </w:r>
+            <w:r>
+              <w:rPr>
+                <w:rFonts w:ascii="Times New Roman" w:hAnsi="Times New Roman" w:cs="Times New Roman"/>
+              </w:rPr>
+              <w:t>разомкнуты</w:t>
+            </w:r>
+          </w:p>
+        </w:tc>
+        <w:tc>
+          <w:tcPr>
+            <w:tcW w:w="821" w:type="dxa"/>
+          </w:tcPr>
+          <w:p>
+            <w:pPr>
+              <w:rPr>
+                <w:rFonts w:ascii="Times New Roman" w:hAnsi="Times New Roman" w:cs="Times New Roman"/>
+                <w:lang w:val="en-US"/>
+              </w:rPr>
+            </w:pPr>
+            <w:r>
+              <w:rPr>
+                <w:rFonts w:ascii="Times New Roman" w:hAnsi="Times New Roman" w:cs="Times New Roman"/>
+                <w:lang w:val="en-US"/>
+              </w:rPr>
+              <w:t>7.755</w:t>
+            </w:r>
+          </w:p>
+        </w:tc>
+        <w:tc>
+          <w:tcPr>
+            <w:tcW w:w="711" w:type="dxa"/>
+          </w:tcPr>
+          <w:p>
+            <w:pPr>
+              <w:rPr>
+                <w:rFonts w:ascii="Times New Roman" w:hAnsi="Times New Roman" w:cs="Times New Roman"/>
+                <w:lang w:val="en-US"/>
+              </w:rPr>
+            </w:pPr>
+            <w:r>
+              <w:rPr>
+                <w:rFonts w:ascii="Times New Roman" w:hAnsi="Times New Roman" w:cs="Times New Roman"/>
+                <w:lang w:val="en-US"/>
+              </w:rPr>
+              <w:t>3</w:t>
+            </w:r>
+            <w:r>
+              <w:rPr>
+                <w:rFonts w:ascii="Times New Roman" w:hAnsi="Times New Roman" w:cs="Times New Roman"/>
+                <w:lang w:val="en-US"/>
+              </w:rPr>
+              <w:t>.88</w:t>
+            </w:r>
+          </w:p>
+        </w:tc>
+        <w:tc>
+          <w:tcPr>
+            <w:tcW w:w="821" w:type="dxa"/>
+          </w:tcPr>
+          <w:p>
+            <w:pPr>
+              <w:rPr>
+                <w:rFonts w:ascii="Times New Roman" w:hAnsi="Times New Roman" w:cs="Times New Roman"/>
+                <w:lang w:val="en-US"/>
+              </w:rPr>
+            </w:pPr>
+            <w:r>
+              <w:rPr>
+                <w:rFonts w:ascii="Times New Roman" w:hAnsi="Times New Roman" w:cs="Times New Roman"/>
+                <w:lang w:val="en-US"/>
+              </w:rPr>
+              <w:t>7.627</w:t>
+            </w:r>
+          </w:p>
+        </w:tc>
+        <w:tc>
+          <w:tcPr>
+            <w:tcW w:w="711" w:type="dxa"/>
+          </w:tcPr>
+          <w:p>
+            <w:pPr>
+              <w:rPr>
+                <w:rFonts w:ascii="Times New Roman" w:hAnsi="Times New Roman" w:cs="Times New Roman"/>
+                <w:lang w:val="en-US"/>
+              </w:rPr>
+            </w:pPr>
+            <w:r>
+              <w:rPr>
+                <w:rFonts w:ascii="Times New Roman" w:hAnsi="Times New Roman" w:cs="Times New Roman"/>
+                <w:lang w:val="en-US"/>
+              </w:rPr>
+              <w:t>13</w:t>
+            </w:r>
+          </w:p>
+        </w:tc>
+        <w:tc>
+          <w:tcPr>
+            <w:tcW w:w="821" w:type="dxa"/>
+          </w:tcPr>
+          <w:p>
+            <w:pPr>
+              <w:rPr>
+                <w:rFonts w:ascii="Times New Roman" w:hAnsi="Times New Roman" w:cs="Times New Roman"/>
+                <w:lang w:val="en-US"/>
+              </w:rPr>
+            </w:pPr>
+            <w:r>
+              <w:rPr>
+                <w:rFonts w:ascii="Times New Roman" w:hAnsi="Times New Roman" w:cs="Times New Roman"/>
+                <w:lang w:val="en-US"/>
+              </w:rPr>
+              <w:t>7.511</w:t>
+            </w:r>
+          </w:p>
+        </w:tc>
+        <w:tc>
+          <w:tcPr>
+            <w:tcW w:w="541" w:type="dxa"/>
+          </w:tcPr>
+          <w:p>
+            <w:pPr>
+              <w:rPr>
+                <w:rFonts w:ascii="Times New Roman" w:hAnsi="Times New Roman" w:cs="Times New Roman"/>
+                <w:lang w:val="en-US"/>
+              </w:rPr>
+            </w:pPr>
+            <w:r>
+              <w:rPr>
+                <w:rFonts w:ascii="Times New Roman" w:hAnsi="Times New Roman" w:cs="Times New Roman"/>
+                <w:lang w:val="en-US"/>
+              </w:rPr>
+              <w:t>23</w:t>
+            </w:r>
+          </w:p>
+        </w:tc>
+        <w:tc>
+          <w:tcPr>
+            <w:tcW w:w="711" w:type="dxa"/>
+          </w:tcPr>
+          <w:p>
+            <w:pPr>
+              <w:rPr>
+                <w:rFonts w:ascii="Times New Roman" w:hAnsi="Times New Roman" w:cs="Times New Roman"/>
+                <w:lang w:val="en-US"/>
+              </w:rPr>
+            </w:pPr>
+            <w:r>
+              <w:rPr>
+                <w:rFonts w:ascii="Times New Roman" w:hAnsi="Times New Roman" w:cs="Times New Roman"/>
+                <w:lang w:val="en-US"/>
+              </w:rPr>
+              <w:t>7.079</w:t>
+            </w:r>
+          </w:p>
+        </w:tc>
+        <w:tc>
+          <w:tcPr>
+            <w:tcW w:w="539" w:type="dxa"/>
+          </w:tcPr>
+          <w:p>
+            <w:pPr>
+              <w:rPr>
+                <w:rFonts w:ascii="Times New Roman" w:hAnsi="Times New Roman" w:cs="Times New Roman"/>
+                <w:lang w:val="en-US"/>
+              </w:rPr>
+            </w:pPr>
+            <w:r>
+              <w:rPr>
+                <w:rFonts w:ascii="Times New Roman" w:hAnsi="Times New Roman" w:cs="Times New Roman"/>
+                <w:lang w:val="en-US"/>
+              </w:rPr>
+              <w:t>71</w:t>
+            </w:r>
+          </w:p>
+        </w:tc>
+        <w:tc>
+          <w:tcPr>
+            <w:tcW w:w="711" w:type="dxa"/>
+          </w:tcPr>
+          <w:p>
+            <w:pPr>
+              <w:rPr>
+                <w:rFonts w:ascii="Times New Roman" w:hAnsi="Times New Roman" w:cs="Times New Roman"/>
+                <w:lang w:val="en-US"/>
+              </w:rPr>
+            </w:pPr>
+            <w:r>
+              <w:rPr>
+                <w:rFonts w:ascii="Times New Roman" w:hAnsi="Times New Roman" w:cs="Times New Roman"/>
+                <w:lang w:val="en-US"/>
+              </w:rPr>
+              <w:t>6.565</w:t>
+            </w:r>
+          </w:p>
+        </w:tc>
+        <w:tc>
+          <w:tcPr>
+            <w:tcW w:w="561" w:type="dxa"/>
+          </w:tcPr>
+          <w:p>
+            <w:pPr>
+              <w:rPr>
+                <w:rFonts w:ascii="Times New Roman" w:hAnsi="Times New Roman" w:cs="Times New Roman"/>
+                <w:lang w:val="en-US"/>
+              </w:rPr>
+            </w:pPr>
+            <w:r>
+              <w:rPr>
+                <w:rFonts w:ascii="Times New Roman" w:hAnsi="Times New Roman" w:cs="Times New Roman"/>
+                <w:lang w:val="en-US"/>
+              </w:rPr>
+              <w:t>131</w:t>
+            </w:r>
+          </w:p>
+        </w:tc>
+      </w:tr>
+      <w:tr>
+        <w:trPr>
+          <w:gridAfter w:val="1"/>
+          <w:wAfter w:w="9" w:type="dxa"/>
+          <w:trHeight w:val="794"/>
+        </w:trPr>
+        <w:tc>
+          <w:tcPr>
+            <w:tcW w:w="2229" w:type="dxa"/>
+          </w:tcPr>
+          <w:p>
+            <w:pPr>
+              <w:rPr>
+                <w:rFonts w:ascii="Times New Roman" w:hAnsi="Times New Roman" w:cs="Times New Roman"/>
+              </w:rPr>
+            </w:pPr>
+            <w:r>
+              <w:rPr>
+                <w:rFonts w:ascii="Times New Roman" w:hAnsi="Times New Roman" w:cs="Times New Roman"/>
+              </w:rPr>
+              <w:t xml:space="preserve">– с </w:t>
+            </w:r>
+            <w:r>
+              <w:rPr>
+                <w:rFonts w:ascii="Times New Roman" w:hAnsi="Times New Roman" w:cs="Times New Roman"/>
+                <w:lang w:val="en-US"/>
+              </w:rPr>
+              <w:t>CLC-</w:t>
+            </w:r>
+            <w:r>
+              <w:rPr>
+                <w:rFonts w:ascii="Times New Roman" w:hAnsi="Times New Roman" w:cs="Times New Roman"/>
+              </w:rPr>
+              <w:t>фильтром</w:t>
+            </w:r>
+          </w:p>
+        </w:tc>
+        <w:tc>
+          <w:tcPr>
+            <w:tcW w:w="1995" w:type="dxa"/>
+          </w:tcPr>
+          <w:p>
+            <w:pPr>
+              <w:rPr>
+                <w:rFonts w:ascii="Times New Roman" w:hAnsi="Times New Roman" w:cs="Times New Roman"/>
+              </w:rPr>
+            </w:pPr>
+            <w:r>
+              <w:rPr>
+                <w:rFonts w:ascii="Times New Roman" w:hAnsi="Times New Roman" w:cs="Times New Roman"/>
+              </w:rPr>
+              <w:t>Ключ</w:t>
+            </w:r>
+            <w:r>
+              <w:rPr>
+                <w:rFonts w:ascii="Times New Roman" w:hAnsi="Times New Roman" w:cs="Times New Roman"/>
+              </w:rPr>
+              <w:t xml:space="preserve"> </w:t>
+            </w:r>
+            <w:r>
+              <w:rPr>
+                <w:rFonts w:ascii="Times New Roman" w:hAnsi="Times New Roman" w:cs="Times New Roman"/>
+                <w:b/>
+                <w:bCs/>
+              </w:rPr>
+              <w:t>W</w:t>
+            </w:r>
+            <w:r>
+              <w:rPr>
+                <w:rFonts w:ascii="Times New Roman" w:hAnsi="Times New Roman" w:cs="Times New Roman"/>
+              </w:rPr>
+              <w:t xml:space="preserve"> разомкнут; ключи </w:t>
+            </w:r>
+            <w:r>
+              <w:rPr>
+                <w:rFonts w:ascii="Times New Roman" w:hAnsi="Times New Roman" w:cs="Times New Roman"/>
+                <w:b/>
+                <w:bCs/>
+                <w:lang w:val="en-US"/>
+              </w:rPr>
+              <w:t>Q</w:t>
+            </w:r>
+            <w:r>
+              <w:rPr>
+                <w:rFonts w:ascii="Times New Roman" w:hAnsi="Times New Roman" w:cs="Times New Roman"/>
+              </w:rPr>
+              <w:t xml:space="preserve">, </w:t>
+            </w:r>
+            <w:r>
+              <w:rPr>
+                <w:rFonts w:ascii="Times New Roman" w:hAnsi="Times New Roman" w:cs="Times New Roman"/>
+                <w:b/>
+                <w:bCs/>
+                <w:lang w:val="en-US"/>
+              </w:rPr>
+              <w:t>A</w:t>
+            </w:r>
+            <w:r>
+              <w:rPr>
+                <w:rFonts w:ascii="Times New Roman" w:hAnsi="Times New Roman" w:cs="Times New Roman"/>
+              </w:rPr>
+              <w:t xml:space="preserve"> и </w:t>
+            </w:r>
+            <w:r>
+              <w:rPr>
+                <w:rFonts w:ascii="Times New Roman" w:hAnsi="Times New Roman" w:cs="Times New Roman"/>
+                <w:b/>
+                <w:bCs/>
+                <w:lang w:val="en-US"/>
+              </w:rPr>
+              <w:t>B</w:t>
+            </w:r>
+            <w:r>
+              <w:rPr>
+                <w:rFonts w:ascii="Times New Roman" w:hAnsi="Times New Roman" w:cs="Times New Roman"/>
+              </w:rPr>
+              <w:t xml:space="preserve"> замкнуты</w:t>
+            </w:r>
+          </w:p>
+        </w:tc>
+        <w:tc>
+          <w:tcPr>
+            <w:tcW w:w="821" w:type="dxa"/>
+          </w:tcPr>
+          <w:p>
+            <w:pPr>
+              <w:rPr>
+                <w:rFonts w:ascii="Times New Roman" w:hAnsi="Times New Roman" w:cs="Times New Roman"/>
+                <w:lang w:val="en-US"/>
+              </w:rPr>
+            </w:pPr>
+            <w:r>
+              <w:rPr>
+                <w:rFonts w:ascii="Times New Roman" w:hAnsi="Times New Roman" w:cs="Times New Roman"/>
+                <w:lang w:val="en-US"/>
+              </w:rPr>
+              <w:t>12.308</w:t>
+            </w:r>
+          </w:p>
+        </w:tc>
+        <w:tc>
+          <w:tcPr>
+            <w:tcW w:w="711" w:type="dxa"/>
+          </w:tcPr>
+          <w:p>
+            <w:pPr>
+              <w:rPr>
+                <w:rFonts w:ascii="Times New Roman" w:hAnsi="Times New Roman" w:cs="Times New Roman"/>
+                <w:lang w:val="en-US"/>
+              </w:rPr>
+            </w:pPr>
+            <w:r>
+              <w:rPr>
+                <w:rFonts w:ascii="Times New Roman" w:hAnsi="Times New Roman" w:cs="Times New Roman"/>
+                <w:lang w:val="en-US"/>
+              </w:rPr>
+              <w:t>6.153</w:t>
+            </w:r>
+          </w:p>
+        </w:tc>
+        <w:tc>
+          <w:tcPr>
+            <w:tcW w:w="821" w:type="dxa"/>
+          </w:tcPr>
+          <w:p>
+            <w:pPr>
+              <w:rPr>
+                <w:rFonts w:ascii="Times New Roman" w:hAnsi="Times New Roman" w:cs="Times New Roman"/>
+                <w:lang w:val="en-US"/>
+              </w:rPr>
+            </w:pPr>
+            <w:r>
+              <w:rPr>
+                <w:rFonts w:ascii="Times New Roman" w:hAnsi="Times New Roman" w:cs="Times New Roman"/>
+                <w:lang w:val="en-US"/>
+              </w:rPr>
+              <w:t>11.706</w:t>
+            </w:r>
+          </w:p>
+        </w:tc>
+        <w:tc>
+          <w:tcPr>
+            <w:tcW w:w="711" w:type="dxa"/>
+          </w:tcPr>
+          <w:p>
+            <w:pPr>
+              <w:rPr>
+                <w:rFonts w:ascii="Times New Roman" w:hAnsi="Times New Roman" w:cs="Times New Roman"/>
+                <w:lang w:val="en-US"/>
+              </w:rPr>
+            </w:pPr>
+            <w:r>
+              <w:rPr>
+                <w:rFonts w:ascii="Times New Roman" w:hAnsi="Times New Roman" w:cs="Times New Roman"/>
+                <w:lang w:val="en-US"/>
+              </w:rPr>
+              <w:t>20</w:t>
+            </w:r>
+          </w:p>
+        </w:tc>
+        <w:tc>
+          <w:tcPr>
+            <w:tcW w:w="821" w:type="dxa"/>
+          </w:tcPr>
+          <w:p>
+            <w:pPr>
+              <w:rPr>
+                <w:rFonts w:ascii="Times New Roman" w:hAnsi="Times New Roman" w:cs="Times New Roman"/>
+                <w:lang w:val="en-US"/>
+              </w:rPr>
+            </w:pPr>
+            <w:r>
+              <w:rPr>
+                <w:rFonts w:ascii="Times New Roman" w:hAnsi="Times New Roman" w:cs="Times New Roman"/>
+                <w:lang w:val="en-US"/>
+              </w:rPr>
+              <w:t>11.173</w:t>
+            </w:r>
+          </w:p>
+        </w:tc>
+        <w:tc>
+          <w:tcPr>
+            <w:tcW w:w="541" w:type="dxa"/>
+          </w:tcPr>
+          <w:p>
+            <w:pPr>
+              <w:rPr>
+                <w:rFonts w:ascii="Times New Roman" w:hAnsi="Times New Roman" w:cs="Times New Roman"/>
+                <w:lang w:val="en-US"/>
+              </w:rPr>
+            </w:pPr>
+            <w:r>
+              <w:rPr>
+                <w:rFonts w:ascii="Times New Roman" w:hAnsi="Times New Roman" w:cs="Times New Roman"/>
+                <w:lang w:val="en-US"/>
+              </w:rPr>
+              <w:t>35</w:t>
+            </w:r>
+          </w:p>
+        </w:tc>
+        <w:tc>
+          <w:tcPr>
+            <w:tcW w:w="711" w:type="dxa"/>
+          </w:tcPr>
+          <w:p>
+            <w:pPr>
+              <w:rPr>
+                <w:rFonts w:ascii="Times New Roman" w:hAnsi="Times New Roman" w:cs="Times New Roman"/>
+                <w:lang w:val="en-US"/>
+              </w:rPr>
+            </w:pPr>
+            <w:r>
+              <w:rPr>
+                <w:rFonts w:ascii="Times New Roman" w:hAnsi="Times New Roman" w:cs="Times New Roman"/>
+                <w:lang w:val="en-US"/>
+              </w:rPr>
+              <w:t>9.584</w:t>
+            </w:r>
+          </w:p>
+        </w:tc>
+        <w:tc>
+          <w:tcPr>
+            <w:tcW w:w="539" w:type="dxa"/>
+          </w:tcPr>
+          <w:p>
+            <w:pPr>
+              <w:rPr>
+                <w:rFonts w:ascii="Times New Roman" w:hAnsi="Times New Roman" w:cs="Times New Roman"/>
+                <w:lang w:val="en-US"/>
+              </w:rPr>
+            </w:pPr>
+            <w:r>
+              <w:rPr>
+                <w:rFonts w:ascii="Times New Roman" w:hAnsi="Times New Roman" w:cs="Times New Roman"/>
+                <w:lang w:val="en-US"/>
+              </w:rPr>
+              <w:t>96</w:t>
+            </w:r>
+          </w:p>
+        </w:tc>
+        <w:tc>
+          <w:tcPr>
+            <w:tcW w:w="711" w:type="dxa"/>
+          </w:tcPr>
+          <w:p>
+            <w:pPr>
+              <w:rPr>
+                <w:rFonts w:ascii="Times New Roman" w:hAnsi="Times New Roman" w:cs="Times New Roman"/>
+                <w:lang w:val="en-US"/>
+              </w:rPr>
+            </w:pPr>
+            <w:r>
+              <w:rPr>
+                <w:rFonts w:ascii="Times New Roman" w:hAnsi="Times New Roman" w:cs="Times New Roman"/>
+                <w:lang w:val="en-US"/>
+              </w:rPr>
+              <w:t>8.208</w:t>
+            </w:r>
+          </w:p>
+        </w:tc>
+        <w:tc>
+          <w:tcPr>
+            <w:tcW w:w="561" w:type="dxa"/>
+          </w:tcPr>
+          <w:p>
+            <w:pPr>
+              <w:rPr>
+                <w:rFonts w:ascii="Times New Roman" w:hAnsi="Times New Roman" w:cs="Times New Roman"/>
+                <w:lang w:val="en-US"/>
+              </w:rPr>
+            </w:pPr>
+            <w:r>
+              <w:rPr>
+                <w:rFonts w:ascii="Times New Roman" w:hAnsi="Times New Roman" w:cs="Times New Roman"/>
+                <w:lang w:val="en-US"/>
+              </w:rPr>
+              <w:t>164</w:t>
             </w:r>
           </w:p>
         </w:tc>
@@ -3900,7 +7000,7 @@
   <w:style w:type="paragraph" w:default="1" w:styleId="Normal">
     <w:name w:val="Normal"/>
     <w:qFormat/>
-    <w:rsid w:val="00CE1F83"/>
+    <w:rsid w:val="00331B8D"/>
   </w:style>
   <w:style w:type="paragraph" w:styleId="Heading1">
     <w:name w:val="heading 1"/>
@@ -3909,7 +7009,7 @@
     <w:link w:val="Heading1Char"/>
     <w:uiPriority w:val="9"/>
     <w:qFormat/>
-    <w:rsid w:val="001E1162"/>
+    <w:rsid w:val="0054115F"/>
     <w:pPr>
       <w:keepNext/>
       <w:keepLines/>
@@ -3917,7 +7017,8 @@
       <w:outlineLvl w:val="0"/>
     </w:pPr>
     <w:rPr>
-      <w:rFonts w:asciiTheme="majorHAnsi" w:eastAsiaTheme="majorEastAsia" w:hAnsiTheme="majorHAnsi" w:cstheme="majorBidi"/>
+      <w:rFonts w:ascii="Times New Roman" w:eastAsiaTheme="majorEastAsia" w:hAnsi="Times New Roman" w:cstheme="majorBidi"/>
+      <w:b/>
       <w:color w:val="2F5496" w:themeColor="accent1" w:themeShade="BF"/>
       <w:sz w:val="32"/>
       <w:szCs w:val="32"/>
@@ -4011,9 +7112,10 @@
     <w:basedOn w:val="DefaultParagraphFont"/>
     <w:link w:val="Heading1"/>
     <w:uiPriority w:val="9"/>
-    <w:rsid w:val="001E1162"/>
+    <w:rsid w:val="0054115F"/>
     <w:rPr>
-      <w:rFonts w:asciiTheme="majorHAnsi" w:eastAsiaTheme="majorEastAsia" w:hAnsiTheme="majorHAnsi" w:cstheme="majorBidi"/>
+      <w:rFonts w:ascii="Times New Roman" w:eastAsiaTheme="majorEastAsia" w:hAnsi="Times New Roman" w:cstheme="majorBidi"/>
+      <w:b/>
       <w:color w:val="2F5496" w:themeColor="accent1" w:themeShade="BF"/>
       <w:sz w:val="32"/>
       <w:szCs w:val="32"/>

</xml_diff>

<commit_message>
Almost done with part 3 of lab-2
</commit_message>
<xml_diff>
--- a/sem-4/v2/lab-2/lab-2.docx
+++ b/sem-4/v2/lab-2/lab-2.docx
@@ -268,23 +268,13 @@
           <w:szCs w:val="26"/>
         </w:rPr>
       </w:pPr>
-      <w:proofErr w:type="spellStart"/>
       <w:r>
         <w:rPr>
           <w:color w:val="000000"/>
           <w:sz w:val="26"/>
           <w:szCs w:val="26"/>
         </w:rPr>
-        <w:t>Бинеман</w:t>
-      </w:r>
-      <w:proofErr w:type="spellEnd"/>
-      <w:r>
-        <w:rPr>
-          <w:color w:val="000000"/>
-          <w:sz w:val="26"/>
-          <w:szCs w:val="26"/>
-        </w:rPr>
-        <w:t xml:space="preserve"> Никита Александрович</w:t>
+        <w:t>Бинеман Никита Александрович</w:t>
       </w:r>
     </w:p>
     <w:p>
@@ -816,7 +806,6 @@
                 <w:rFonts w:ascii="Times New Roman" w:hAnsi="Times New Roman" w:cs="Times New Roman"/>
               </w:rPr>
             </w:pPr>
-            <w:proofErr w:type="gramStart"/>
             <w:r>
               <w:rPr>
                 <w:rFonts w:ascii="Times New Roman" w:hAnsi="Times New Roman" w:cs="Times New Roman"/>
@@ -832,7 +821,6 @@
               </w:rPr>
               <w:t>m,or</w:t>
             </w:r>
-            <w:proofErr w:type="gramEnd"/>
             <w:r>
               <w:rPr>
                 <w:rFonts w:ascii="Times New Roman" w:hAnsi="Times New Roman" w:cs="Times New Roman"/>
@@ -1102,7 +1090,6 @@
               </w:rPr>
               <w:t>=</w:t>
             </w:r>
-            <w:proofErr w:type="gramStart"/>
             <w:r>
               <w:rPr>
                 <w:rFonts w:ascii="Times New Roman" w:hAnsi="Times New Roman" w:cs="Times New Roman"/>
@@ -1118,7 +1105,6 @@
               </w:rPr>
               <w:t>m,or</w:t>
             </w:r>
-            <w:proofErr w:type="gramEnd"/>
             <w:r>
               <w:rPr>
                 <w:rFonts w:ascii="Times New Roman" w:hAnsi="Times New Roman" w:cs="Times New Roman"/>
@@ -4800,13 +4786,7 @@
           <w:rFonts w:ascii="Times New Roman" w:hAnsi="Times New Roman" w:cs="Times New Roman"/>
         </w:rPr>
         <w:lastRenderedPageBreak/>
-        <w:t>Двух</w:t>
-      </w:r>
-      <w:r>
-        <w:rPr>
-          <w:rFonts w:ascii="Times New Roman" w:hAnsi="Times New Roman" w:cs="Times New Roman"/>
-        </w:rPr>
-        <w:t>полупериодный – без фильтра</w:t>
+        <w:t>Двухполупериодный – без фильтра</w:t>
       </w:r>
       <w:r>
         <w:rPr>
@@ -4908,13 +4888,7 @@
           <w:rFonts w:ascii="Times New Roman" w:hAnsi="Times New Roman" w:cs="Times New Roman"/>
         </w:rPr>
         <w:lastRenderedPageBreak/>
-        <w:t>Двух</w:t>
-      </w:r>
-      <w:r>
-        <w:rPr>
-          <w:rFonts w:ascii="Times New Roman" w:hAnsi="Times New Roman" w:cs="Times New Roman"/>
-        </w:rPr>
-        <w:t>полупериодный</w:t>
+        <w:t>Двухполупериодный</w:t>
       </w:r>
       <w:r>
         <w:rPr>
@@ -4939,13 +4913,7 @@
         <w:rPr>
           <w:rFonts w:ascii="Times New Roman" w:hAnsi="Times New Roman" w:cs="Times New Roman"/>
         </w:rPr>
-        <w:t>-</w:t>
-      </w:r>
-      <w:r>
-        <w:rPr>
-          <w:rFonts w:ascii="Times New Roman" w:hAnsi="Times New Roman" w:cs="Times New Roman"/>
-        </w:rPr>
-        <w:t>фильтром</w:t>
+        <w:t>-фильтром</w:t>
       </w:r>
       <w:r>
         <w:rPr>
@@ -4995,6 +4963,7 @@
       </w:r>
       <w:r>
         <w:rPr>
+          <w:rFonts w:ascii="Times New Roman" w:hAnsi="Times New Roman" w:cs="Times New Roman"/>
           <w:noProof/>
         </w:rPr>
         <w:t xml:space="preserve"> </w:t>
@@ -5043,6 +5012,7 @@
     <w:p>
       <w:pPr>
         <w:rPr>
+          <w:rFonts w:ascii="Times New Roman" w:hAnsi="Times New Roman" w:cs="Times New Roman"/>
           <w:noProof/>
           <w:lang w:val="en-US"/>
         </w:rPr>
@@ -5052,13 +5022,7 @@
           <w:rFonts w:ascii="Times New Roman" w:hAnsi="Times New Roman" w:cs="Times New Roman"/>
         </w:rPr>
         <w:lastRenderedPageBreak/>
-        <w:t>Двух</w:t>
-      </w:r>
-      <w:r>
-        <w:rPr>
-          <w:rFonts w:ascii="Times New Roman" w:hAnsi="Times New Roman" w:cs="Times New Roman"/>
-        </w:rPr>
-        <w:t xml:space="preserve">полупериодный – с </w:t>
+        <w:t xml:space="preserve">Двухполупериодный – с </w:t>
       </w:r>
       <w:r>
         <w:rPr>
@@ -5071,13 +5035,7 @@
         <w:rPr>
           <w:rFonts w:ascii="Times New Roman" w:hAnsi="Times New Roman" w:cs="Times New Roman"/>
         </w:rPr>
-        <w:t>-</w:t>
-      </w:r>
-      <w:r>
-        <w:rPr>
-          <w:rFonts w:ascii="Times New Roman" w:hAnsi="Times New Roman" w:cs="Times New Roman"/>
-        </w:rPr>
-        <w:t>фильтром</w:t>
+        <w:t>-фильтром</w:t>
       </w:r>
       <w:r>
         <w:rPr>
@@ -5087,6 +5045,7 @@
       </w:r>
       <w:r>
         <w:rPr>
+          <w:rFonts w:ascii="Times New Roman" w:hAnsi="Times New Roman" w:cs="Times New Roman"/>
           <w:noProof/>
         </w:rPr>
         <w:t xml:space="preserve"> </w:t>
@@ -5133,6 +5092,7 @@
       </w:r>
       <w:r>
         <w:rPr>
+          <w:rFonts w:ascii="Times New Roman" w:hAnsi="Times New Roman" w:cs="Times New Roman"/>
           <w:noProof/>
         </w:rPr>
         <w:drawing>
@@ -5841,13 +5801,7 @@
               <w:rPr>
                 <w:rFonts w:ascii="Times New Roman" w:hAnsi="Times New Roman" w:cs="Times New Roman"/>
               </w:rPr>
-              <w:t>Двух</w:t>
-            </w:r>
-            <w:r>
-              <w:rPr>
-                <w:rFonts w:ascii="Times New Roman" w:hAnsi="Times New Roman" w:cs="Times New Roman"/>
-              </w:rPr>
-              <w:t>полупериодный – без фильтра</w:t>
+              <w:t>Двухполупериодный – без фильтра</w:t>
             </w:r>
           </w:p>
         </w:tc>
@@ -5865,13 +5819,7 @@
               <w:rPr>
                 <w:rFonts w:ascii="Times New Roman" w:hAnsi="Times New Roman" w:cs="Times New Roman"/>
               </w:rPr>
-              <w:t>Ключ</w:t>
-            </w:r>
-            <w:r>
-              <w:rPr>
-                <w:rFonts w:ascii="Times New Roman" w:hAnsi="Times New Roman" w:cs="Times New Roman"/>
-              </w:rPr>
-              <w:t xml:space="preserve">и </w:t>
+              <w:t xml:space="preserve">Ключи </w:t>
             </w:r>
             <w:r>
               <w:rPr>
@@ -5886,13 +5834,7 @@
               <w:rPr>
                 <w:rFonts w:ascii="Times New Roman" w:hAnsi="Times New Roman" w:cs="Times New Roman"/>
               </w:rPr>
-              <w:t xml:space="preserve"> и</w:t>
-            </w:r>
-            <w:r>
-              <w:rPr>
-                <w:rFonts w:ascii="Times New Roman" w:hAnsi="Times New Roman" w:cs="Times New Roman"/>
-              </w:rPr>
-              <w:t xml:space="preserve"> </w:t>
+              <w:t xml:space="preserve"> и </w:t>
             </w:r>
             <w:r>
               <w:rPr>
@@ -5907,25 +5849,7 @@
               <w:rPr>
                 <w:rFonts w:ascii="Times New Roman" w:hAnsi="Times New Roman" w:cs="Times New Roman"/>
               </w:rPr>
-              <w:t xml:space="preserve"> замкнут</w:t>
-            </w:r>
-            <w:r>
-              <w:rPr>
-                <w:rFonts w:ascii="Times New Roman" w:hAnsi="Times New Roman" w:cs="Times New Roman"/>
-              </w:rPr>
-              <w:t>ы</w:t>
-            </w:r>
-            <w:r>
-              <w:rPr>
-                <w:rFonts w:ascii="Times New Roman" w:hAnsi="Times New Roman" w:cs="Times New Roman"/>
-              </w:rPr>
-              <w:t>; ключи</w:t>
-            </w:r>
-            <w:r>
-              <w:rPr>
-                <w:rFonts w:ascii="Times New Roman" w:hAnsi="Times New Roman" w:cs="Times New Roman"/>
-              </w:rPr>
-              <w:t xml:space="preserve"> </w:t>
+              <w:t xml:space="preserve"> замкнуты; ключи </w:t>
             </w:r>
             <w:r>
               <w:rPr>
@@ -6217,13 +6141,7 @@
               <w:rPr>
                 <w:rFonts w:ascii="Times New Roman" w:hAnsi="Times New Roman" w:cs="Times New Roman"/>
               </w:rPr>
-              <w:t>Ключ</w:t>
-            </w:r>
-            <w:r>
-              <w:rPr>
-                <w:rFonts w:ascii="Times New Roman" w:hAnsi="Times New Roman" w:cs="Times New Roman"/>
-              </w:rPr>
-              <w:t xml:space="preserve"> </w:t>
+              <w:t xml:space="preserve">Ключ </w:t>
             </w:r>
             <w:r>
               <w:rPr>
@@ -6492,6 +6410,1241 @@
       <w:pPr>
         <w:rPr>
           <w:rFonts w:ascii="Times New Roman" w:hAnsi="Times New Roman" w:cs="Times New Roman"/>
+          <w:lang w:val="en-US"/>
+        </w:rPr>
+      </w:pPr>
+      <w:r>
+        <w:rPr>
+          <w:rFonts w:ascii="Times New Roman" w:hAnsi="Times New Roman" w:cs="Times New Roman"/>
+          <w:noProof/>
+        </w:rPr>
+        <w:lastRenderedPageBreak/>
+        <w:drawing>
+          <wp:inline distT="0" distB="0" distL="0" distR="0" wp14:anchorId="3F772640" wp14:editId="59034349">
+            <wp:extent cx="2194750" cy="4968671"/>
+            <wp:effectExtent l="0" t="0" r="0" b="3810"/>
+            <wp:docPr id="1722751441" name="Picture 1"/>
+            <wp:cNvGraphicFramePr>
+              <a:graphicFrameLocks xmlns:a="http://schemas.openxmlformats.org/drawingml/2006/main" noChangeAspect="1"/>
+            </wp:cNvGraphicFramePr>
+            <a:graphic xmlns:a="http://schemas.openxmlformats.org/drawingml/2006/main">
+              <a:graphicData uri="http://schemas.openxmlformats.org/drawingml/2006/picture">
+                <pic:pic xmlns:pic="http://schemas.openxmlformats.org/drawingml/2006/picture">
+                  <pic:nvPicPr>
+                    <pic:cNvPr id="1722751441" name=""/>
+                    <pic:cNvPicPr/>
+                  </pic:nvPicPr>
+                  <pic:blipFill>
+                    <a:blip r:embed="rId21"/>
+                    <a:stretch>
+                      <a:fillRect/>
+                    </a:stretch>
+                  </pic:blipFill>
+                  <pic:spPr>
+                    <a:xfrm>
+                      <a:off x="0" y="0"/>
+                      <a:ext cx="2194750" cy="4968671"/>
+                    </a:xfrm>
+                    <a:prstGeom prst="rect">
+                      <a:avLst/>
+                    </a:prstGeom>
+                  </pic:spPr>
+                </pic:pic>
+              </a:graphicData>
+            </a:graphic>
+          </wp:inline>
+        </w:drawing>
+      </w:r>
+      <w:r>
+        <w:rPr>
+          <w:rFonts w:ascii="Times New Roman" w:hAnsi="Times New Roman" w:cs="Times New Roman"/>
+          <w:noProof/>
+        </w:rPr>
+        <w:t xml:space="preserve"> </w:t>
+      </w:r>
+      <w:r>
+        <w:rPr>
+          <w:rFonts w:ascii="Times New Roman" w:hAnsi="Times New Roman" w:cs="Times New Roman"/>
+          <w:noProof/>
+        </w:rPr>
+        <w:drawing>
+          <wp:inline distT="0" distB="0" distL="0" distR="0" wp14:anchorId="0010AEE0" wp14:editId="0EF6AA4F">
+            <wp:extent cx="2709785" cy="4991100"/>
+            <wp:effectExtent l="0" t="0" r="0" b="0"/>
+            <wp:docPr id="850183168" name="Picture 1"/>
+            <wp:cNvGraphicFramePr>
+              <a:graphicFrameLocks xmlns:a="http://schemas.openxmlformats.org/drawingml/2006/main" noChangeAspect="1"/>
+            </wp:cNvGraphicFramePr>
+            <a:graphic xmlns:a="http://schemas.openxmlformats.org/drawingml/2006/main">
+              <a:graphicData uri="http://schemas.openxmlformats.org/drawingml/2006/picture">
+                <pic:pic xmlns:pic="http://schemas.openxmlformats.org/drawingml/2006/picture">
+                  <pic:nvPicPr>
+                    <pic:cNvPr id="850183168" name=""/>
+                    <pic:cNvPicPr/>
+                  </pic:nvPicPr>
+                  <pic:blipFill>
+                    <a:blip r:embed="rId22"/>
+                    <a:stretch>
+                      <a:fillRect/>
+                    </a:stretch>
+                  </pic:blipFill>
+                  <pic:spPr>
+                    <a:xfrm>
+                      <a:off x="0" y="0"/>
+                      <a:ext cx="2714337" cy="4999485"/>
+                    </a:xfrm>
+                    <a:prstGeom prst="rect">
+                      <a:avLst/>
+                    </a:prstGeom>
+                  </pic:spPr>
+                </pic:pic>
+              </a:graphicData>
+            </a:graphic>
+          </wp:inline>
+        </w:drawing>
+      </w:r>
+    </w:p>
+    <w:p>
+      <w:pPr>
+        <w:pStyle w:val="Heading1"/>
+        <w:rPr>
+          <w:rFonts w:cs="Times New Roman"/>
+        </w:rPr>
+      </w:pPr>
+      <w:r>
+        <w:rPr>
+          <w:rFonts w:cs="Times New Roman"/>
+        </w:rPr>
+        <w:t>Задание 3</w:t>
+      </w:r>
+    </w:p>
+    <w:p>
+      <w:pPr>
+        <w:rPr>
+          <w:rFonts w:ascii="Times New Roman" w:hAnsi="Times New Roman" w:cs="Times New Roman"/>
+          <w:lang w:val="en-US"/>
+        </w:rPr>
+      </w:pPr>
+      <w:r>
+        <w:rPr>
+          <w:rFonts w:ascii="Times New Roman" w:hAnsi="Times New Roman" w:cs="Times New Roman"/>
+        </w:rPr>
+        <w:drawing>
+          <wp:inline distT="0" distB="0" distL="0" distR="0" wp14:anchorId="7C1BE51D" wp14:editId="72DDB356">
+            <wp:extent cx="6912610" cy="2835910"/>
+            <wp:effectExtent l="0" t="0" r="2540" b="2540"/>
+            <wp:docPr id="735074959" name="Picture 1"/>
+            <wp:cNvGraphicFramePr>
+              <a:graphicFrameLocks xmlns:a="http://schemas.openxmlformats.org/drawingml/2006/main" noChangeAspect="1"/>
+            </wp:cNvGraphicFramePr>
+            <a:graphic xmlns:a="http://schemas.openxmlformats.org/drawingml/2006/main">
+              <a:graphicData uri="http://schemas.openxmlformats.org/drawingml/2006/picture">
+                <pic:pic xmlns:pic="http://schemas.openxmlformats.org/drawingml/2006/picture">
+                  <pic:nvPicPr>
+                    <pic:cNvPr id="735074959" name=""/>
+                    <pic:cNvPicPr/>
+                  </pic:nvPicPr>
+                  <pic:blipFill>
+                    <a:blip r:embed="rId23"/>
+                    <a:stretch>
+                      <a:fillRect/>
+                    </a:stretch>
+                  </pic:blipFill>
+                  <pic:spPr>
+                    <a:xfrm>
+                      <a:off x="0" y="0"/>
+                      <a:ext cx="6912610" cy="2835910"/>
+                    </a:xfrm>
+                    <a:prstGeom prst="rect">
+                      <a:avLst/>
+                    </a:prstGeom>
+                  </pic:spPr>
+                </pic:pic>
+              </a:graphicData>
+            </a:graphic>
+          </wp:inline>
+        </w:drawing>
+      </w:r>
+    </w:p>
+    <w:p>
+      <w:pPr>
+        <w:spacing w:line="256" w:lineRule="auto"/>
+        <w:rPr>
+          <w:rFonts w:ascii="Times New Roman" w:eastAsia="Calibri" w:hAnsi="Times New Roman" w:cs="Times New Roman"/>
+          <w:sz w:val="28"/>
+          <w:szCs w:val="28"/>
+        </w:rPr>
+      </w:pPr>
+      <w:r>
+        <w:rPr>
+          <w:rFonts w:ascii="Times New Roman" w:eastAsia="Calibri" w:hAnsi="Times New Roman" w:cs="Times New Roman"/>
+          <w:sz w:val="28"/>
+          <w:szCs w:val="28"/>
+        </w:rPr>
+        <w:t>Однополупериодный управляемы выпрямитель:</w:t>
+      </w:r>
+    </w:p>
+    <w:tbl>
+      <w:tblPr>
+        <w:tblStyle w:val="TableGrid"/>
+        <w:tblW w:w="11079" w:type="dxa"/>
+        <w:tblLook w:val="04A0" w:firstRow="1" w:lastRow="0" w:firstColumn="1" w:lastColumn="0" w:noHBand="0" w:noVBand="1"/>
+      </w:tblPr>
+      <w:tblGrid>
+        <w:gridCol w:w="1696"/>
+        <w:gridCol w:w="1468"/>
+        <w:gridCol w:w="1583"/>
+        <w:gridCol w:w="1583"/>
+        <w:gridCol w:w="1583"/>
+        <w:gridCol w:w="1583"/>
+        <w:gridCol w:w="1583"/>
+      </w:tblGrid>
+      <w:tr>
+        <w:trPr>
+          <w:trHeight w:val="809"/>
+        </w:trPr>
+        <w:tc>
+          <w:tcPr>
+            <w:tcW w:w="1696" w:type="dxa"/>
+          </w:tcPr>
+          <w:p>
+            <w:pPr>
+              <w:rPr>
+                <w:rFonts w:ascii="Times New Roman" w:hAnsi="Times New Roman" w:cs="Times New Roman"/>
+              </w:rPr>
+            </w:pPr>
+            <w:r>
+              <w:rPr>
+                <w:rFonts w:ascii="Times New Roman" w:hAnsi="Times New Roman" w:cs="Times New Roman"/>
+              </w:rPr>
+              <w:t>Время задержки</w:t>
+            </w:r>
+            <w:r>
+              <w:rPr>
+                <w:rFonts w:ascii="Times New Roman" w:hAnsi="Times New Roman" w:cs="Times New Roman"/>
+              </w:rPr>
+              <w:t xml:space="preserve"> t</w:t>
+            </w:r>
+            <w:r>
+              <w:rPr>
+                <w:rFonts w:ascii="Times New Roman" w:hAnsi="Times New Roman" w:cs="Times New Roman"/>
+                <w:vertAlign w:val="subscript"/>
+                <w:lang w:val="en-US"/>
+              </w:rPr>
+              <w:t>3</w:t>
+            </w:r>
+            <w:r>
+              <w:rPr>
+                <w:rFonts w:ascii="Times New Roman" w:hAnsi="Times New Roman" w:cs="Times New Roman"/>
+                <w:lang w:val="en-US"/>
+              </w:rPr>
+              <w:t xml:space="preserve">, </w:t>
+            </w:r>
+            <w:r>
+              <w:rPr>
+                <w:rFonts w:ascii="Times New Roman" w:hAnsi="Times New Roman" w:cs="Times New Roman"/>
+              </w:rPr>
+              <w:t>мс</w:t>
+            </w:r>
+          </w:p>
+        </w:tc>
+        <w:tc>
+          <w:tcPr>
+            <w:tcW w:w="1468" w:type="dxa"/>
+          </w:tcPr>
+          <w:p>
+            <w:pPr>
+              <w:rPr>
+                <w:rFonts w:ascii="Times New Roman" w:hAnsi="Times New Roman" w:cs="Times New Roman"/>
+                <w:lang w:val="en-US"/>
+              </w:rPr>
+            </w:pPr>
+            <w:r>
+              <w:rPr>
+                <w:rFonts w:ascii="Times New Roman" w:hAnsi="Times New Roman" w:cs="Times New Roman"/>
+              </w:rPr>
+              <w:t>0.2</w:t>
+            </w:r>
+          </w:p>
+        </w:tc>
+        <w:tc>
+          <w:tcPr>
+            <w:tcW w:w="1583" w:type="dxa"/>
+          </w:tcPr>
+          <w:p>
+            <w:pPr>
+              <w:rPr>
+                <w:rFonts w:ascii="Times New Roman" w:hAnsi="Times New Roman" w:cs="Times New Roman"/>
+                <w:lang w:val="en-US"/>
+              </w:rPr>
+            </w:pPr>
+            <w:r>
+              <w:rPr>
+                <w:rFonts w:ascii="Times New Roman" w:hAnsi="Times New Roman" w:cs="Times New Roman"/>
+                <w:lang w:val="en-US"/>
+              </w:rPr>
+              <w:t>2</w:t>
+            </w:r>
+          </w:p>
+        </w:tc>
+        <w:tc>
+          <w:tcPr>
+            <w:tcW w:w="1583" w:type="dxa"/>
+          </w:tcPr>
+          <w:p>
+            <w:pPr>
+              <w:rPr>
+                <w:rFonts w:ascii="Times New Roman" w:hAnsi="Times New Roman" w:cs="Times New Roman"/>
+                <w:lang w:val="en-US"/>
+              </w:rPr>
+            </w:pPr>
+            <w:r>
+              <w:rPr>
+                <w:rFonts w:ascii="Times New Roman" w:hAnsi="Times New Roman" w:cs="Times New Roman"/>
+                <w:lang w:val="en-US"/>
+              </w:rPr>
+              <w:t>4</w:t>
+            </w:r>
+          </w:p>
+        </w:tc>
+        <w:tc>
+          <w:tcPr>
+            <w:tcW w:w="1583" w:type="dxa"/>
+          </w:tcPr>
+          <w:p>
+            <w:pPr>
+              <w:rPr>
+                <w:rFonts w:ascii="Times New Roman" w:hAnsi="Times New Roman" w:cs="Times New Roman"/>
+                <w:lang w:val="en-US"/>
+              </w:rPr>
+            </w:pPr>
+            <w:r>
+              <w:rPr>
+                <w:rFonts w:ascii="Times New Roman" w:hAnsi="Times New Roman" w:cs="Times New Roman"/>
+                <w:lang w:val="en-US"/>
+              </w:rPr>
+              <w:t>6</w:t>
+            </w:r>
+          </w:p>
+        </w:tc>
+        <w:tc>
+          <w:tcPr>
+            <w:tcW w:w="1583" w:type="dxa"/>
+          </w:tcPr>
+          <w:p>
+            <w:pPr>
+              <w:rPr>
+                <w:rFonts w:ascii="Times New Roman" w:hAnsi="Times New Roman" w:cs="Times New Roman"/>
+                <w:lang w:val="en-US"/>
+              </w:rPr>
+            </w:pPr>
+            <w:r>
+              <w:rPr>
+                <w:rFonts w:ascii="Times New Roman" w:hAnsi="Times New Roman" w:cs="Times New Roman"/>
+                <w:lang w:val="en-US"/>
+              </w:rPr>
+              <w:t>8</w:t>
+            </w:r>
+          </w:p>
+        </w:tc>
+        <w:tc>
+          <w:tcPr>
+            <w:tcW w:w="1583" w:type="dxa"/>
+          </w:tcPr>
+          <w:p>
+            <w:pPr>
+              <w:rPr>
+                <w:rFonts w:ascii="Times New Roman" w:hAnsi="Times New Roman" w:cs="Times New Roman"/>
+                <w:lang w:val="en-US"/>
+              </w:rPr>
+            </w:pPr>
+            <w:r>
+              <w:rPr>
+                <w:rFonts w:ascii="Times New Roman" w:hAnsi="Times New Roman" w:cs="Times New Roman"/>
+                <w:lang w:val="en-US"/>
+              </w:rPr>
+              <w:t>10</w:t>
+            </w:r>
+          </w:p>
+        </w:tc>
+      </w:tr>
+      <w:tr>
+        <w:trPr>
+          <w:trHeight w:val="898"/>
+        </w:trPr>
+        <w:tc>
+          <w:tcPr>
+            <w:tcW w:w="1696" w:type="dxa"/>
+          </w:tcPr>
+          <w:p>
+            <w:pPr>
+              <w:rPr>
+                <w:rFonts w:ascii="Times New Roman" w:hAnsi="Times New Roman" w:cs="Times New Roman"/>
+              </w:rPr>
+            </w:pPr>
+            <w:r>
+              <w:rPr>
+                <w:rFonts w:ascii="Times New Roman" w:hAnsi="Times New Roman" w:cs="Times New Roman"/>
+              </w:rPr>
+              <w:t>Ток нагрузки</w:t>
+            </w:r>
+            <w:r>
+              <w:rPr>
+                <w:rFonts w:ascii="Times New Roman" w:hAnsi="Times New Roman" w:cs="Times New Roman"/>
+              </w:rPr>
+              <w:t xml:space="preserve"> </w:t>
+            </w:r>
+            <w:r>
+              <w:rPr>
+                <w:rFonts w:ascii="Times New Roman" w:hAnsi="Times New Roman" w:cs="Times New Roman"/>
+                <w:lang w:val="en-US"/>
+              </w:rPr>
+              <w:t>I</w:t>
+            </w:r>
+            <w:r>
+              <w:rPr>
+                <w:rFonts w:ascii="Times New Roman" w:hAnsi="Times New Roman" w:cs="Times New Roman"/>
+                <w:vertAlign w:val="subscript"/>
+              </w:rPr>
+              <w:t>ср</w:t>
+            </w:r>
+            <w:r>
+              <w:rPr>
+                <w:rFonts w:ascii="Times New Roman" w:hAnsi="Times New Roman" w:cs="Times New Roman"/>
+              </w:rPr>
+              <w:t>, мА</w:t>
+            </w:r>
+          </w:p>
+        </w:tc>
+        <w:tc>
+          <w:tcPr>
+            <w:tcW w:w="1468" w:type="dxa"/>
+          </w:tcPr>
+          <w:p>
+            <w:pPr>
+              <w:rPr>
+                <w:rFonts w:ascii="Times New Roman" w:hAnsi="Times New Roman" w:cs="Times New Roman"/>
+              </w:rPr>
+            </w:pPr>
+            <w:r>
+              <w:rPr>
+                <w:rFonts w:ascii="Times New Roman" w:hAnsi="Times New Roman" w:cs="Times New Roman"/>
+              </w:rPr>
+              <w:t>993</w:t>
+            </w:r>
+          </w:p>
+        </w:tc>
+        <w:tc>
+          <w:tcPr>
+            <w:tcW w:w="1583" w:type="dxa"/>
+          </w:tcPr>
+          <w:p>
+            <w:pPr>
+              <w:rPr>
+                <w:rFonts w:ascii="Times New Roman" w:hAnsi="Times New Roman" w:cs="Times New Roman"/>
+              </w:rPr>
+            </w:pPr>
+            <w:r>
+              <w:rPr>
+                <w:rFonts w:ascii="Times New Roman" w:hAnsi="Times New Roman" w:cs="Times New Roman"/>
+              </w:rPr>
+              <w:t>902</w:t>
+            </w:r>
+          </w:p>
+        </w:tc>
+        <w:tc>
+          <w:tcPr>
+            <w:tcW w:w="1583" w:type="dxa"/>
+          </w:tcPr>
+          <w:p>
+            <w:pPr>
+              <w:rPr>
+                <w:rFonts w:ascii="Times New Roman" w:hAnsi="Times New Roman" w:cs="Times New Roman"/>
+              </w:rPr>
+            </w:pPr>
+            <w:r>
+              <w:rPr>
+                <w:rFonts w:ascii="Times New Roman" w:hAnsi="Times New Roman" w:cs="Times New Roman"/>
+              </w:rPr>
+              <w:t>1302</w:t>
+            </w:r>
+          </w:p>
+        </w:tc>
+        <w:tc>
+          <w:tcPr>
+            <w:tcW w:w="1583" w:type="dxa"/>
+          </w:tcPr>
+          <w:p>
+            <w:pPr>
+              <w:rPr>
+                <w:rFonts w:ascii="Times New Roman" w:hAnsi="Times New Roman" w:cs="Times New Roman"/>
+              </w:rPr>
+            </w:pPr>
+            <w:r>
+              <w:rPr>
+                <w:rFonts w:ascii="Times New Roman" w:hAnsi="Times New Roman" w:cs="Times New Roman"/>
+              </w:rPr>
+              <w:t>685</w:t>
+            </w:r>
+          </w:p>
+        </w:tc>
+        <w:tc>
+          <w:tcPr>
+            <w:tcW w:w="1583" w:type="dxa"/>
+          </w:tcPr>
+          <w:p>
+            <w:pPr>
+              <w:rPr>
+                <w:rFonts w:ascii="Times New Roman" w:hAnsi="Times New Roman" w:cs="Times New Roman"/>
+              </w:rPr>
+            </w:pPr>
+            <w:r>
+              <w:rPr>
+                <w:rFonts w:ascii="Times New Roman" w:hAnsi="Times New Roman" w:cs="Times New Roman"/>
+              </w:rPr>
+              <w:t>92</w:t>
+            </w:r>
+          </w:p>
+        </w:tc>
+        <w:tc>
+          <w:tcPr>
+            <w:tcW w:w="1583" w:type="dxa"/>
+          </w:tcPr>
+          <w:p>
+            <w:pPr>
+              <w:rPr>
+                <w:rFonts w:ascii="Times New Roman" w:hAnsi="Times New Roman" w:cs="Times New Roman"/>
+              </w:rPr>
+            </w:pPr>
+            <w:r>
+              <w:rPr>
+                <w:rFonts w:ascii="Times New Roman" w:hAnsi="Times New Roman" w:cs="Times New Roman"/>
+              </w:rPr>
+              <w:t>31</w:t>
+            </w:r>
+          </w:p>
+        </w:tc>
+      </w:tr>
+    </w:tbl>
+    <w:p>
+      <w:pPr>
+        <w:rPr>
+          <w:rFonts w:ascii="Times New Roman" w:hAnsi="Times New Roman" w:cs="Times New Roman"/>
+        </w:rPr>
+      </w:pPr>
+    </w:p>
+    <w:p>
+      <w:pPr>
+        <w:rPr>
+          <w:rFonts w:ascii="Times New Roman" w:hAnsi="Times New Roman" w:cs="Times New Roman"/>
+        </w:rPr>
+      </w:pPr>
+      <w:r>
+        <w:rPr>
+          <w:rFonts w:ascii="Times New Roman" w:hAnsi="Times New Roman" w:cs="Times New Roman"/>
+          <w:lang w:val="en-US"/>
+        </w:rPr>
+        <w:lastRenderedPageBreak/>
+        <w:t>t</w:t>
+      </w:r>
+      <w:r>
+        <w:rPr>
+          <w:rFonts w:ascii="Times New Roman" w:hAnsi="Times New Roman" w:cs="Times New Roman"/>
+          <w:vertAlign w:val="subscript"/>
+          <w:lang w:val="en-US"/>
+        </w:rPr>
+        <w:t>3</w:t>
+      </w:r>
+      <w:r>
+        <w:rPr>
+          <w:rFonts w:ascii="Times New Roman" w:hAnsi="Times New Roman" w:cs="Times New Roman"/>
+          <w:lang w:val="en-US"/>
+        </w:rPr>
+        <w:t xml:space="preserve"> = </w:t>
+      </w:r>
+      <w:r>
+        <w:rPr>
+          <w:rFonts w:ascii="Times New Roman" w:hAnsi="Times New Roman" w:cs="Times New Roman"/>
+        </w:rPr>
+        <w:t>4 мс</w:t>
+      </w:r>
+    </w:p>
+    <w:p>
+      <w:pPr>
+        <w:rPr>
+          <w:rFonts w:ascii="Times New Roman" w:hAnsi="Times New Roman" w:cs="Times New Roman"/>
+        </w:rPr>
+      </w:pPr>
+      <w:r>
+        <w:rPr>
+          <w:rFonts w:ascii="Times New Roman" w:hAnsi="Times New Roman" w:cs="Times New Roman"/>
+        </w:rPr>
+        <w:drawing>
+          <wp:inline distT="0" distB="0" distL="0" distR="0" wp14:anchorId="59F3830D" wp14:editId="6DF7710C">
+            <wp:extent cx="5582429" cy="4277322"/>
+            <wp:effectExtent l="0" t="0" r="0" b="9525"/>
+            <wp:docPr id="82413615" name="Picture 1"/>
+            <wp:cNvGraphicFramePr>
+              <a:graphicFrameLocks xmlns:a="http://schemas.openxmlformats.org/drawingml/2006/main" noChangeAspect="1"/>
+            </wp:cNvGraphicFramePr>
+            <a:graphic xmlns:a="http://schemas.openxmlformats.org/drawingml/2006/main">
+              <a:graphicData uri="http://schemas.openxmlformats.org/drawingml/2006/picture">
+                <pic:pic xmlns:pic="http://schemas.openxmlformats.org/drawingml/2006/picture">
+                  <pic:nvPicPr>
+                    <pic:cNvPr id="82413615" name=""/>
+                    <pic:cNvPicPr/>
+                  </pic:nvPicPr>
+                  <pic:blipFill>
+                    <a:blip r:embed="rId24"/>
+                    <a:stretch>
+                      <a:fillRect/>
+                    </a:stretch>
+                  </pic:blipFill>
+                  <pic:spPr>
+                    <a:xfrm>
+                      <a:off x="0" y="0"/>
+                      <a:ext cx="5582429" cy="4277322"/>
+                    </a:xfrm>
+                    <a:prstGeom prst="rect">
+                      <a:avLst/>
+                    </a:prstGeom>
+                  </pic:spPr>
+                </pic:pic>
+              </a:graphicData>
+            </a:graphic>
+          </wp:inline>
+        </w:drawing>
+      </w:r>
+    </w:p>
+    <w:p>
+      <w:pPr>
+        <w:rPr>
+          <w:rFonts w:ascii="Times New Roman" w:hAnsi="Times New Roman" w:cs="Times New Roman"/>
+        </w:rPr>
+      </w:pPr>
+      <w:r>
+        <w:rPr>
+          <w:rFonts w:ascii="Times New Roman" w:hAnsi="Times New Roman" w:cs="Times New Roman"/>
+          <w:lang w:val="en-US"/>
+        </w:rPr>
+        <w:t>t</w:t>
+      </w:r>
+      <w:r>
+        <w:rPr>
+          <w:rFonts w:ascii="Times New Roman" w:hAnsi="Times New Roman" w:cs="Times New Roman"/>
+          <w:vertAlign w:val="subscript"/>
+          <w:lang w:val="en-US"/>
+        </w:rPr>
+        <w:t>3</w:t>
+      </w:r>
+      <w:r>
+        <w:rPr>
+          <w:rFonts w:ascii="Times New Roman" w:hAnsi="Times New Roman" w:cs="Times New Roman"/>
+          <w:lang w:val="en-US"/>
+        </w:rPr>
+        <w:t xml:space="preserve"> = </w:t>
+      </w:r>
+      <w:r>
+        <w:rPr>
+          <w:rFonts w:ascii="Times New Roman" w:hAnsi="Times New Roman" w:cs="Times New Roman"/>
+        </w:rPr>
+        <w:t>8 мс</w:t>
+      </w:r>
+    </w:p>
+    <w:p>
+      <w:pPr>
+        <w:rPr>
+          <w:rFonts w:ascii="Times New Roman" w:hAnsi="Times New Roman" w:cs="Times New Roman"/>
+        </w:rPr>
+      </w:pPr>
+      <w:r>
+        <w:rPr>
+          <w:rFonts w:ascii="Times New Roman" w:hAnsi="Times New Roman" w:cs="Times New Roman"/>
+        </w:rPr>
+        <w:drawing>
+          <wp:inline distT="0" distB="0" distL="0" distR="0" wp14:anchorId="7C670449" wp14:editId="171C5F41">
+            <wp:extent cx="5715798" cy="4324954"/>
+            <wp:effectExtent l="0" t="0" r="0" b="0"/>
+            <wp:docPr id="1080647644" name="Picture 1"/>
+            <wp:cNvGraphicFramePr>
+              <a:graphicFrameLocks xmlns:a="http://schemas.openxmlformats.org/drawingml/2006/main" noChangeAspect="1"/>
+            </wp:cNvGraphicFramePr>
+            <a:graphic xmlns:a="http://schemas.openxmlformats.org/drawingml/2006/main">
+              <a:graphicData uri="http://schemas.openxmlformats.org/drawingml/2006/picture">
+                <pic:pic xmlns:pic="http://schemas.openxmlformats.org/drawingml/2006/picture">
+                  <pic:nvPicPr>
+                    <pic:cNvPr id="1080647644" name=""/>
+                    <pic:cNvPicPr/>
+                  </pic:nvPicPr>
+                  <pic:blipFill>
+                    <a:blip r:embed="rId25"/>
+                    <a:stretch>
+                      <a:fillRect/>
+                    </a:stretch>
+                  </pic:blipFill>
+                  <pic:spPr>
+                    <a:xfrm>
+                      <a:off x="0" y="0"/>
+                      <a:ext cx="5715798" cy="4324954"/>
+                    </a:xfrm>
+                    <a:prstGeom prst="rect">
+                      <a:avLst/>
+                    </a:prstGeom>
+                  </pic:spPr>
+                </pic:pic>
+              </a:graphicData>
+            </a:graphic>
+          </wp:inline>
+        </w:drawing>
+      </w:r>
+    </w:p>
+    <w:p>
+      <w:pPr>
+        <w:spacing w:line="256" w:lineRule="auto"/>
+        <w:rPr>
+          <w:rFonts w:ascii="Times New Roman" w:eastAsia="Calibri" w:hAnsi="Times New Roman" w:cs="Times New Roman"/>
+          <w:sz w:val="28"/>
+          <w:szCs w:val="28"/>
+        </w:rPr>
+      </w:pPr>
+      <w:r>
+        <w:rPr>
+          <w:rFonts w:ascii="Times New Roman" w:eastAsia="Calibri" w:hAnsi="Times New Roman" w:cs="Times New Roman"/>
+          <w:sz w:val="28"/>
+          <w:szCs w:val="28"/>
+        </w:rPr>
+        <w:t>Двух</w:t>
+      </w:r>
+      <w:r>
+        <w:rPr>
+          <w:rFonts w:ascii="Times New Roman" w:eastAsia="Calibri" w:hAnsi="Times New Roman" w:cs="Times New Roman"/>
+          <w:sz w:val="28"/>
+          <w:szCs w:val="28"/>
+        </w:rPr>
+        <w:t>полупериодный управляемы выпрямитель:</w:t>
+      </w:r>
+    </w:p>
+    <w:tbl>
+      <w:tblPr>
+        <w:tblStyle w:val="TableGrid"/>
+        <w:tblW w:w="11225" w:type="dxa"/>
+        <w:tblLook w:val="04A0" w:firstRow="1" w:lastRow="0" w:firstColumn="1" w:lastColumn="0" w:noHBand="0" w:noVBand="1"/>
+      </w:tblPr>
+      <w:tblGrid>
+        <w:gridCol w:w="1718"/>
+        <w:gridCol w:w="1487"/>
+        <w:gridCol w:w="1604"/>
+        <w:gridCol w:w="1604"/>
+        <w:gridCol w:w="1604"/>
+        <w:gridCol w:w="1604"/>
+        <w:gridCol w:w="1604"/>
+      </w:tblGrid>
+      <w:tr>
+        <w:trPr>
+          <w:trHeight w:val="607"/>
+        </w:trPr>
+        <w:tc>
+          <w:tcPr>
+            <w:tcW w:w="1718" w:type="dxa"/>
+          </w:tcPr>
+          <w:p>
+            <w:pPr>
+              <w:rPr>
+                <w:rFonts w:ascii="Times New Roman" w:hAnsi="Times New Roman" w:cs="Times New Roman"/>
+              </w:rPr>
+            </w:pPr>
+            <w:r>
+              <w:rPr>
+                <w:rFonts w:ascii="Times New Roman" w:hAnsi="Times New Roman" w:cs="Times New Roman"/>
+              </w:rPr>
+              <w:lastRenderedPageBreak/>
+              <w:t>Время задержки</w:t>
+            </w:r>
+            <w:r>
+              <w:rPr>
+                <w:rFonts w:ascii="Times New Roman" w:hAnsi="Times New Roman" w:cs="Times New Roman"/>
+              </w:rPr>
+              <w:t xml:space="preserve"> t</w:t>
+            </w:r>
+            <w:r>
+              <w:rPr>
+                <w:rFonts w:ascii="Times New Roman" w:hAnsi="Times New Roman" w:cs="Times New Roman"/>
+                <w:vertAlign w:val="subscript"/>
+                <w:lang w:val="en-US"/>
+              </w:rPr>
+              <w:t>3</w:t>
+            </w:r>
+            <w:r>
+              <w:rPr>
+                <w:rFonts w:ascii="Times New Roman" w:hAnsi="Times New Roman" w:cs="Times New Roman"/>
+                <w:lang w:val="en-US"/>
+              </w:rPr>
+              <w:t xml:space="preserve">, </w:t>
+            </w:r>
+            <w:r>
+              <w:rPr>
+                <w:rFonts w:ascii="Times New Roman" w:hAnsi="Times New Roman" w:cs="Times New Roman"/>
+              </w:rPr>
+              <w:t>мс</w:t>
+            </w:r>
+          </w:p>
+        </w:tc>
+        <w:tc>
+          <w:tcPr>
+            <w:tcW w:w="1487" w:type="dxa"/>
+          </w:tcPr>
+          <w:p>
+            <w:pPr>
+              <w:rPr>
+                <w:rFonts w:ascii="Times New Roman" w:hAnsi="Times New Roman" w:cs="Times New Roman"/>
+                <w:lang w:val="en-US"/>
+              </w:rPr>
+            </w:pPr>
+            <w:r>
+              <w:rPr>
+                <w:rFonts w:ascii="Times New Roman" w:hAnsi="Times New Roman" w:cs="Times New Roman"/>
+              </w:rPr>
+              <w:t>0.2</w:t>
+            </w:r>
+          </w:p>
+        </w:tc>
+        <w:tc>
+          <w:tcPr>
+            <w:tcW w:w="1604" w:type="dxa"/>
+          </w:tcPr>
+          <w:p>
+            <w:pPr>
+              <w:rPr>
+                <w:rFonts w:ascii="Times New Roman" w:hAnsi="Times New Roman" w:cs="Times New Roman"/>
+                <w:lang w:val="en-US"/>
+              </w:rPr>
+            </w:pPr>
+            <w:r>
+              <w:rPr>
+                <w:rFonts w:ascii="Times New Roman" w:hAnsi="Times New Roman" w:cs="Times New Roman"/>
+                <w:lang w:val="en-US"/>
+              </w:rPr>
+              <w:t>2</w:t>
+            </w:r>
+          </w:p>
+        </w:tc>
+        <w:tc>
+          <w:tcPr>
+            <w:tcW w:w="1604" w:type="dxa"/>
+          </w:tcPr>
+          <w:p>
+            <w:pPr>
+              <w:rPr>
+                <w:rFonts w:ascii="Times New Roman" w:hAnsi="Times New Roman" w:cs="Times New Roman"/>
+                <w:lang w:val="en-US"/>
+              </w:rPr>
+            </w:pPr>
+            <w:r>
+              <w:rPr>
+                <w:rFonts w:ascii="Times New Roman" w:hAnsi="Times New Roman" w:cs="Times New Roman"/>
+                <w:lang w:val="en-US"/>
+              </w:rPr>
+              <w:t>4</w:t>
+            </w:r>
+          </w:p>
+        </w:tc>
+        <w:tc>
+          <w:tcPr>
+            <w:tcW w:w="1604" w:type="dxa"/>
+          </w:tcPr>
+          <w:p>
+            <w:pPr>
+              <w:rPr>
+                <w:rFonts w:ascii="Times New Roman" w:hAnsi="Times New Roman" w:cs="Times New Roman"/>
+                <w:lang w:val="en-US"/>
+              </w:rPr>
+            </w:pPr>
+            <w:r>
+              <w:rPr>
+                <w:rFonts w:ascii="Times New Roman" w:hAnsi="Times New Roman" w:cs="Times New Roman"/>
+                <w:lang w:val="en-US"/>
+              </w:rPr>
+              <w:t>6</w:t>
+            </w:r>
+          </w:p>
+        </w:tc>
+        <w:tc>
+          <w:tcPr>
+            <w:tcW w:w="1604" w:type="dxa"/>
+          </w:tcPr>
+          <w:p>
+            <w:pPr>
+              <w:rPr>
+                <w:rFonts w:ascii="Times New Roman" w:hAnsi="Times New Roman" w:cs="Times New Roman"/>
+                <w:lang w:val="en-US"/>
+              </w:rPr>
+            </w:pPr>
+            <w:r>
+              <w:rPr>
+                <w:rFonts w:ascii="Times New Roman" w:hAnsi="Times New Roman" w:cs="Times New Roman"/>
+                <w:lang w:val="en-US"/>
+              </w:rPr>
+              <w:t>8</w:t>
+            </w:r>
+          </w:p>
+        </w:tc>
+        <w:tc>
+          <w:tcPr>
+            <w:tcW w:w="1604" w:type="dxa"/>
+          </w:tcPr>
+          <w:p>
+            <w:pPr>
+              <w:rPr>
+                <w:rFonts w:ascii="Times New Roman" w:hAnsi="Times New Roman" w:cs="Times New Roman"/>
+                <w:lang w:val="en-US"/>
+              </w:rPr>
+            </w:pPr>
+            <w:r>
+              <w:rPr>
+                <w:rFonts w:ascii="Times New Roman" w:hAnsi="Times New Roman" w:cs="Times New Roman"/>
+                <w:lang w:val="en-US"/>
+              </w:rPr>
+              <w:t>10</w:t>
+            </w:r>
+          </w:p>
+        </w:tc>
+      </w:tr>
+      <w:tr>
+        <w:trPr>
+          <w:trHeight w:val="673"/>
+        </w:trPr>
+        <w:tc>
+          <w:tcPr>
+            <w:tcW w:w="1718" w:type="dxa"/>
+          </w:tcPr>
+          <w:p>
+            <w:pPr>
+              <w:rPr>
+                <w:rFonts w:ascii="Times New Roman" w:hAnsi="Times New Roman" w:cs="Times New Roman"/>
+              </w:rPr>
+            </w:pPr>
+            <w:r>
+              <w:rPr>
+                <w:rFonts w:ascii="Times New Roman" w:hAnsi="Times New Roman" w:cs="Times New Roman"/>
+              </w:rPr>
+              <w:t>Ток нагрузки</w:t>
+            </w:r>
+            <w:r>
+              <w:rPr>
+                <w:rFonts w:ascii="Times New Roman" w:hAnsi="Times New Roman" w:cs="Times New Roman"/>
+              </w:rPr>
+              <w:t xml:space="preserve"> </w:t>
+            </w:r>
+            <w:r>
+              <w:rPr>
+                <w:rFonts w:ascii="Times New Roman" w:hAnsi="Times New Roman" w:cs="Times New Roman"/>
+                <w:lang w:val="en-US"/>
+              </w:rPr>
+              <w:t>I</w:t>
+            </w:r>
+            <w:r>
+              <w:rPr>
+                <w:rFonts w:ascii="Times New Roman" w:hAnsi="Times New Roman" w:cs="Times New Roman"/>
+                <w:vertAlign w:val="subscript"/>
+              </w:rPr>
+              <w:t>ср</w:t>
+            </w:r>
+            <w:r>
+              <w:rPr>
+                <w:rFonts w:ascii="Times New Roman" w:hAnsi="Times New Roman" w:cs="Times New Roman"/>
+              </w:rPr>
+              <w:t>, мА</w:t>
+            </w:r>
+          </w:p>
+        </w:tc>
+        <w:tc>
+          <w:tcPr>
+            <w:tcW w:w="1487" w:type="dxa"/>
+          </w:tcPr>
+          <w:p>
+            <w:pPr>
+              <w:rPr>
+                <w:rFonts w:ascii="Times New Roman" w:hAnsi="Times New Roman" w:cs="Times New Roman"/>
+              </w:rPr>
+            </w:pPr>
+            <w:r>
+              <w:rPr>
+                <w:rFonts w:ascii="Times New Roman" w:hAnsi="Times New Roman" w:cs="Times New Roman"/>
+              </w:rPr>
+              <w:t>1986</w:t>
+            </w:r>
+          </w:p>
+        </w:tc>
+        <w:tc>
+          <w:tcPr>
+            <w:tcW w:w="1604" w:type="dxa"/>
+          </w:tcPr>
+          <w:p>
+            <w:pPr>
+              <w:rPr>
+                <w:rFonts w:ascii="Times New Roman" w:hAnsi="Times New Roman" w:cs="Times New Roman"/>
+              </w:rPr>
+            </w:pPr>
+            <w:r>
+              <w:rPr>
+                <w:rFonts w:ascii="Times New Roman" w:hAnsi="Times New Roman" w:cs="Times New Roman"/>
+              </w:rPr>
+              <w:t>1804</w:t>
+            </w:r>
+          </w:p>
+        </w:tc>
+        <w:tc>
+          <w:tcPr>
+            <w:tcW w:w="1604" w:type="dxa"/>
+          </w:tcPr>
+          <w:p>
+            <w:pPr>
+              <w:rPr>
+                <w:rFonts w:ascii="Times New Roman" w:hAnsi="Times New Roman" w:cs="Times New Roman"/>
+              </w:rPr>
+            </w:pPr>
+            <w:r>
+              <w:rPr>
+                <w:rFonts w:ascii="Times New Roman" w:hAnsi="Times New Roman" w:cs="Times New Roman"/>
+              </w:rPr>
+              <w:t>1302</w:t>
+            </w:r>
+          </w:p>
+        </w:tc>
+        <w:tc>
+          <w:tcPr>
+            <w:tcW w:w="1604" w:type="dxa"/>
+          </w:tcPr>
+          <w:p>
+            <w:pPr>
+              <w:rPr>
+                <w:rFonts w:ascii="Times New Roman" w:hAnsi="Times New Roman" w:cs="Times New Roman"/>
+              </w:rPr>
+            </w:pPr>
+            <w:r>
+              <w:rPr>
+                <w:rFonts w:ascii="Times New Roman" w:hAnsi="Times New Roman" w:cs="Times New Roman"/>
+              </w:rPr>
+              <w:t>684</w:t>
+            </w:r>
+          </w:p>
+        </w:tc>
+        <w:tc>
+          <w:tcPr>
+            <w:tcW w:w="1604" w:type="dxa"/>
+          </w:tcPr>
+          <w:p>
+            <w:pPr>
+              <w:rPr>
+                <w:rFonts w:ascii="Times New Roman" w:hAnsi="Times New Roman" w:cs="Times New Roman"/>
+              </w:rPr>
+            </w:pPr>
+            <w:r>
+              <w:rPr>
+                <w:rFonts w:ascii="Times New Roman" w:hAnsi="Times New Roman" w:cs="Times New Roman"/>
+              </w:rPr>
+              <w:t>184</w:t>
+            </w:r>
+          </w:p>
+        </w:tc>
+        <w:tc>
+          <w:tcPr>
+            <w:tcW w:w="1604" w:type="dxa"/>
+          </w:tcPr>
+          <w:p>
+            <w:pPr>
+              <w:rPr>
+                <w:rFonts w:ascii="Times New Roman" w:hAnsi="Times New Roman" w:cs="Times New Roman"/>
+              </w:rPr>
+            </w:pPr>
+            <w:r>
+              <w:rPr>
+                <w:rFonts w:ascii="Times New Roman" w:hAnsi="Times New Roman" w:cs="Times New Roman"/>
+              </w:rPr>
+              <w:t>234</w:t>
+            </w:r>
+          </w:p>
+        </w:tc>
+      </w:tr>
+    </w:tbl>
+    <w:p>
+      <w:pPr>
+        <w:rPr>
+          <w:rFonts w:ascii="Times New Roman" w:hAnsi="Times New Roman" w:cs="Times New Roman"/>
+        </w:rPr>
+      </w:pPr>
+      <w:r>
+        <w:rPr>
+          <w:rFonts w:ascii="Times New Roman" w:hAnsi="Times New Roman" w:cs="Times New Roman"/>
+          <w:lang w:val="en-US"/>
+        </w:rPr>
+        <w:t>t</w:t>
+      </w:r>
+      <w:r>
+        <w:rPr>
+          <w:rFonts w:ascii="Times New Roman" w:hAnsi="Times New Roman" w:cs="Times New Roman"/>
+          <w:vertAlign w:val="subscript"/>
+          <w:lang w:val="en-US"/>
+        </w:rPr>
+        <w:t>3</w:t>
+      </w:r>
+      <w:r>
+        <w:rPr>
+          <w:rFonts w:ascii="Times New Roman" w:hAnsi="Times New Roman" w:cs="Times New Roman"/>
+          <w:lang w:val="en-US"/>
+        </w:rPr>
+        <w:t xml:space="preserve"> = </w:t>
+      </w:r>
+      <w:r>
+        <w:rPr>
+          <w:rFonts w:ascii="Times New Roman" w:hAnsi="Times New Roman" w:cs="Times New Roman"/>
+        </w:rPr>
+        <w:t>4 мс</w:t>
+      </w:r>
+    </w:p>
+    <w:p>
+      <w:pPr>
+        <w:rPr>
+          <w:rFonts w:ascii="Times New Roman" w:hAnsi="Times New Roman" w:cs="Times New Roman"/>
+          <w:lang w:val="en-US"/>
+        </w:rPr>
+      </w:pPr>
+      <w:r>
+        <w:rPr>
+          <w:rFonts w:ascii="Times New Roman" w:hAnsi="Times New Roman" w:cs="Times New Roman"/>
+          <w:lang w:val="en-US"/>
+        </w:rPr>
+        <w:drawing>
+          <wp:inline distT="0" distB="0" distL="0" distR="0" wp14:anchorId="60279ABE" wp14:editId="18A824E2">
+            <wp:extent cx="5014198" cy="3794077"/>
+            <wp:effectExtent l="0" t="0" r="0" b="0"/>
+            <wp:docPr id="1903601508" name="Picture 1"/>
+            <wp:cNvGraphicFramePr>
+              <a:graphicFrameLocks xmlns:a="http://schemas.openxmlformats.org/drawingml/2006/main" noChangeAspect="1"/>
+            </wp:cNvGraphicFramePr>
+            <a:graphic xmlns:a="http://schemas.openxmlformats.org/drawingml/2006/main">
+              <a:graphicData uri="http://schemas.openxmlformats.org/drawingml/2006/picture">
+                <pic:pic xmlns:pic="http://schemas.openxmlformats.org/drawingml/2006/picture">
+                  <pic:nvPicPr>
+                    <pic:cNvPr id="1903601508" name=""/>
+                    <pic:cNvPicPr/>
+                  </pic:nvPicPr>
+                  <pic:blipFill>
+                    <a:blip r:embed="rId26"/>
+                    <a:stretch>
+                      <a:fillRect/>
+                    </a:stretch>
+                  </pic:blipFill>
+                  <pic:spPr>
+                    <a:xfrm>
+                      <a:off x="0" y="0"/>
+                      <a:ext cx="5023025" cy="3800756"/>
+                    </a:xfrm>
+                    <a:prstGeom prst="rect">
+                      <a:avLst/>
+                    </a:prstGeom>
+                  </pic:spPr>
+                </pic:pic>
+              </a:graphicData>
+            </a:graphic>
+          </wp:inline>
+        </w:drawing>
+      </w:r>
+    </w:p>
+    <w:p>
+      <w:pPr>
+        <w:rPr>
+          <w:rFonts w:ascii="Times New Roman" w:hAnsi="Times New Roman" w:cs="Times New Roman"/>
+        </w:rPr>
+      </w:pPr>
+      <w:r>
+        <w:rPr>
+          <w:rFonts w:ascii="Times New Roman" w:hAnsi="Times New Roman" w:cs="Times New Roman"/>
+          <w:lang w:val="en-US"/>
+        </w:rPr>
+        <w:t>t</w:t>
+      </w:r>
+      <w:r>
+        <w:rPr>
+          <w:rFonts w:ascii="Times New Roman" w:hAnsi="Times New Roman" w:cs="Times New Roman"/>
+          <w:vertAlign w:val="subscript"/>
+          <w:lang w:val="en-US"/>
+        </w:rPr>
+        <w:t>3</w:t>
+      </w:r>
+      <w:r>
+        <w:rPr>
+          <w:rFonts w:ascii="Times New Roman" w:hAnsi="Times New Roman" w:cs="Times New Roman"/>
+          <w:lang w:val="en-US"/>
+        </w:rPr>
+        <w:t xml:space="preserve"> = </w:t>
+      </w:r>
+      <w:r>
+        <w:rPr>
+          <w:rFonts w:ascii="Times New Roman" w:hAnsi="Times New Roman" w:cs="Times New Roman"/>
+        </w:rPr>
+        <w:t>8</w:t>
+      </w:r>
+      <w:r>
+        <w:rPr>
+          <w:rFonts w:ascii="Times New Roman" w:hAnsi="Times New Roman" w:cs="Times New Roman"/>
+        </w:rPr>
+        <w:t xml:space="preserve"> мс</w:t>
+      </w:r>
+    </w:p>
+    <w:p>
+      <w:pPr>
+        <w:rPr>
+          <w:rFonts w:ascii="Times New Roman" w:hAnsi="Times New Roman" w:cs="Times New Roman"/>
+        </w:rPr>
+      </w:pPr>
+      <w:r>
+        <w:rPr>
+          <w:rFonts w:ascii="Times New Roman" w:hAnsi="Times New Roman" w:cs="Times New Roman"/>
+          <w:lang w:val="en-US"/>
+        </w:rPr>
+        <w:drawing>
+          <wp:inline distT="0" distB="0" distL="0" distR="0" wp14:anchorId="1BF53735" wp14:editId="628A515C">
+            <wp:extent cx="5021178" cy="3807725"/>
+            <wp:effectExtent l="0" t="0" r="8255" b="2540"/>
+            <wp:docPr id="301645764" name="Picture 1"/>
+            <wp:cNvGraphicFramePr>
+              <a:graphicFrameLocks xmlns:a="http://schemas.openxmlformats.org/drawingml/2006/main" noChangeAspect="1"/>
+            </wp:cNvGraphicFramePr>
+            <a:graphic xmlns:a="http://schemas.openxmlformats.org/drawingml/2006/main">
+              <a:graphicData uri="http://schemas.openxmlformats.org/drawingml/2006/picture">
+                <pic:pic xmlns:pic="http://schemas.openxmlformats.org/drawingml/2006/picture">
+                  <pic:nvPicPr>
+                    <pic:cNvPr id="301645764" name=""/>
+                    <pic:cNvPicPr/>
+                  </pic:nvPicPr>
+                  <pic:blipFill>
+                    <a:blip r:embed="rId27"/>
+                    <a:stretch>
+                      <a:fillRect/>
+                    </a:stretch>
+                  </pic:blipFill>
+                  <pic:spPr>
+                    <a:xfrm>
+                      <a:off x="0" y="0"/>
+                      <a:ext cx="5038854" cy="3821129"/>
+                    </a:xfrm>
+                    <a:prstGeom prst="rect">
+                      <a:avLst/>
+                    </a:prstGeom>
+                  </pic:spPr>
+                </pic:pic>
+              </a:graphicData>
+            </a:graphic>
+          </wp:inline>
+        </w:drawing>
+      </w:r>
+    </w:p>
+    <w:p>
+      <w:pPr>
+        <w:rPr>
+          <w:rFonts w:ascii="Times New Roman" w:hAnsi="Times New Roman" w:cs="Times New Roman"/>
+          <w:lang w:val="en-US"/>
         </w:rPr>
       </w:pPr>
     </w:p>
@@ -7000,7 +8153,7 @@
   <w:style w:type="paragraph" w:default="1" w:styleId="Normal">
     <w:name w:val="Normal"/>
     <w:qFormat/>
-    <w:rsid w:val="00331B8D"/>
+    <w:rsid w:val="003A6CCB"/>
   </w:style>
   <w:style w:type="paragraph" w:styleId="Heading1">
     <w:name w:val="heading 1"/>

</xml_diff>